<commit_message>
Update team roles and roadmap in planning docs
- Replace named assignments with 8 unassigned roles; PM becomes integration/QA owner
- Move parallel runs to platform backend, pull replay v1 into S3, move mobile viewport to S5
- Add staging deploy and IRB check to S1, split benchmark page building across the team
- Clarify role interfaces and AI track priorities
</commit_message>
<xml_diff>
--- a/docs/StepMeter_개발계획서.docx
+++ b/docs/StepMeter_개발계획서.docx
@@ -758,7 +758,7 @@
         <w:rPr>
           <w:rFonts w:ascii="Malgun Gothic" w:cs="Malgun Gothic" w:eastAsia="Malgun Gothic" w:hAnsi="Malgun Gothic"/>
         </w:rPr>
-        <w:t xml:space="preserve">이 문서는 서비스 기획서의 P0 기능(F01–F10)을 12주 안에 구현하기 위한 기술 결정을 정리한다. 팀이 직접 학습·튜닝하는 모델은 9장에 따로 정리했다. 각 파트는 이 문서를 기준으로 작업하고, 결정이 바뀌면 이 문서를 먼저 고친 뒤 코드에 반영한다.</w:t>
+        <w:t xml:space="preserve">이 문서는 서비스 기획서의 P0 기능(F01–F10)을 12주 안에 구현하기 위한 기술 결정을 정리한다. 팀이 직접 학습·튜닝하는 모델은 9장에 따로 정리했다. 각 역할 담당자는 이 문서를 기준으로 작업하고, 결정이 바뀌면 이 문서를 먼저 고친 뒤 코드에 반영한다.</w:t>
       </w:r>
     </w:p>
     <w:p>
@@ -1088,7 +1088,7 @@
                 <w:sz w:val="18"/>
                 <w:szCs w:val="18"/>
               </w:rPr>
-              <w:t xml:space="preserve">담당 파트</w:t>
+              <w:t xml:space="preserve">담당 역할</w:t>
             </w:r>
           </w:p>
         </w:tc>
@@ -1185,7 +1185,7 @@
                 <w:sz w:val="18"/>
                 <w:szCs w:val="18"/>
               </w:rPr>
-              <w:t xml:space="preserve">리포트</w:t>
+              <w:t xml:space="preserve">대시보드 UI · 리포트 UI</w:t>
             </w:r>
           </w:p>
         </w:tc>
@@ -1282,7 +1282,7 @@
                 <w:sz w:val="18"/>
                 <w:szCs w:val="18"/>
               </w:rPr>
-              <w:t xml:space="preserve">플랫폼</w:t>
+              <w:t xml:space="preserve">플랫폼 백엔드</w:t>
             </w:r>
           </w:p>
         </w:tc>
@@ -1379,7 +1379,7 @@
                 <w:sz w:val="18"/>
                 <w:szCs w:val="18"/>
               </w:rPr>
-              <w:t xml:space="preserve">플랫폼</w:t>
+              <w:t xml:space="preserve">플랫폼 백엔드</w:t>
             </w:r>
           </w:p>
         </w:tc>
@@ -1476,7 +1476,7 @@
                 <w:sz w:val="18"/>
                 <w:szCs w:val="18"/>
               </w:rPr>
-              <w:t xml:space="preserve">에이전트 · 측정</w:t>
+              <w:t xml:space="preserve">에이전트 코어 · 측정 지표·규칙</w:t>
             </w:r>
           </w:p>
         </w:tc>
@@ -1573,7 +1573,7 @@
                 <w:sz w:val="18"/>
                 <w:szCs w:val="18"/>
               </w:rPr>
-              <w:t xml:space="preserve">에이전트</w:t>
+              <w:t xml:space="preserve">에이전트 코어</w:t>
             </w:r>
           </w:p>
         </w:tc>
@@ -1670,7 +1670,7 @@
                 <w:sz w:val="18"/>
                 <w:szCs w:val="18"/>
               </w:rPr>
-              <w:t xml:space="preserve">측정</w:t>
+              <w:t xml:space="preserve">측정 지표·규칙</w:t>
             </w:r>
           </w:p>
         </w:tc>
@@ -1767,7 +1767,7 @@
                 <w:sz w:val="18"/>
                 <w:szCs w:val="18"/>
               </w:rPr>
-              <w:t xml:space="preserve">측정</w:t>
+              <w:t xml:space="preserve">측정 지표·규칙</w:t>
             </w:r>
           </w:p>
         </w:tc>
@@ -1864,7 +1864,7 @@
                 <w:sz w:val="18"/>
                 <w:szCs w:val="18"/>
               </w:rPr>
-              <w:t xml:space="preserve">측정</w:t>
+              <w:t xml:space="preserve">측정 지표·규칙</w:t>
             </w:r>
           </w:p>
         </w:tc>
@@ -1961,7 +1961,7 @@
                 <w:sz w:val="18"/>
                 <w:szCs w:val="18"/>
               </w:rPr>
-              <w:t xml:space="preserve">측정</w:t>
+              <w:t xml:space="preserve">수집·매칭</w:t>
             </w:r>
           </w:p>
         </w:tc>
@@ -2058,7 +2058,7 @@
                 <w:sz w:val="18"/>
                 <w:szCs w:val="18"/>
               </w:rPr>
-              <w:t xml:space="preserve">에이전트</w:t>
+              <w:t xml:space="preserve">에이전트 코어</w:t>
             </w:r>
           </w:p>
         </w:tc>
@@ -2155,7 +2155,7 @@
                 <w:sz w:val="18"/>
                 <w:szCs w:val="18"/>
               </w:rPr>
-              <w:t xml:space="preserve">플랫폼</w:t>
+              <w:t xml:space="preserve">플랫폼 백엔드</w:t>
             </w:r>
           </w:p>
         </w:tc>
@@ -4369,7 +4369,7 @@
           <w:b/>
           <w:bCs/>
         </w:rPr>
-        <w:t xml:space="preserve">에이전트 구현 방식과 요소 추출 방식 (S1 종료 10월 11일까지 결정, 담당: 배송현)</w:t>
+        <w:t xml:space="preserve">에이전트 구현 방식과 요소 추출 방식 (S1 종료 10월 11일까지 결정, 담당: 에이전트 코어)</w:t>
       </w:r>
     </w:p>
     <w:tbl>
@@ -14417,7 +14417,7 @@
         <w:rPr>
           <w:rFonts w:ascii="Malgun Gothic" w:cs="Malgun Gothic" w:eastAsia="Malgun Gothic" w:hAnsi="Malgun Gothic"/>
         </w:rPr>
-        <w:t xml:space="preserve">페이지마다 간단한 과업(뉴스레터 구독, 장바구니 담기, 예약 등)을 하나씩 둔다. 페이지는 benchmark/pages/ 에 두고 Vercel에 올린다. 정답은 benchmark/labels/{page}.json 에 규칙 ID와 요소 선택자로 적는다. 정답은 측정 파트가 작성하고 PM이 교차 검토한다. 40개 중 10개는 React SPA로 만들어 클라이언트 라우팅, 지연 로딩, 모달, Shadow DOM 컴포넌트가 평가에 포함되게 한다.</w:t>
+        <w:t xml:space="preserve">페이지마다 간단한 과업(뉴스레터 구독, 장바구니 담기, 예약 등)을 하나씩 둔다. 페이지는 benchmark/pages/ 에 두고 Vercel에 올린다. 정답은 benchmark/labels/{page}.json 에 규칙 ID와 요소 선택자로 적는다. 페이지는 결함 유형별로 전원이 나눠 만들고, 회귀 비교·인프라 담당이 진행을 관리한다. 정답은 측정 지표·규칙 담당이 작성하고 PM이 교차 검토한다. 40개 중 10개는 React SPA로 만들어 클라이언트 라우팅, 지연 로딩, 모달, Shadow DOM 컴포넌트가 평가에 포함되게 한다.</w:t>
       </w:r>
     </w:p>
     <w:p>
@@ -14546,7 +14546,7 @@
         <w:rPr>
           <w:rFonts w:ascii="Malgun Gothic" w:cs="Malgun Gothic" w:eastAsia="Malgun Gothic" w:hAnsi="Malgun Gothic"/>
         </w:rPr>
-        <w:t xml:space="preserve">같은 과업 경로의 스크린샷을 상용 LLM에 주고 "UX 문제를 찾아라"라고 요청한 결과를 같은 정답으로 채점한다. 담당은 강민수. S1에 먼저 한 번 돌려서 이겨야 할 수준을 확인하고, S4와 S6에 다시 비교한다.</w:t>
+        <w:t xml:space="preserve">같은 과업 경로의 스크린샷을 상용 LLM에 주고 "UX 문제를 찾아라"라고 요청한 결과를 같은 정답으로 채점한다. 담당은 LLM·프롬프트. S1에 먼저 한 번 돌려서 이겨야 할 수준을 확인하고, S4와 S6에 다시 비교한다.</w:t>
       </w:r>
     </w:p>
     <w:p>
@@ -15004,7 +15004,7 @@
                 <w:sz w:val="18"/>
                 <w:szCs w:val="18"/>
               </w:rPr>
-              <w:t xml:space="preserve">김도현, 한채훈, 김보민</w:t>
+              <w:t xml:space="preserve">측정 지표·규칙, 리포트 UI, 대시보드 UI</w:t>
             </w:r>
           </w:p>
         </w:tc>
@@ -15222,7 +15222,7 @@
                 <w:sz w:val="18"/>
                 <w:szCs w:val="18"/>
               </w:rPr>
-              <w:t xml:space="preserve">이원준</w:t>
+              <w:t xml:space="preserve">수집·매칭 (라벨 판정: PM)</w:t>
             </w:r>
           </w:p>
         </w:tc>
@@ -15253,7 +15253,7 @@
                 <w:sz w:val="18"/>
                 <w:szCs w:val="18"/>
               </w:rPr>
-              <w:t xml:space="preserve">P0</w:t>
+              <w:t xml:space="preserve">P0 휴리스틱 · 분류기는 실험</w:t>
             </w:r>
           </w:p>
         </w:tc>
@@ -15440,7 +15440,7 @@
                 <w:sz w:val="18"/>
                 <w:szCs w:val="18"/>
               </w:rPr>
-              <w:t xml:space="preserve">강민수</w:t>
+              <w:t xml:space="preserve">LLM·프롬프트</w:t>
             </w:r>
           </w:p>
         </w:tc>
@@ -15658,7 +15658,7 @@
                 <w:sz w:val="18"/>
                 <w:szCs w:val="18"/>
               </w:rPr>
-              <w:t xml:space="preserve">배송현</w:t>
+              <w:t xml:space="preserve">플랫폼 백엔드</w:t>
             </w:r>
           </w:p>
         </w:tc>
@@ -15689,7 +15689,7 @@
                 <w:sz w:val="18"/>
                 <w:szCs w:val="18"/>
               </w:rPr>
-              <w:t xml:space="preserve">P0 (적용은 조건부)</w:t>
+              <w:t xml:space="preserve">P0 오프라인 · 적용 조건부</w:t>
             </w:r>
           </w:p>
         </w:tc>
@@ -21196,8 +21196,8 @@
         </w:tblBorders>
       </w:tblPr>
       <w:tblGrid>
+        <w:gridCol w:w="1357"/>
         <w:gridCol w:w="1018"/>
-        <w:gridCol w:w="1357"/>
         <w:gridCol w:w="2851"/>
         <w:gridCol w:w="2308"/>
         <w:gridCol w:w="2104"/>
@@ -21208,7 +21208,7 @@
         </w:trPr>
         <w:tc>
           <w:tcPr>
-            <w:tcW w:type="dxa" w:w="1018"/>
+            <w:tcW w:type="dxa" w:w="1357"/>
             <w:tcBorders>
               <w:top w:val="single" w:color="000000" w:sz="10"/>
               <w:left w:val="none" w:color="FFFFFF" w:sz="0"/>
@@ -21234,13 +21234,13 @@
                 <w:sz w:val="18"/>
                 <w:szCs w:val="18"/>
               </w:rPr>
-              <w:t xml:space="preserve">파트</w:t>
-            </w:r>
-          </w:p>
-        </w:tc>
-        <w:tc>
-          <w:tcPr>
-            <w:tcW w:type="dxa" w:w="1357"/>
+              <w:t xml:space="preserve">역할</w:t>
+            </w:r>
+          </w:p>
+        </w:tc>
+        <w:tc>
+          <w:tcPr>
+            <w:tcW w:type="dxa" w:w="1018"/>
             <w:tcBorders>
               <w:top w:val="single" w:color="000000" w:sz="10"/>
               <w:left w:val="none" w:color="FFFFFF" w:sz="0"/>
@@ -21266,7 +21266,7 @@
                 <w:sz w:val="18"/>
                 <w:szCs w:val="18"/>
               </w:rPr>
-              <w:t xml:space="preserve">인원</w:t>
+              <w:t xml:space="preserve">담당</w:t>
             </w:r>
           </w:p>
         </w:tc>
@@ -21369,11 +21369,12 @@
       </w:tr>
       <w:tr>
         <w:trPr>
+          <w:cantSplit/>
           <w:tblHeader w:val="false"/>
         </w:trPr>
         <w:tc>
           <w:tcPr>
-            <w:tcW w:type="dxa" w:w="1018"/>
+            <w:tcW w:type="dxa" w:w="1357"/>
             <w:tcBorders>
               <w:top w:val="none" w:color="FFFFFF" w:sz="0"/>
               <w:left w:val="none" w:color="FFFFFF" w:sz="0"/>
@@ -21399,13 +21400,13 @@
                 <w:sz w:val="18"/>
                 <w:szCs w:val="18"/>
               </w:rPr>
-              <w:t xml:space="preserve">PM</w:t>
-            </w:r>
-          </w:p>
-        </w:tc>
-        <w:tc>
-          <w:tcPr>
-            <w:tcW w:type="dxa" w:w="1357"/>
+              <w:t xml:space="preserve">PM · 통합·QA</w:t>
+            </w:r>
+          </w:p>
+        </w:tc>
+        <w:tc>
+          <w:tcPr>
+            <w:tcW w:type="dxa" w:w="1018"/>
             <w:tcBorders>
               <w:top w:val="none" w:color="FFFFFF" w:sz="0"/>
               <w:left w:val="none" w:color="FFFFFF" w:sz="0"/>
@@ -21459,7 +21460,7 @@
                 <w:sz w:val="18"/>
                 <w:szCs w:val="18"/>
               </w:rPr>
-              <w:t xml:space="preserve">일정·범위 관리, 와이어프레임, 벤치마크 정답 검토, 사용자 테스트 진행</w:t>
+              <w:t xml:space="preserve">업무 조율·일정 관리, 통합·E2E 테스트, 벤치마크 정답 교차 검토, 이슈 라벨 최종 판정, 외부 사용자 테스트 팀 모집, 데모 영상·최종 문서</w:t>
             </w:r>
           </w:p>
         </w:tc>
@@ -21489,7 +21490,7 @@
                 <w:sz w:val="18"/>
                 <w:szCs w:val="18"/>
               </w:rPr>
-              <w:t xml:space="preserve">사람 데이터 수집 운영 (모집, 동의서, 세션 진행)</w:t>
+              <w:t xml:space="preserve">이슈 라벨 최종 판정 (9.2)</w:t>
             </w:r>
           </w:p>
         </w:tc>
@@ -21519,18 +21520,19 @@
                 <w:sz w:val="18"/>
                 <w:szCs w:val="18"/>
               </w:rPr>
-              <w:t xml:space="preserve">기획서, 와이어프레임, 주간 진행 보고</w:t>
+              <w:t xml:space="preserve">주간 진행 보고, tests/e2e, 데모 영상</w:t>
             </w:r>
           </w:p>
         </w:tc>
       </w:tr>
       <w:tr>
         <w:trPr>
+          <w:cantSplit/>
           <w:tblHeader w:val="false"/>
         </w:trPr>
         <w:tc>
           <w:tcPr>
-            <w:tcW w:type="dxa" w:w="1018"/>
+            <w:tcW w:type="dxa" w:w="1357"/>
             <w:tcBorders>
               <w:top w:val="none" w:color="FFFFFF" w:sz="0"/>
               <w:left w:val="none" w:color="FFFFFF" w:sz="0"/>
@@ -21556,37 +21558,37 @@
                 <w:sz w:val="18"/>
                 <w:szCs w:val="18"/>
               </w:rPr>
-              <w:t xml:space="preserve">에이전트</w:t>
-            </w:r>
-          </w:p>
-        </w:tc>
-        <w:tc>
-          <w:tcPr>
-            <w:tcW w:type="dxa" w:w="1357"/>
-            <w:tcBorders>
-              <w:top w:val="none" w:color="FFFFFF" w:sz="0"/>
-              <w:left w:val="none" w:color="FFFFFF" w:sz="0"/>
-              <w:bottom w:val="single" w:color="D9D9D9" w:sz="2"/>
-              <w:right w:val="none" w:color="FFFFFF" w:sz="0"/>
-            </w:tcBorders>
-            <w:tcMar>
-              <w:top w:type="dxa" w:w="70"/>
-              <w:left w:type="dxa" w:w="110"/>
-              <w:bottom w:type="dxa" w:w="70"/>
-              <w:right w:type="dxa" w:w="110"/>
-            </w:tcMar>
-          </w:tcPr>
-          <w:p>
-            <w:pPr>
-              <w:spacing w:after="30" w:line="270"/>
-            </w:pPr>
-            <w:r>
-              <w:rPr>
-                <w:rFonts w:ascii="Malgun Gothic" w:cs="Malgun Gothic" w:eastAsia="Malgun Gothic" w:hAnsi="Malgun Gothic"/>
-                <w:sz w:val="18"/>
-                <w:szCs w:val="18"/>
-              </w:rPr>
-              <w:t xml:space="preserve">배송현, 강민수</w:t>
+              <w:t xml:space="preserve">에이전트 코어</w:t>
+            </w:r>
+          </w:p>
+        </w:tc>
+        <w:tc>
+          <w:tcPr>
+            <w:tcW w:type="dxa" w:w="1018"/>
+            <w:tcBorders>
+              <w:top w:val="none" w:color="FFFFFF" w:sz="0"/>
+              <w:left w:val="none" w:color="FFFFFF" w:sz="0"/>
+              <w:bottom w:val="single" w:color="D9D9D9" w:sz="2"/>
+              <w:right w:val="none" w:color="FFFFFF" w:sz="0"/>
+            </w:tcBorders>
+            <w:tcMar>
+              <w:top w:type="dxa" w:w="70"/>
+              <w:left w:type="dxa" w:w="110"/>
+              <w:bottom w:type="dxa" w:w="70"/>
+              <w:right w:type="dxa" w:w="110"/>
+            </w:tcMar>
+          </w:tcPr>
+          <w:p>
+            <w:pPr>
+              <w:spacing w:after="30" w:line="270"/>
+            </w:pPr>
+            <w:r>
+              <w:rPr>
+                <w:rFonts w:ascii="Malgun Gothic" w:cs="Malgun Gothic" w:eastAsia="Malgun Gothic" w:hAnsi="Malgun Gothic"/>
+                <w:sz w:val="18"/>
+                <w:szCs w:val="18"/>
+              </w:rPr>
+              <w:t xml:space="preserve"/>
             </w:r>
           </w:p>
         </w:tc>
@@ -21616,7 +21618,7 @@
                 <w:sz w:val="18"/>
                 <w:szCs w:val="18"/>
               </w:rPr>
-              <w:t xml:space="preserve">Driver, 관찰·행동, 종료·실패 처리, 재생 실행과 에이전트 전환, 병렬 반복 실행, 프롬프트, 베이스라인 실험</w:t>
+              <w:t xml:space="preserve">Driver, 관찰·행동, 에이전트 루프, 행동 스키마(4.3), 종료·실패 처리, 경로 고정 재생과 에이전트 전환</w:t>
             </w:r>
           </w:p>
         </w:tc>
@@ -21646,7 +21648,7 @@
                 <w:sz w:val="18"/>
                 <w:szCs w:val="18"/>
               </w:rPr>
-              <w:t xml:space="preserve">강민수: 프롬프트 최적화 / 배송현: 요소 후보 순위 모델</w:t>
+              <w:t xml:space="preserve">–</w:t>
             </w:r>
           </w:p>
         </w:tc>
@@ -21676,18 +21678,19 @@
                 <w:sz w:val="18"/>
                 <w:szCs w:val="18"/>
               </w:rPr>
-              <w:t xml:space="preserve">worker/driver, agent, replay, prompts, ml/prompt_opt, ml/element_rank</w:t>
+              <w:t xml:space="preserve">worker/driver, agent, replay</w:t>
             </w:r>
           </w:p>
         </w:tc>
       </w:tr>
       <w:tr>
         <w:trPr>
+          <w:cantSplit/>
           <w:tblHeader w:val="false"/>
         </w:trPr>
         <w:tc>
           <w:tcPr>
-            <w:tcW w:type="dxa" w:w="1018"/>
+            <w:tcW w:type="dxa" w:w="1357"/>
             <w:tcBorders>
               <w:top w:val="none" w:color="FFFFFF" w:sz="0"/>
               <w:left w:val="none" w:color="FFFFFF" w:sz="0"/>
@@ -21713,37 +21716,37 @@
                 <w:sz w:val="18"/>
                 <w:szCs w:val="18"/>
               </w:rPr>
-              <w:t xml:space="preserve">측정</w:t>
-            </w:r>
-          </w:p>
-        </w:tc>
-        <w:tc>
-          <w:tcPr>
-            <w:tcW w:type="dxa" w:w="1357"/>
-            <w:tcBorders>
-              <w:top w:val="none" w:color="FFFFFF" w:sz="0"/>
-              <w:left w:val="none" w:color="FFFFFF" w:sz="0"/>
-              <w:bottom w:val="single" w:color="D9D9D9" w:sz="2"/>
-              <w:right w:val="none" w:color="FFFFFF" w:sz="0"/>
-            </w:tcBorders>
-            <w:tcMar>
-              <w:top w:type="dxa" w:w="70"/>
-              <w:left w:type="dxa" w:w="110"/>
-              <w:bottom w:type="dxa" w:w="70"/>
-              <w:right w:type="dxa" w:w="110"/>
-            </w:tcMar>
-          </w:tcPr>
-          <w:p>
-            <w:pPr>
-              <w:spacing w:after="30" w:line="270"/>
-            </w:pPr>
-            <w:r>
-              <w:rPr>
-                <w:rFonts w:ascii="Malgun Gothic" w:cs="Malgun Gothic" w:eastAsia="Malgun Gothic" w:hAnsi="Malgun Gothic"/>
-                <w:sz w:val="18"/>
-                <w:szCs w:val="18"/>
-              </w:rPr>
-              <w:t xml:space="preserve">김도현, 이원준</w:t>
+              <w:t xml:space="preserve">LLM·프롬프트</w:t>
+            </w:r>
+          </w:p>
+        </w:tc>
+        <w:tc>
+          <w:tcPr>
+            <w:tcW w:type="dxa" w:w="1018"/>
+            <w:tcBorders>
+              <w:top w:val="none" w:color="FFFFFF" w:sz="0"/>
+              <w:left w:val="none" w:color="FFFFFF" w:sz="0"/>
+              <w:bottom w:val="single" w:color="D9D9D9" w:sz="2"/>
+              <w:right w:val="none" w:color="FFFFFF" w:sz="0"/>
+            </w:tcBorders>
+            <w:tcMar>
+              <w:top w:type="dxa" w:w="70"/>
+              <w:left w:type="dxa" w:w="110"/>
+              <w:bottom w:type="dxa" w:w="70"/>
+              <w:right w:type="dxa" w:w="110"/>
+            </w:tcMar>
+          </w:tcPr>
+          <w:p>
+            <w:pPr>
+              <w:spacing w:after="30" w:line="270"/>
+            </w:pPr>
+            <w:r>
+              <w:rPr>
+                <w:rFonts w:ascii="Malgun Gothic" w:cs="Malgun Gothic" w:eastAsia="Malgun Gothic" w:hAnsi="Malgun Gothic"/>
+                <w:sz w:val="18"/>
+                <w:szCs w:val="18"/>
+              </w:rPr>
+              <w:t xml:space="preserve"/>
             </w:r>
           </w:p>
         </w:tc>
@@ -21773,7 +21776,7 @@
                 <w:sz w:val="18"/>
                 <w:szCs w:val="18"/>
               </w:rPr>
-              <w:t xml:space="preserve">수집 JS, 지표 계산, 규칙 엔진, 요소 매칭 모듈(이원준), 설명 생성, 벤치마크 페이지·평가</w:t>
+              <w:t xml:space="preserve">행동·설명 프롬프트, 설명 생성, LLM 어댑터·호출·비용 기록, 베이스라인 실험, 외부 사용자 테스트</w:t>
             </w:r>
           </w:p>
         </w:tc>
@@ -21803,7 +21806,7 @@
                 <w:sz w:val="18"/>
                 <w:szCs w:val="18"/>
               </w:rPr>
-              <w:t xml:space="preserve">김도현: 소요 시간 모델 (KLM 보정) / 이원준: 이슈 점수·분류기 비교</w:t>
+              <w:t xml:space="preserve">프롬프트 최적화</w:t>
             </w:r>
           </w:p>
         </w:tc>
@@ -21833,18 +21836,19 @@
                 <w:sz w:val="18"/>
                 <w:szCs w:val="18"/>
               </w:rPr>
-              <w:t xml:space="preserve">worker/collect, metrics, rules, matching, benchmark, ml/timing, ml/issue_clf</w:t>
+              <w:t xml:space="preserve">prompts, worker/llm, ml/prompt_opt</w:t>
             </w:r>
           </w:p>
         </w:tc>
       </w:tr>
       <w:tr>
         <w:trPr>
+          <w:cantSplit/>
           <w:tblHeader w:val="false"/>
         </w:trPr>
         <w:tc>
           <w:tcPr>
-            <w:tcW w:type="dxa" w:w="1018"/>
+            <w:tcW w:type="dxa" w:w="1357"/>
             <w:tcBorders>
               <w:top w:val="none" w:color="FFFFFF" w:sz="0"/>
               <w:left w:val="none" w:color="FFFFFF" w:sz="0"/>
@@ -21870,37 +21874,37 @@
                 <w:sz w:val="18"/>
                 <w:szCs w:val="18"/>
               </w:rPr>
-              <w:t xml:space="preserve">플랫폼</w:t>
-            </w:r>
-          </w:p>
-        </w:tc>
-        <w:tc>
-          <w:tcPr>
-            <w:tcW w:type="dxa" w:w="1357"/>
-            <w:tcBorders>
-              <w:top w:val="none" w:color="FFFFFF" w:sz="0"/>
-              <w:left w:val="none" w:color="FFFFFF" w:sz="0"/>
-              <w:bottom w:val="single" w:color="D9D9D9" w:sz="2"/>
-              <w:right w:val="none" w:color="FFFFFF" w:sz="0"/>
-            </w:tcBorders>
-            <w:tcMar>
-              <w:top w:type="dxa" w:w="70"/>
-              <w:left w:type="dxa" w:w="110"/>
-              <w:bottom w:type="dxa" w:w="70"/>
-              <w:right w:type="dxa" w:w="110"/>
-            </w:tcMar>
-          </w:tcPr>
-          <w:p>
-            <w:pPr>
-              <w:spacing w:after="30" w:line="270"/>
-            </w:pPr>
-            <w:r>
-              <w:rPr>
-                <w:rFonts w:ascii="Malgun Gothic" w:cs="Malgun Gothic" w:eastAsia="Malgun Gothic" w:hAnsi="Malgun Gothic"/>
-                <w:sz w:val="18"/>
-                <w:szCs w:val="18"/>
-              </w:rPr>
-              <w:t xml:space="preserve">오준호, 전철우</w:t>
+              <w:t xml:space="preserve">측정 지표·규칙</w:t>
+            </w:r>
+          </w:p>
+        </w:tc>
+        <w:tc>
+          <w:tcPr>
+            <w:tcW w:type="dxa" w:w="1018"/>
+            <w:tcBorders>
+              <w:top w:val="none" w:color="FFFFFF" w:sz="0"/>
+              <w:left w:val="none" w:color="FFFFFF" w:sz="0"/>
+              <w:bottom w:val="single" w:color="D9D9D9" w:sz="2"/>
+              <w:right w:val="none" w:color="FFFFFF" w:sz="0"/>
+            </w:tcBorders>
+            <w:tcMar>
+              <w:top w:type="dxa" w:w="70"/>
+              <w:left w:type="dxa" w:w="110"/>
+              <w:bottom w:type="dxa" w:w="70"/>
+              <w:right w:type="dxa" w:w="110"/>
+            </w:tcMar>
+          </w:tcPr>
+          <w:p>
+            <w:pPr>
+              <w:spacing w:after="30" w:line="270"/>
+            </w:pPr>
+            <w:r>
+              <w:rPr>
+                <w:rFonts w:ascii="Malgun Gothic" w:cs="Malgun Gothic" w:eastAsia="Malgun Gothic" w:hAnsi="Malgun Gothic"/>
+                <w:sz w:val="18"/>
+                <w:szCs w:val="18"/>
+              </w:rPr>
+              <w:t xml:space="preserve"/>
             </w:r>
           </w:p>
         </w:tc>
@@ -21930,7 +21934,7 @@
                 <w:sz w:val="18"/>
                 <w:szCs w:val="18"/>
               </w:rPr>
-              <w:t xml:space="preserve">API, DB, 큐, 스크린샷 저장, 비교 로직, 배포, CI</w:t>
+              <w:t xml:space="preserve">지표 계산, 규칙 엔진, 벤치마크 정답 작성</w:t>
             </w:r>
           </w:p>
         </w:tc>
@@ -21960,7 +21964,7 @@
                 <w:sz w:val="18"/>
                 <w:szCs w:val="18"/>
               </w:rPr>
-              <w:t xml:space="preserve">오준호: 학습 데이터 파이프라인, MLflow</w:t>
+              <w:t xml:space="preserve">소요 시간 모델 (KLM 보정)</w:t>
             </w:r>
           </w:p>
         </w:tc>
@@ -21990,22 +21994,23 @@
                 <w:sz w:val="18"/>
                 <w:szCs w:val="18"/>
               </w:rPr>
-              <w:t xml:space="preserve">apps/api, infra, 비교 API</w:t>
+              <w:t xml:space="preserve">worker/metrics, rules, ml/timing</w:t>
             </w:r>
           </w:p>
         </w:tc>
       </w:tr>
       <w:tr>
         <w:trPr>
+          <w:cantSplit/>
           <w:tblHeader w:val="false"/>
         </w:trPr>
         <w:tc>
           <w:tcPr>
-            <w:tcW w:type="dxa" w:w="1018"/>
-            <w:tcBorders>
-              <w:top w:val="none" w:color="FFFFFF" w:sz="0"/>
-              <w:left w:val="none" w:color="FFFFFF" w:sz="0"/>
-              <w:bottom w:val="single" w:color="000000" w:sz="10"/>
+            <w:tcW w:type="dxa" w:w="1357"/>
+            <w:tcBorders>
+              <w:top w:val="none" w:color="FFFFFF" w:sz="0"/>
+              <w:left w:val="none" w:color="FFFFFF" w:sz="0"/>
+              <w:bottom w:val="single" w:color="D9D9D9" w:sz="2"/>
               <w:right w:val="none" w:color="FFFFFF" w:sz="0"/>
             </w:tcBorders>
             <w:tcMar>
@@ -22027,37 +22032,195 @@
                 <w:sz w:val="18"/>
                 <w:szCs w:val="18"/>
               </w:rPr>
-              <w:t xml:space="preserve">리포트</w:t>
-            </w:r>
-          </w:p>
-        </w:tc>
+              <w:t xml:space="preserve">수집·매칭</w:t>
+            </w:r>
+          </w:p>
+        </w:tc>
+        <w:tc>
+          <w:tcPr>
+            <w:tcW w:type="dxa" w:w="1018"/>
+            <w:tcBorders>
+              <w:top w:val="none" w:color="FFFFFF" w:sz="0"/>
+              <w:left w:val="none" w:color="FFFFFF" w:sz="0"/>
+              <w:bottom w:val="single" w:color="D9D9D9" w:sz="2"/>
+              <w:right w:val="none" w:color="FFFFFF" w:sz="0"/>
+            </w:tcBorders>
+            <w:tcMar>
+              <w:top w:type="dxa" w:w="70"/>
+              <w:left w:type="dxa" w:w="110"/>
+              <w:bottom w:type="dxa" w:w="70"/>
+              <w:right w:type="dxa" w:w="110"/>
+            </w:tcMar>
+          </w:tcPr>
+          <w:p>
+            <w:pPr>
+              <w:spacing w:after="30" w:line="270"/>
+            </w:pPr>
+            <w:r>
+              <w:rPr>
+                <w:rFonts w:ascii="Malgun Gothic" w:cs="Malgun Gothic" w:eastAsia="Malgun Gothic" w:hAnsi="Malgun Gothic"/>
+                <w:sz w:val="18"/>
+                <w:szCs w:val="18"/>
+              </w:rPr>
+              <w:t xml:space="preserve"/>
+            </w:r>
+          </w:p>
+        </w:tc>
+        <w:tc>
+          <w:tcPr>
+            <w:tcW w:type="dxa" w:w="2851"/>
+            <w:tcBorders>
+              <w:top w:val="none" w:color="FFFFFF" w:sz="0"/>
+              <w:left w:val="none" w:color="FFFFFF" w:sz="0"/>
+              <w:bottom w:val="single" w:color="D9D9D9" w:sz="2"/>
+              <w:right w:val="none" w:color="FFFFFF" w:sz="0"/>
+            </w:tcBorders>
+            <w:tcMar>
+              <w:top w:type="dxa" w:w="70"/>
+              <w:left w:type="dxa" w:w="110"/>
+              <w:bottom w:type="dxa" w:w="70"/>
+              <w:right w:type="dxa" w:w="110"/>
+            </w:tcMar>
+          </w:tcPr>
+          <w:p>
+            <w:pPr>
+              <w:spacing w:after="30" w:line="270"/>
+            </w:pPr>
+            <w:r>
+              <w:rPr>
+                <w:rFonts w:ascii="Malgun Gothic" w:cs="Malgun Gothic" w:eastAsia="Malgun Gothic" w:hAnsi="Malgun Gothic"/>
+                <w:sz w:val="18"/>
+                <w:szCs w:val="18"/>
+              </w:rPr>
+              <w:t xml:space="preserve">수집 JS(요소 목록·스냅샷), Shadow DOM·iframe·가림 처리, 요소 매칭 모듈</w:t>
+            </w:r>
+          </w:p>
+        </w:tc>
+        <w:tc>
+          <w:tcPr>
+            <w:tcW w:type="dxa" w:w="2308"/>
+            <w:tcBorders>
+              <w:top w:val="none" w:color="FFFFFF" w:sz="0"/>
+              <w:left w:val="none" w:color="FFFFFF" w:sz="0"/>
+              <w:bottom w:val="single" w:color="D9D9D9" w:sz="2"/>
+              <w:right w:val="none" w:color="FFFFFF" w:sz="0"/>
+            </w:tcBorders>
+            <w:tcMar>
+              <w:top w:type="dxa" w:w="70"/>
+              <w:left w:type="dxa" w:w="110"/>
+              <w:bottom w:type="dxa" w:w="70"/>
+              <w:right w:type="dxa" w:w="110"/>
+            </w:tcMar>
+          </w:tcPr>
+          <w:p>
+            <w:pPr>
+              <w:spacing w:after="30" w:line="270"/>
+            </w:pPr>
+            <w:r>
+              <w:rPr>
+                <w:rFonts w:ascii="Malgun Gothic" w:cs="Malgun Gothic" w:eastAsia="Malgun Gothic" w:hAnsi="Malgun Gothic"/>
+                <w:sz w:val="18"/>
+                <w:szCs w:val="18"/>
+              </w:rPr>
+              <w:t xml:space="preserve">이슈 점수·분류기 비교</w:t>
+            </w:r>
+          </w:p>
+        </w:tc>
+        <w:tc>
+          <w:tcPr>
+            <w:tcW w:type="dxa" w:w="2104"/>
+            <w:tcBorders>
+              <w:top w:val="none" w:color="FFFFFF" w:sz="0"/>
+              <w:left w:val="none" w:color="FFFFFF" w:sz="0"/>
+              <w:bottom w:val="single" w:color="D9D9D9" w:sz="2"/>
+              <w:right w:val="none" w:color="FFFFFF" w:sz="0"/>
+            </w:tcBorders>
+            <w:tcMar>
+              <w:top w:type="dxa" w:w="70"/>
+              <w:left w:type="dxa" w:w="110"/>
+              <w:bottom w:type="dxa" w:w="70"/>
+              <w:right w:type="dxa" w:w="110"/>
+            </w:tcMar>
+          </w:tcPr>
+          <w:p>
+            <w:pPr>
+              <w:spacing w:after="30" w:line="270"/>
+            </w:pPr>
+            <w:r>
+              <w:rPr>
+                <w:rFonts w:ascii="Malgun Gothic" w:cs="Malgun Gothic" w:eastAsia="Malgun Gothic" w:hAnsi="Malgun Gothic"/>
+                <w:sz w:val="18"/>
+                <w:szCs w:val="18"/>
+              </w:rPr>
+              <w:t xml:space="preserve">worker/collect, matching, ml/issue_clf</w:t>
+            </w:r>
+          </w:p>
+        </w:tc>
+      </w:tr>
+      <w:tr>
+        <w:trPr>
+          <w:cantSplit/>
+          <w:tblHeader w:val="false"/>
+        </w:trPr>
         <w:tc>
           <w:tcPr>
             <w:tcW w:type="dxa" w:w="1357"/>
             <w:tcBorders>
               <w:top w:val="none" w:color="FFFFFF" w:sz="0"/>
               <w:left w:val="none" w:color="FFFFFF" w:sz="0"/>
-              <w:bottom w:val="single" w:color="000000" w:sz="10"/>
-              <w:right w:val="none" w:color="FFFFFF" w:sz="0"/>
-            </w:tcBorders>
-            <w:tcMar>
-              <w:top w:type="dxa" w:w="70"/>
-              <w:left w:type="dxa" w:w="110"/>
-              <w:bottom w:type="dxa" w:w="70"/>
-              <w:right w:type="dxa" w:w="110"/>
-            </w:tcMar>
-          </w:tcPr>
-          <w:p>
-            <w:pPr>
-              <w:spacing w:after="30" w:line="270"/>
-            </w:pPr>
-            <w:r>
-              <w:rPr>
-                <w:rFonts w:ascii="Malgun Gothic" w:cs="Malgun Gothic" w:eastAsia="Malgun Gothic" w:hAnsi="Malgun Gothic"/>
-                <w:sz w:val="18"/>
-                <w:szCs w:val="18"/>
-              </w:rPr>
-              <w:t xml:space="preserve">김보민, 윤태희</w:t>
+              <w:bottom w:val="single" w:color="D9D9D9" w:sz="2"/>
+              <w:right w:val="none" w:color="FFFFFF" w:sz="0"/>
+            </w:tcBorders>
+            <w:tcMar>
+              <w:top w:type="dxa" w:w="70"/>
+              <w:left w:type="dxa" w:w="110"/>
+              <w:bottom w:type="dxa" w:w="70"/>
+              <w:right w:type="dxa" w:w="110"/>
+            </w:tcMar>
+          </w:tcPr>
+          <w:p>
+            <w:pPr>
+              <w:spacing w:after="30" w:line="270"/>
+            </w:pPr>
+            <w:r>
+              <w:rPr>
+                <w:rFonts w:ascii="Malgun Gothic" w:cs="Malgun Gothic" w:eastAsia="Malgun Gothic" w:hAnsi="Malgun Gothic"/>
+                <w:b/>
+                <w:bCs/>
+                <w:sz w:val="18"/>
+                <w:szCs w:val="18"/>
+              </w:rPr>
+              <w:t xml:space="preserve">플랫폼 백엔드</w:t>
+            </w:r>
+          </w:p>
+        </w:tc>
+        <w:tc>
+          <w:tcPr>
+            <w:tcW w:type="dxa" w:w="1018"/>
+            <w:tcBorders>
+              <w:top w:val="none" w:color="FFFFFF" w:sz="0"/>
+              <w:left w:val="none" w:color="FFFFFF" w:sz="0"/>
+              <w:bottom w:val="single" w:color="D9D9D9" w:sz="2"/>
+              <w:right w:val="none" w:color="FFFFFF" w:sz="0"/>
+            </w:tcBorders>
+            <w:tcMar>
+              <w:top w:type="dxa" w:w="70"/>
+              <w:left w:type="dxa" w:w="110"/>
+              <w:bottom w:type="dxa" w:w="70"/>
+              <w:right w:type="dxa" w:w="110"/>
+            </w:tcMar>
+          </w:tcPr>
+          <w:p>
+            <w:pPr>
+              <w:spacing w:after="30" w:line="270"/>
+            </w:pPr>
+            <w:r>
+              <w:rPr>
+                <w:rFonts w:ascii="Malgun Gothic" w:cs="Malgun Gothic" w:eastAsia="Malgun Gothic" w:hAnsi="Malgun Gothic"/>
+                <w:sz w:val="18"/>
+                <w:szCs w:val="18"/>
+              </w:rPr>
+              <w:t xml:space="preserve"/>
             </w:r>
           </w:p>
         </w:tc>
@@ -22067,27 +22230,27 @@
             <w:tcBorders>
               <w:top w:val="none" w:color="FFFFFF" w:sz="0"/>
               <w:left w:val="none" w:color="FFFFFF" w:sz="0"/>
-              <w:bottom w:val="single" w:color="000000" w:sz="10"/>
-              <w:right w:val="none" w:color="FFFFFF" w:sz="0"/>
-            </w:tcBorders>
-            <w:tcMar>
-              <w:top w:type="dxa" w:w="70"/>
-              <w:left w:type="dxa" w:w="110"/>
-              <w:bottom w:type="dxa" w:w="70"/>
-              <w:right w:type="dxa" w:w="110"/>
-            </w:tcMar>
-          </w:tcPr>
-          <w:p>
-            <w:pPr>
-              <w:spacing w:after="30" w:line="270"/>
-            </w:pPr>
-            <w:r>
-              <w:rPr>
-                <w:rFonts w:ascii="Malgun Gothic" w:cs="Malgun Gothic" w:eastAsia="Malgun Gothic" w:hAnsi="Malgun Gothic"/>
-                <w:sz w:val="18"/>
-                <w:szCs w:val="18"/>
-              </w:rPr>
-              <w:t xml:space="preserve">디자인 시스템, 측정 생성·진행·리포트·비교 화면, 오버레이, 라벨 입력 화면, 재생 확인 화면, 자기 측정</w:t>
+              <w:bottom w:val="single" w:color="D9D9D9" w:sz="2"/>
+              <w:right w:val="none" w:color="FFFFFF" w:sz="0"/>
+            </w:tcBorders>
+            <w:tcMar>
+              <w:top w:type="dxa" w:w="70"/>
+              <w:left w:type="dxa" w:w="110"/>
+              <w:bottom w:type="dxa" w:w="70"/>
+              <w:right w:type="dxa" w:w="110"/>
+            </w:tcMar>
+          </w:tcPr>
+          <w:p>
+            <w:pPr>
+              <w:spacing w:after="30" w:line="270"/>
+            </w:pPr>
+            <w:r>
+              <w:rPr>
+                <w:rFonts w:ascii="Malgun Gothic" w:cs="Malgun Gothic" w:eastAsia="Malgun Gothic" w:hAnsi="Malgun Gothic"/>
+                <w:sz w:val="18"/>
+                <w:szCs w:val="18"/>
+              </w:rPr>
+              <w:t xml:space="preserve">API, DB, 큐, 병렬 반복 실행(4.6), 스크린샷 저장, LLM·클라우드 예산 상한·알림</w:t>
             </w:r>
           </w:p>
         </w:tc>
@@ -22097,27 +22260,27 @@
             <w:tcBorders>
               <w:top w:val="none" w:color="FFFFFF" w:sz="0"/>
               <w:left w:val="none" w:color="FFFFFF" w:sz="0"/>
-              <w:bottom w:val="single" w:color="000000" w:sz="10"/>
-              <w:right w:val="none" w:color="FFFFFF" w:sz="0"/>
-            </w:tcBorders>
-            <w:tcMar>
-              <w:top w:type="dxa" w:w="70"/>
-              <w:left w:type="dxa" w:w="110"/>
-              <w:bottom w:type="dxa" w:w="70"/>
-              <w:right w:type="dxa" w:w="110"/>
-            </w:tcMar>
-          </w:tcPr>
-          <w:p>
-            <w:pPr>
-              <w:spacing w:after="30" w:line="270"/>
-            </w:pPr>
-            <w:r>
-              <w:rPr>
-                <w:rFonts w:ascii="Malgun Gothic" w:cs="Malgun Gothic" w:eastAsia="Malgun Gothic" w:hAnsi="Malgun Gothic"/>
-                <w:sz w:val="18"/>
-                <w:szCs w:val="18"/>
-              </w:rPr>
-              <w:t xml:space="preserve">김보민: 사람 데이터 수집 스크립트</w:t>
+              <w:bottom w:val="single" w:color="D9D9D9" w:sz="2"/>
+              <w:right w:val="none" w:color="FFFFFF" w:sz="0"/>
+            </w:tcBorders>
+            <w:tcMar>
+              <w:top w:type="dxa" w:w="70"/>
+              <w:left w:type="dxa" w:w="110"/>
+              <w:bottom w:type="dxa" w:w="70"/>
+              <w:right w:type="dxa" w:w="110"/>
+            </w:tcMar>
+          </w:tcPr>
+          <w:p>
+            <w:pPr>
+              <w:spacing w:after="30" w:line="270"/>
+            </w:pPr>
+            <w:r>
+              <w:rPr>
+                <w:rFonts w:ascii="Malgun Gothic" w:cs="Malgun Gothic" w:eastAsia="Malgun Gothic" w:hAnsi="Malgun Gothic"/>
+                <w:sz w:val="18"/>
+                <w:szCs w:val="18"/>
+              </w:rPr>
+              <w:t xml:space="preserve">학습 데이터 파이프라인·MLflow, 요소 후보 순위 모델</w:t>
             </w:r>
           </w:p>
         </w:tc>
@@ -22127,27 +22290,501 @@
             <w:tcBorders>
               <w:top w:val="none" w:color="FFFFFF" w:sz="0"/>
               <w:left w:val="none" w:color="FFFFFF" w:sz="0"/>
-              <w:bottom w:val="single" w:color="000000" w:sz="10"/>
-              <w:right w:val="none" w:color="FFFFFF" w:sz="0"/>
-            </w:tcBorders>
-            <w:tcMar>
-              <w:top w:type="dxa" w:w="70"/>
-              <w:left w:type="dxa" w:w="110"/>
-              <w:bottom w:type="dxa" w:w="70"/>
-              <w:right w:type="dxa" w:w="110"/>
-            </w:tcMar>
-          </w:tcPr>
-          <w:p>
-            <w:pPr>
-              <w:spacing w:after="30" w:line="270"/>
-            </w:pPr>
-            <w:r>
-              <w:rPr>
-                <w:rFonts w:ascii="Malgun Gothic" w:cs="Malgun Gothic" w:eastAsia="Malgun Gothic" w:hAnsi="Malgun Gothic"/>
-                <w:sz w:val="18"/>
-                <w:szCs w:val="18"/>
-              </w:rPr>
-              <w:t xml:space="preserve">apps/web, human-study/</w:t>
+              <w:bottom w:val="single" w:color="D9D9D9" w:sz="2"/>
+              <w:right w:val="none" w:color="FFFFFF" w:sz="0"/>
+            </w:tcBorders>
+            <w:tcMar>
+              <w:top w:type="dxa" w:w="70"/>
+              <w:left w:type="dxa" w:w="110"/>
+              <w:bottom w:type="dxa" w:w="70"/>
+              <w:right w:type="dxa" w:w="110"/>
+            </w:tcMar>
+          </w:tcPr>
+          <w:p>
+            <w:pPr>
+              <w:spacing w:after="30" w:line="270"/>
+            </w:pPr>
+            <w:r>
+              <w:rPr>
+                <w:rFonts w:ascii="Malgun Gothic" w:cs="Malgun Gothic" w:eastAsia="Malgun Gothic" w:hAnsi="Malgun Gothic"/>
+                <w:sz w:val="18"/>
+                <w:szCs w:val="18"/>
+              </w:rPr>
+              <w:t xml:space="preserve">apps/api, ml/element_rank</w:t>
+            </w:r>
+          </w:p>
+        </w:tc>
+      </w:tr>
+      <w:tr>
+        <w:trPr>
+          <w:cantSplit/>
+          <w:tblHeader w:val="false"/>
+        </w:trPr>
+        <w:tc>
+          <w:tcPr>
+            <w:tcW w:type="dxa" w:w="1357"/>
+            <w:tcBorders>
+              <w:top w:val="none" w:color="FFFFFF" w:sz="0"/>
+              <w:left w:val="none" w:color="FFFFFF" w:sz="0"/>
+              <w:bottom w:val="single" w:color="D9D9D9" w:sz="2"/>
+              <w:right w:val="none" w:color="FFFFFF" w:sz="0"/>
+            </w:tcBorders>
+            <w:tcMar>
+              <w:top w:type="dxa" w:w="70"/>
+              <w:left w:type="dxa" w:w="110"/>
+              <w:bottom w:type="dxa" w:w="70"/>
+              <w:right w:type="dxa" w:w="110"/>
+            </w:tcMar>
+          </w:tcPr>
+          <w:p>
+            <w:pPr>
+              <w:spacing w:after="30" w:line="270"/>
+            </w:pPr>
+            <w:r>
+              <w:rPr>
+                <w:rFonts w:ascii="Malgun Gothic" w:cs="Malgun Gothic" w:eastAsia="Malgun Gothic" w:hAnsi="Malgun Gothic"/>
+                <w:b/>
+                <w:bCs/>
+                <w:sz w:val="18"/>
+                <w:szCs w:val="18"/>
+              </w:rPr>
+              <w:t xml:space="preserve">회귀 비교·인프라</w:t>
+            </w:r>
+          </w:p>
+        </w:tc>
+        <w:tc>
+          <w:tcPr>
+            <w:tcW w:type="dxa" w:w="1018"/>
+            <w:tcBorders>
+              <w:top w:val="none" w:color="FFFFFF" w:sz="0"/>
+              <w:left w:val="none" w:color="FFFFFF" w:sz="0"/>
+              <w:bottom w:val="single" w:color="D9D9D9" w:sz="2"/>
+              <w:right w:val="none" w:color="FFFFFF" w:sz="0"/>
+            </w:tcBorders>
+            <w:tcMar>
+              <w:top w:type="dxa" w:w="70"/>
+              <w:left w:type="dxa" w:w="110"/>
+              <w:bottom w:type="dxa" w:w="70"/>
+              <w:right w:type="dxa" w:w="110"/>
+            </w:tcMar>
+          </w:tcPr>
+          <w:p>
+            <w:pPr>
+              <w:spacing w:after="30" w:line="270"/>
+            </w:pPr>
+            <w:r>
+              <w:rPr>
+                <w:rFonts w:ascii="Malgun Gothic" w:cs="Malgun Gothic" w:eastAsia="Malgun Gothic" w:hAnsi="Malgun Gothic"/>
+                <w:sz w:val="18"/>
+                <w:szCs w:val="18"/>
+              </w:rPr>
+              <w:t xml:space="preserve"/>
+            </w:r>
+          </w:p>
+        </w:tc>
+        <w:tc>
+          <w:tcPr>
+            <w:tcW w:type="dxa" w:w="2851"/>
+            <w:tcBorders>
+              <w:top w:val="none" w:color="FFFFFF" w:sz="0"/>
+              <w:left w:val="none" w:color="FFFFFF" w:sz="0"/>
+              <w:bottom w:val="single" w:color="D9D9D9" w:sz="2"/>
+              <w:right w:val="none" w:color="FFFFFF" w:sz="0"/>
+            </w:tcBorders>
+            <w:tcMar>
+              <w:top w:type="dxa" w:w="70"/>
+              <w:left w:type="dxa" w:w="110"/>
+              <w:bottom w:type="dxa" w:w="70"/>
+              <w:right w:type="dxa" w:w="110"/>
+            </w:tcMar>
+          </w:tcPr>
+          <w:p>
+            <w:pPr>
+              <w:spacing w:after="30" w:line="270"/>
+            </w:pPr>
+            <w:r>
+              <w:rPr>
+                <w:rFonts w:ascii="Malgun Gothic" w:cs="Malgun Gothic" w:eastAsia="Malgun Gothic" w:hAnsi="Malgun Gothic"/>
+                <w:sz w:val="18"/>
+                <w:szCs w:val="18"/>
+              </w:rPr>
+              <w:t xml:space="preserve">비교 로직·기준 편차 판정, 비교 API, 배포(S1 스테이징), CI, 벤치마크 제작 진행 관리·평가</w:t>
+            </w:r>
+          </w:p>
+        </w:tc>
+        <w:tc>
+          <w:tcPr>
+            <w:tcW w:type="dxa" w:w="2308"/>
+            <w:tcBorders>
+              <w:top w:val="none" w:color="FFFFFF" w:sz="0"/>
+              <w:left w:val="none" w:color="FFFFFF" w:sz="0"/>
+              <w:bottom w:val="single" w:color="D9D9D9" w:sz="2"/>
+              <w:right w:val="none" w:color="FFFFFF" w:sz="0"/>
+            </w:tcBorders>
+            <w:tcMar>
+              <w:top w:type="dxa" w:w="70"/>
+              <w:left w:type="dxa" w:w="110"/>
+              <w:bottom w:type="dxa" w:w="70"/>
+              <w:right w:type="dxa" w:w="110"/>
+            </w:tcMar>
+          </w:tcPr>
+          <w:p>
+            <w:pPr>
+              <w:spacing w:after="30" w:line="270"/>
+            </w:pPr>
+            <w:r>
+              <w:rPr>
+                <w:rFonts w:ascii="Malgun Gothic" w:cs="Malgun Gothic" w:eastAsia="Malgun Gothic" w:hAnsi="Malgun Gothic"/>
+                <w:sz w:val="18"/>
+                <w:szCs w:val="18"/>
+              </w:rPr>
+              <w:t xml:space="preserve">–</w:t>
+            </w:r>
+          </w:p>
+        </w:tc>
+        <w:tc>
+          <w:tcPr>
+            <w:tcW w:type="dxa" w:w="2104"/>
+            <w:tcBorders>
+              <w:top w:val="none" w:color="FFFFFF" w:sz="0"/>
+              <w:left w:val="none" w:color="FFFFFF" w:sz="0"/>
+              <w:bottom w:val="single" w:color="D9D9D9" w:sz="2"/>
+              <w:right w:val="none" w:color="FFFFFF" w:sz="0"/>
+            </w:tcBorders>
+            <w:tcMar>
+              <w:top w:type="dxa" w:w="70"/>
+              <w:left w:type="dxa" w:w="110"/>
+              <w:bottom w:type="dxa" w:w="70"/>
+              <w:right w:type="dxa" w:w="110"/>
+            </w:tcMar>
+          </w:tcPr>
+          <w:p>
+            <w:pPr>
+              <w:spacing w:after="30" w:line="270"/>
+            </w:pPr>
+            <w:r>
+              <w:rPr>
+                <w:rFonts w:ascii="Malgun Gothic" w:cs="Malgun Gothic" w:eastAsia="Malgun Gothic" w:hAnsi="Malgun Gothic"/>
+                <w:sz w:val="18"/>
+                <w:szCs w:val="18"/>
+              </w:rPr>
+              <w:t xml:space="preserve">infra, 비교 API, benchmark/</w:t>
+            </w:r>
+          </w:p>
+        </w:tc>
+      </w:tr>
+      <w:tr>
+        <w:trPr>
+          <w:cantSplit/>
+          <w:tblHeader w:val="false"/>
+        </w:trPr>
+        <w:tc>
+          <w:tcPr>
+            <w:tcW w:type="dxa" w:w="1357"/>
+            <w:tcBorders>
+              <w:top w:val="none" w:color="FFFFFF" w:sz="0"/>
+              <w:left w:val="none" w:color="FFFFFF" w:sz="0"/>
+              <w:bottom w:val="single" w:color="D9D9D9" w:sz="2"/>
+              <w:right w:val="none" w:color="FFFFFF" w:sz="0"/>
+            </w:tcBorders>
+            <w:tcMar>
+              <w:top w:type="dxa" w:w="70"/>
+              <w:left w:type="dxa" w:w="110"/>
+              <w:bottom w:type="dxa" w:w="70"/>
+              <w:right w:type="dxa" w:w="110"/>
+            </w:tcMar>
+          </w:tcPr>
+          <w:p>
+            <w:pPr>
+              <w:spacing w:after="30" w:line="270"/>
+            </w:pPr>
+            <w:r>
+              <w:rPr>
+                <w:rFonts w:ascii="Malgun Gothic" w:cs="Malgun Gothic" w:eastAsia="Malgun Gothic" w:hAnsi="Malgun Gothic"/>
+                <w:b/>
+                <w:bCs/>
+                <w:sz w:val="18"/>
+                <w:szCs w:val="18"/>
+              </w:rPr>
+              <w:t xml:space="preserve">리포트 UI</w:t>
+            </w:r>
+          </w:p>
+        </w:tc>
+        <w:tc>
+          <w:tcPr>
+            <w:tcW w:type="dxa" w:w="1018"/>
+            <w:tcBorders>
+              <w:top w:val="none" w:color="FFFFFF" w:sz="0"/>
+              <w:left w:val="none" w:color="FFFFFF" w:sz="0"/>
+              <w:bottom w:val="single" w:color="D9D9D9" w:sz="2"/>
+              <w:right w:val="none" w:color="FFFFFF" w:sz="0"/>
+            </w:tcBorders>
+            <w:tcMar>
+              <w:top w:type="dxa" w:w="70"/>
+              <w:left w:type="dxa" w:w="110"/>
+              <w:bottom w:type="dxa" w:w="70"/>
+              <w:right w:type="dxa" w:w="110"/>
+            </w:tcMar>
+          </w:tcPr>
+          <w:p>
+            <w:pPr>
+              <w:spacing w:after="30" w:line="270"/>
+            </w:pPr>
+            <w:r>
+              <w:rPr>
+                <w:rFonts w:ascii="Malgun Gothic" w:cs="Malgun Gothic" w:eastAsia="Malgun Gothic" w:hAnsi="Malgun Gothic"/>
+                <w:sz w:val="18"/>
+                <w:szCs w:val="18"/>
+              </w:rPr>
+              <w:t xml:space="preserve"/>
+            </w:r>
+          </w:p>
+        </w:tc>
+        <w:tc>
+          <w:tcPr>
+            <w:tcW w:type="dxa" w:w="2851"/>
+            <w:tcBorders>
+              <w:top w:val="none" w:color="FFFFFF" w:sz="0"/>
+              <w:left w:val="none" w:color="FFFFFF" w:sz="0"/>
+              <w:bottom w:val="single" w:color="D9D9D9" w:sz="2"/>
+              <w:right w:val="none" w:color="FFFFFF" w:sz="0"/>
+            </w:tcBorders>
+            <w:tcMar>
+              <w:top w:type="dxa" w:w="70"/>
+              <w:left w:type="dxa" w:w="110"/>
+              <w:bottom w:type="dxa" w:w="70"/>
+              <w:right w:type="dxa" w:w="110"/>
+            </w:tcMar>
+          </w:tcPr>
+          <w:p>
+            <w:pPr>
+              <w:spacing w:after="30" w:line="270"/>
+            </w:pPr>
+            <w:r>
+              <w:rPr>
+                <w:rFonts w:ascii="Malgun Gothic" w:cs="Malgun Gothic" w:eastAsia="Malgun Gothic" w:hAnsi="Malgun Gothic"/>
+                <w:sz w:val="18"/>
+                <w:szCs w:val="18"/>
+              </w:rPr>
+              <w:t xml:space="preserve">와이어프레임, 디자인 시스템, 리포트 화면, 오버레이, 라벨 입력 화면, 자기 측정</w:t>
+            </w:r>
+          </w:p>
+        </w:tc>
+        <w:tc>
+          <w:tcPr>
+            <w:tcW w:type="dxa" w:w="2308"/>
+            <w:tcBorders>
+              <w:top w:val="none" w:color="FFFFFF" w:sz="0"/>
+              <w:left w:val="none" w:color="FFFFFF" w:sz="0"/>
+              <w:bottom w:val="single" w:color="D9D9D9" w:sz="2"/>
+              <w:right w:val="none" w:color="FFFFFF" w:sz="0"/>
+            </w:tcBorders>
+            <w:tcMar>
+              <w:top w:type="dxa" w:w="70"/>
+              <w:left w:type="dxa" w:w="110"/>
+              <w:bottom w:type="dxa" w:w="70"/>
+              <w:right w:type="dxa" w:w="110"/>
+            </w:tcMar>
+          </w:tcPr>
+          <w:p>
+            <w:pPr>
+              <w:spacing w:after="30" w:line="270"/>
+            </w:pPr>
+            <w:r>
+              <w:rPr>
+                <w:rFonts w:ascii="Malgun Gothic" w:cs="Malgun Gothic" w:eastAsia="Malgun Gothic" w:hAnsi="Malgun Gothic"/>
+                <w:sz w:val="18"/>
+                <w:szCs w:val="18"/>
+              </w:rPr>
+              <w:t xml:space="preserve">사람 데이터 수집 스크립트</w:t>
+            </w:r>
+          </w:p>
+        </w:tc>
+        <w:tc>
+          <w:tcPr>
+            <w:tcW w:type="dxa" w:w="2104"/>
+            <w:tcBorders>
+              <w:top w:val="none" w:color="FFFFFF" w:sz="0"/>
+              <w:left w:val="none" w:color="FFFFFF" w:sz="0"/>
+              <w:bottom w:val="single" w:color="D9D9D9" w:sz="2"/>
+              <w:right w:val="none" w:color="FFFFFF" w:sz="0"/>
+            </w:tcBorders>
+            <w:tcMar>
+              <w:top w:type="dxa" w:w="70"/>
+              <w:left w:type="dxa" w:w="110"/>
+              <w:bottom w:type="dxa" w:w="70"/>
+              <w:right w:type="dxa" w:w="110"/>
+            </w:tcMar>
+          </w:tcPr>
+          <w:p>
+            <w:pPr>
+              <w:spacing w:after="30" w:line="270"/>
+            </w:pPr>
+            <w:r>
+              <w:rPr>
+                <w:rFonts w:ascii="Malgun Gothic" w:cs="Malgun Gothic" w:eastAsia="Malgun Gothic" w:hAnsi="Malgun Gothic"/>
+                <w:sz w:val="18"/>
+                <w:szCs w:val="18"/>
+              </w:rPr>
+              <w:t xml:space="preserve">apps/web (리포트), human-study/ 스크립트</w:t>
+            </w:r>
+          </w:p>
+        </w:tc>
+      </w:tr>
+      <w:tr>
+        <w:trPr>
+          <w:cantSplit/>
+          <w:tblHeader w:val="false"/>
+        </w:trPr>
+        <w:tc>
+          <w:tcPr>
+            <w:tcW w:type="dxa" w:w="1357"/>
+            <w:tcBorders>
+              <w:top w:val="none" w:color="FFFFFF" w:sz="0"/>
+              <w:left w:val="none" w:color="FFFFFF" w:sz="0"/>
+              <w:bottom w:val="single" w:color="D9D9D9" w:sz="2"/>
+              <w:right w:val="none" w:color="FFFFFF" w:sz="0"/>
+            </w:tcBorders>
+            <w:tcMar>
+              <w:top w:type="dxa" w:w="70"/>
+              <w:left w:type="dxa" w:w="110"/>
+              <w:bottom w:type="dxa" w:w="70"/>
+              <w:right w:type="dxa" w:w="110"/>
+            </w:tcMar>
+          </w:tcPr>
+          <w:p>
+            <w:pPr>
+              <w:spacing w:after="30" w:line="270"/>
+            </w:pPr>
+            <w:r>
+              <w:rPr>
+                <w:rFonts w:ascii="Malgun Gothic" w:cs="Malgun Gothic" w:eastAsia="Malgun Gothic" w:hAnsi="Malgun Gothic"/>
+                <w:b/>
+                <w:bCs/>
+                <w:sz w:val="18"/>
+                <w:szCs w:val="18"/>
+              </w:rPr>
+              <w:t xml:space="preserve">대시보드 UI</w:t>
+            </w:r>
+          </w:p>
+        </w:tc>
+        <w:tc>
+          <w:tcPr>
+            <w:tcW w:type="dxa" w:w="1018"/>
+            <w:tcBorders>
+              <w:top w:val="none" w:color="FFFFFF" w:sz="0"/>
+              <w:left w:val="none" w:color="FFFFFF" w:sz="0"/>
+              <w:bottom w:val="single" w:color="D9D9D9" w:sz="2"/>
+              <w:right w:val="none" w:color="FFFFFF" w:sz="0"/>
+            </w:tcBorders>
+            <w:tcMar>
+              <w:top w:type="dxa" w:w="70"/>
+              <w:left w:type="dxa" w:w="110"/>
+              <w:bottom w:type="dxa" w:w="70"/>
+              <w:right w:type="dxa" w:w="110"/>
+            </w:tcMar>
+          </w:tcPr>
+          <w:p>
+            <w:pPr>
+              <w:spacing w:after="30" w:line="270"/>
+            </w:pPr>
+            <w:r>
+              <w:rPr>
+                <w:rFonts w:ascii="Malgun Gothic" w:cs="Malgun Gothic" w:eastAsia="Malgun Gothic" w:hAnsi="Malgun Gothic"/>
+                <w:sz w:val="18"/>
+                <w:szCs w:val="18"/>
+              </w:rPr>
+              <w:t xml:space="preserve"/>
+            </w:r>
+          </w:p>
+        </w:tc>
+        <w:tc>
+          <w:tcPr>
+            <w:tcW w:type="dxa" w:w="2851"/>
+            <w:tcBorders>
+              <w:top w:val="none" w:color="FFFFFF" w:sz="0"/>
+              <w:left w:val="none" w:color="FFFFFF" w:sz="0"/>
+              <w:bottom w:val="single" w:color="D9D9D9" w:sz="2"/>
+              <w:right w:val="none" w:color="FFFFFF" w:sz="0"/>
+            </w:tcBorders>
+            <w:tcMar>
+              <w:top w:type="dxa" w:w="70"/>
+              <w:left w:type="dxa" w:w="110"/>
+              <w:bottom w:type="dxa" w:w="70"/>
+              <w:right w:type="dxa" w:w="110"/>
+            </w:tcMar>
+          </w:tcPr>
+          <w:p>
+            <w:pPr>
+              <w:spacing w:after="30" w:line="270"/>
+            </w:pPr>
+            <w:r>
+              <w:rPr>
+                <w:rFonts w:ascii="Malgun Gothic" w:cs="Malgun Gothic" w:eastAsia="Malgun Gothic" w:hAnsi="Malgun Gothic"/>
+                <w:sz w:val="18"/>
+                <w:szCs w:val="18"/>
+              </w:rPr>
+              <w:t xml:space="preserve">측정 생성·진행 화면, 비교 화면, 재생 확인 화면, 차트</w:t>
+            </w:r>
+          </w:p>
+        </w:tc>
+        <w:tc>
+          <w:tcPr>
+            <w:tcW w:type="dxa" w:w="2308"/>
+            <w:tcBorders>
+              <w:top w:val="none" w:color="FFFFFF" w:sz="0"/>
+              <w:left w:val="none" w:color="FFFFFF" w:sz="0"/>
+              <w:bottom w:val="single" w:color="D9D9D9" w:sz="2"/>
+              <w:right w:val="none" w:color="FFFFFF" w:sz="0"/>
+            </w:tcBorders>
+            <w:tcMar>
+              <w:top w:type="dxa" w:w="70"/>
+              <w:left w:type="dxa" w:w="110"/>
+              <w:bottom w:type="dxa" w:w="70"/>
+              <w:right w:type="dxa" w:w="110"/>
+            </w:tcMar>
+          </w:tcPr>
+          <w:p>
+            <w:pPr>
+              <w:spacing w:after="30" w:line="270"/>
+            </w:pPr>
+            <w:r>
+              <w:rPr>
+                <w:rFonts w:ascii="Malgun Gothic" w:cs="Malgun Gothic" w:eastAsia="Malgun Gothic" w:hAnsi="Malgun Gothic"/>
+                <w:sz w:val="18"/>
+                <w:szCs w:val="18"/>
+              </w:rPr>
+              <w:t xml:space="preserve">사람 데이터 수집 운영 (모집, 동의서, 세션 진행)</w:t>
+            </w:r>
+          </w:p>
+        </w:tc>
+        <w:tc>
+          <w:tcPr>
+            <w:tcW w:type="dxa" w:w="2104"/>
+            <w:tcBorders>
+              <w:top w:val="none" w:color="FFFFFF" w:sz="0"/>
+              <w:left w:val="none" w:color="FFFFFF" w:sz="0"/>
+              <w:bottom w:val="single" w:color="D9D9D9" w:sz="2"/>
+              <w:right w:val="none" w:color="FFFFFF" w:sz="0"/>
+            </w:tcBorders>
+            <w:tcMar>
+              <w:top w:type="dxa" w:w="70"/>
+              <w:left w:type="dxa" w:w="110"/>
+              <w:bottom w:type="dxa" w:w="70"/>
+              <w:right w:type="dxa" w:w="110"/>
+            </w:tcMar>
+          </w:tcPr>
+          <w:p>
+            <w:pPr>
+              <w:spacing w:after="30" w:line="270"/>
+            </w:pPr>
+            <w:r>
+              <w:rPr>
+                <w:rFonts w:ascii="Malgun Gothic" w:cs="Malgun Gothic" w:eastAsia="Malgun Gothic" w:hAnsi="Malgun Gothic"/>
+                <w:sz w:val="18"/>
+                <w:szCs w:val="18"/>
+              </w:rPr>
+              <w:t xml:space="preserve">apps/web (대시보드), human-study/ 동의서</w:t>
             </w:r>
           </w:p>
         </w:tc>
@@ -22166,7 +22803,7 @@
         <w:rPr>
           <w:rFonts w:ascii="Malgun Gothic" w:cs="Malgun Gothic" w:eastAsia="Malgun Gothic" w:hAnsi="Malgun Gothic"/>
         </w:rPr>
-        <w:t xml:space="preserve">13.1 파트 간 인터페이스 (S1에 확정)</w:t>
+        <w:t xml:space="preserve">13.1 역할 간 인터페이스 (S1에 확정)</w:t>
       </w:r>
     </w:p>
     <w:p>
@@ -22182,7 +22819,7 @@
         <w:rPr>
           <w:rFonts w:ascii="Malgun Gothic" w:cs="Malgun Gothic" w:eastAsia="Malgun Gothic" w:hAnsi="Malgun Gothic"/>
         </w:rPr>
-        <w:t xml:space="preserve">에이전트 ↔ 측정: ElementSnapshot, Step 데이터 형식 (Pydantic 모델, worker/schemas.py)</w:t>
+        <w:t xml:space="preserve">에이전트 코어 ↔ 수집·매칭·측정 지표: ElementSnapshot, Step 데이터 형식 (Pydantic 모델, worker/schemas.py)</w:t>
       </w:r>
     </w:p>
     <w:p>
@@ -22198,7 +22835,7 @@
         <w:rPr>
           <w:rFonts w:ascii="Malgun Gothic" w:cs="Malgun Gothic" w:eastAsia="Malgun Gothic" w:hAnsi="Malgun Gothic"/>
         </w:rPr>
-        <w:t xml:space="preserve">워커 ↔ 플랫폼: 큐 작업 페이로드, 진행률 갱신 방식, DB 쓰기 경계</w:t>
+        <w:t xml:space="preserve">워커 ↔ 플랫폼 백엔드: 큐 작업 페이로드, 진행률 갱신 방식, DB 쓰기 경계</w:t>
       </w:r>
     </w:p>
     <w:p>
@@ -22214,7 +22851,7 @@
         <w:rPr>
           <w:rFonts w:ascii="Malgun Gothic" w:cs="Malgun Gothic" w:eastAsia="Malgun Gothic" w:hAnsi="Malgun Gothic"/>
         </w:rPr>
-        <w:t xml:space="preserve">플랫폼 ↔ 리포트: OpenAPI 스키마와 목 응답</w:t>
+        <w:t xml:space="preserve">플랫폼 백엔드 ↔ 리포트·대시보드 UI: OpenAPI 스키마와 목 응답</w:t>
       </w:r>
     </w:p>
     <w:p>
@@ -22230,7 +22867,7 @@
         <w:rPr>
           <w:rFonts w:ascii="Malgun Gothic" w:cs="Malgun Gothic" w:eastAsia="Malgun Gothic" w:hAnsi="Malgun Gothic"/>
         </w:rPr>
-        <w:t xml:space="preserve">측정 ↔ ML: 이슈 점수·분류기 특징 목록과 입력 형식, 모델 파일 로드 방식 (model_version 테이블)</w:t>
+        <w:t xml:space="preserve">수집·매칭·측정 지표 ↔ 플랫폼 백엔드(ML 파이프라인): 이슈 점수·분류기 특징 목록과 입력 형식, 모델 파일 로드 방식 (model_version 테이블)</w:t>
       </w:r>
     </w:p>
     <w:p>
@@ -22246,7 +22883,39 @@
         <w:rPr>
           <w:rFonts w:ascii="Malgun Gothic" w:cs="Malgun Gothic" w:eastAsia="Malgun Gothic" w:hAnsi="Malgun Gothic"/>
         </w:rPr>
-        <w:t xml:space="preserve">측정 → 에이전트: 요소 매칭 함수 match(기록된 요소, 현재 화면) → 요소 | 없음 | 애매함. 재생기는 이 결과만 보고 진행·중단을 정한다.</w:t>
+        <w:t xml:space="preserve">수집·매칭 → 에이전트 코어: 요소 매칭 함수 match(기록된 요소, 현재 화면) → 요소 | 없음 | 애매함. 재생기는 이 결과만 보고 진행·중단을 정한다.</w:t>
+      </w:r>
+    </w:p>
+    <w:p>
+      <w:pPr>
+        <w:pStyle w:val="ListParagraph"/>
+        <w:numPr>
+          <w:ilvl w:val="0"/>
+          <w:numId w:val="4"/>
+        </w:numPr>
+        <w:spacing w:after="60" w:line="290"/>
+      </w:pPr>
+      <w:r>
+        <w:rPr>
+          <w:rFonts w:ascii="Malgun Gothic" w:cs="Malgun Gothic" w:eastAsia="Malgun Gothic" w:hAnsi="Malgun Gothic"/>
+        </w:rPr>
+        <w:t xml:space="preserve">에이전트 코어 ↔ LLM·프롬프트: 행동 스키마(4.3)의 주인은 에이전트 코어, 프롬프트를 바꿀 때 LLM·프롬프트가 함께 검토. LLM 호출 기록(llm_call)은 LLM·프롬프트, 예산 상한·알림은 플랫폼 백엔드.</w:t>
+      </w:r>
+    </w:p>
+    <w:p>
+      <w:pPr>
+        <w:pStyle w:val="ListParagraph"/>
+        <w:numPr>
+          <w:ilvl w:val="0"/>
+          <w:numId w:val="4"/>
+        </w:numPr>
+        <w:spacing w:after="60" w:line="290"/>
+      </w:pPr>
+      <w:r>
+        <w:rPr>
+          <w:rFonts w:ascii="Malgun Gothic" w:cs="Malgun Gothic" w:eastAsia="Malgun Gothic" w:hAnsi="Malgun Gothic"/>
+        </w:rPr>
+        <w:t xml:space="preserve">플랫폼 백엔드 → 에이전트 코어: 요소 순위 모델 추론 함수와 model_version 로드 방식 (9.4 온라인 적용 시에만 루프에 연결).</w:t>
       </w:r>
     </w:p>
     <w:p>
@@ -22257,7 +22926,7 @@
         <w:rPr>
           <w:rFonts w:ascii="Malgun Gothic" w:cs="Malgun Gothic" w:eastAsia="Malgun Gothic" w:hAnsi="Malgun Gothic"/>
         </w:rPr>
-        <w:t xml:space="preserve">전철우는 플랫폼 소속이지만 S4부터 비교 화면 연결을 리포트 파트와 같이 맡는다. 요소 매칭 모듈은 재생과 문제 매칭이 같은 기능이라 측정 파트로 옮겨 에이전트 파트의 부담을 줄였다.</w:t>
+        <w:t xml:space="preserve">역할별 담당자는 아직 정하지 않았고 S1 첫 주에 배정한다. PM은 통합·QA 담당으로 E2E 테스트(15.3), 벤치마크 정답 교차 검토, 이슈 라벨 최종 판정을 맡는다. 병렬 반복 실행은 큐·동시성 문제라 플랫폼 백엔드가 맡는다. 회귀 비교·인프라 담당은 S4부터 비교 화면 연결을 대시보드 UI 담당과 같이 맡는다. 요소 매칭 모듈은 재생과 문제 매칭이 같은 기능이라 수집·매칭 역할에 두어 에이전트 코어의 부담을 줄였다.</w:t>
       </w:r>
     </w:p>
     <w:p>
@@ -22546,20 +23215,20 @@
                 <w:sz w:val="18"/>
                 <w:szCs w:val="18"/>
               </w:rPr>
-              <w:t xml:space="preserve">레포·CI·Docker, DB 스키마 v1</w:t>
-            </w:r>
-          </w:p>
-          <w:p>
-            <w:pPr>
-              <w:spacing w:after="30" w:line="270"/>
-            </w:pPr>
-            <w:r>
-              <w:rPr>
-                <w:rFonts w:ascii="Malgun Gothic" w:cs="Malgun Gothic" w:eastAsia="Malgun Gothic" w:hAnsi="Malgun Gothic"/>
-                <w:sz w:val="18"/>
-                <w:szCs w:val="18"/>
-              </w:rPr>
-              <w:t xml:space="preserve">파트 간 인터페이스 확정</w:t>
+              <w:t xml:space="preserve">레포·CI·Docker, 스테이징 배포, DB 스키마 v1</w:t>
+            </w:r>
+          </w:p>
+          <w:p>
+            <w:pPr>
+              <w:spacing w:after="30" w:line="270"/>
+            </w:pPr>
+            <w:r>
+              <w:rPr>
+                <w:rFonts w:ascii="Malgun Gothic" w:cs="Malgun Gothic" w:eastAsia="Malgun Gothic" w:hAnsi="Malgun Gothic"/>
+                <w:sz w:val="18"/>
+                <w:szCs w:val="18"/>
+              </w:rPr>
+              <w:t xml:space="preserve">역할 배정(첫 주), 역할 간 인터페이스 확정</w:t>
             </w:r>
           </w:p>
           <w:p>
@@ -22611,7 +23280,7 @@
                 <w:sz w:val="18"/>
                 <w:szCs w:val="18"/>
               </w:rPr>
-              <w:t xml:space="preserve">사람 데이터 과업 10개 선정, 동의서 초안</w:t>
+              <w:t xml:space="preserve">사람 데이터 과업 10개 선정, 동의서 초안, 연구윤리(IRB) 심의 필요 여부 확인</w:t>
             </w:r>
           </w:p>
         </w:tc>
@@ -22739,7 +23408,7 @@
                 <w:sz w:val="18"/>
                 <w:szCs w:val="18"/>
               </w:rPr>
-              <w:t xml:space="preserve">에이전트 루프 v1 (단계 상한, 반복 감지)</w:t>
+              <w:t xml:space="preserve">에이전트 루프 v1 (단계 상한, 반복 감지), 재생용 경로 기록 형식 확정</w:t>
             </w:r>
           </w:p>
           <w:p>
@@ -22791,7 +23460,7 @@
                 <w:sz w:val="18"/>
                 <w:szCs w:val="18"/>
               </w:rPr>
-              <w:t xml:space="preserve">측정 생성 화면, 벤치마크 15개</w:t>
+              <w:t xml:space="preserve">측정 생성 화면, 벤치마크 15개 (전원 분담)</w:t>
             </w:r>
           </w:p>
           <w:p>
@@ -23010,7 +23679,7 @@
                 <w:sz w:val="18"/>
                 <w:szCs w:val="18"/>
               </w:rPr>
-              <w:t xml:space="preserve">요소 매칭 모듈 v1</w:t>
+              <w:t xml:space="preserve">요소 매칭 모듈 v1, 경로 고정 재생 v1</w:t>
             </w:r>
           </w:p>
           <w:p>
@@ -23177,7 +23846,7 @@
                 <w:sz w:val="18"/>
                 <w:szCs w:val="18"/>
               </w:rPr>
-              <w:t xml:space="preserve">재측정 비교, 모바일 뷰포트</w:t>
+              <w:t xml:space="preserve">재측정 비교</w:t>
             </w:r>
           </w:p>
           <w:p>
@@ -23216,7 +23885,7 @@
                 <w:sz w:val="18"/>
                 <w:szCs w:val="18"/>
               </w:rPr>
-              <w:t xml:space="preserve">경로 고정 재생, 기준 편차 기반 판정</w:t>
+              <w:t xml:space="preserve">재생 안정화, 기준 편차 기반 판정</w:t>
             </w:r>
           </w:p>
           <w:p>
@@ -23422,7 +24091,7 @@
                 <w:sz w:val="18"/>
                 <w:szCs w:val="18"/>
               </w:rPr>
-              <w:t xml:space="preserve">로그인, 배포</w:t>
+              <w:t xml:space="preserve">모바일 뷰포트, 로그인, 운영 배포</w:t>
             </w:r>
           </w:p>
           <w:p>
@@ -23673,7 +24342,7 @@
         <w:rPr>
           <w:rFonts w:ascii="Malgun Gothic" w:cs="Malgun Gothic" w:eastAsia="Malgun Gothic" w:hAnsi="Malgun Gothic"/>
         </w:rPr>
-        <w:t xml:space="preserve">스프린트 계획은 격주 월요일, 회고는 격주 금요일. 전체 회의는 매주 1회 30분으로 파트별 진행 상황과 막힌 점만 공유한다.</w:t>
+        <w:t xml:space="preserve">스프린트 계획은 격주 월요일, 회고는 격주 금요일. 전체 회의는 매주 1회 30분으로 역할별 진행 상황과 막힌 점만 공유한다.</w:t>
       </w:r>
     </w:p>
     <w:p>
@@ -24522,7 +25191,7 @@
         <w:rPr>
           <w:rFonts w:ascii="Malgun Gothic" w:cs="Malgun Gothic" w:eastAsia="Malgun Gothic" w:hAnsi="Malgun Gothic"/>
         </w:rPr>
-        <w:t xml:space="preserve"> Lighthouse·PageSpeed Insights 리포트와 axe DevTools 이슈 목록을 분석한다. 점수 → 개선 항목 목록 → 요소 위치 표시로 이어지는 구조가 우리 리포트와 가장 비슷하고 개발자에게 익숙하다. 정보 위계, 이슈 정렬, 심각도 표현 방식을 정리해 와이어프레임에 반영한다. 담당: PM, 리포트 파트.</w:t>
+        <w:t xml:space="preserve"> Lighthouse·PageSpeed Insights 리포트와 axe DevTools 이슈 목록을 분석한다. 점수 → 개선 항목 목록 → 요소 위치 표시로 이어지는 구조가 우리 리포트와 가장 비슷하고 개발자에게 익숙하다. 정보 위계, 이슈 정렬, 심각도 표현 방식을 정리해 와이어프레임에 반영한다. 담당: 리포트 UI.</w:t>
       </w:r>
     </w:p>
     <w:p>
@@ -26065,7 +26734,7 @@
                 <w:sz w:val="18"/>
                 <w:szCs w:val="18"/>
               </w:rPr>
-              <w:t xml:space="preserve">에이전트 파트 업무 과중</w:t>
+              <w:t xml:space="preserve">에이전트 코어 업무 과중</w:t>
             </w:r>
           </w:p>
         </w:tc>
@@ -26125,7 +26794,7 @@
                 <w:sz w:val="18"/>
                 <w:szCs w:val="18"/>
               </w:rPr>
-              <w:t xml:space="preserve">요소 매칭 모듈 측정 파트 이관, 요소 순위 모델 온라인 적용 조건부</w:t>
+              <w:t xml:space="preserve">요소 매칭은 수집·매칭, 순위 모델 학습·병렬 반복 실행은 플랫폼 백엔드로 분리, 재생 v1을 S3로 당김, 온라인 적용 조건부</w:t>
             </w:r>
           </w:p>
         </w:tc>

</xml_diff>

<commit_message>
Improve consistency and readability of planning docs
- Align cost and timing targets with the default 3-run measurement
- Make element ranking model usage conditional everywhere, unify participant count and terms
- Explain technical and statistical terms in plain language
</commit_message>
<xml_diff>
--- a/docs/StepMeter_개발계획서.docx
+++ b/docs/StepMeter_개발계획서.docx
@@ -817,7 +817,7 @@
         <w:rPr>
           <w:rFonts w:ascii="Malgun Gothic" w:cs="Malgun Gothic" w:eastAsia="Malgun Gothic" w:hAnsi="Malgun Gothic"/>
         </w:rPr>
-        <w:t xml:space="preserve"> 측정 모듈은 순수 함수로 작성하고 단위 테스트로 검증한다. 에이전트를 바꿔도 측정값은 바뀌지 않는다.</w:t>
+        <w:t xml:space="preserve"> 측정 모듈은 순수 함수(같은 입력이면 항상 같은 결과를 내는 함수)로 작성하고 단위 테스트로 검증한다. 에이전트를 바꿔도 측정값은 바뀌지 않는다.</w:t>
       </w:r>
     </w:p>
     <w:p>
@@ -889,7 +889,7 @@
         <w:rPr>
           <w:rFonts w:ascii="Malgun Gothic" w:cs="Malgun Gothic" w:eastAsia="Malgun Gothic" w:hAnsi="Malgun Gothic"/>
         </w:rPr>
-        <w:t xml:space="preserve"> 사람 데이터와 라벨로 학습한 모델은 소요 시간 예측과 이슈 신뢰도에만 쓴다. 원래 측정값은 항상 그대로 보여준다.</w:t>
+        <w:t xml:space="preserve"> 사람 데이터와 라벨로 학습한 모델은 소요 시간 예측, 이슈 점수, LLM에 넘길 요소 선택에만 쓴다. 원래 측정값은 항상 그대로 보여준다.</w:t>
       </w:r>
     </w:p>
     <w:p>
@@ -2222,7 +2222,7 @@
         <w:rPr>
           <w:rFonts w:ascii="Malgun Gothic" w:cs="Malgun Gothic" w:eastAsia="Malgun Gothic" w:hAnsi="Malgun Gothic"/>
         </w:rPr>
-        <w:t xml:space="preserve">각 실행에서 에이전트 루프가 돈다. 매 행동 직전에 측정 훅이 대상 요소 정보를 저장한다.</w:t>
+        <w:t xml:space="preserve">각 실행에서 에이전트 루프가 돈다. 매 행동 직전에 측정 훅(행동 직전에 끼워 넣어 값을 기록하는 코드)이 대상 요소 정보를 저장한다.</w:t>
       </w:r>
     </w:p>
     <w:p>
@@ -5225,7 +5225,7 @@
         <w:rPr>
           <w:rFonts w:ascii="Malgun Gothic" w:cs="Malgun Gothic" w:eastAsia="Malgun Gothic" w:hAnsi="Malgun Gothic"/>
         </w:rPr>
-        <w:t xml:space="preserve"> 크기 0, display:none, visibility:hidden, opacity 0, 뷰포트 밖 요소는 제외한다. 요소 중심점의 elementFromPoint가 자기 자신이나 자손이 아니면 투명 오버레이나 고정 헤더에 가려진 것으로 보고 제외한다. 남은 요소가 30개를 넘으면 요소 후보 순위 모델(9.4)로 상위 30개만 넘긴다.</w:t>
+        <w:t xml:space="preserve"> 크기 0, display:none, visibility:hidden, opacity 0, 뷰포트 밖 요소는 제외한다. 요소 중심점을 찍었을 때(elementFromPoint) 다른 요소가 잡히면 투명 막이나 고정 헤더에 가려진 것으로 보고 제외한다. 남은 요소는 모두 LLM에 넘긴다. 요소 후보 순위 모델(9.4)의 온라인 적용이 결정되면, 30개가 넘을 때 상위 30개만 넘긴다.</w:t>
       </w:r>
     </w:p>
     <w:p>
@@ -6442,7 +6442,7 @@
         <w:rPr>
           <w:rFonts w:ascii="Malgun Gothic" w:cs="Malgun Gothic" w:eastAsia="Malgun Gothic" w:hAnsi="Malgun Gothic"/>
         </w:rPr>
-        <w:t xml:space="preserve">LLM 온도를 0으로 두어도 에이전트 경로는 결정적이지 않다. 렌더링 지연, 비동기 응답 순서, 모델 서버의 샘플링 특성 때문에 같은 화면에서도 다른 행동을 고를 수 있다. 그래서 기본값으로 같은 과업을 3회 독립 실행하고, 경로 의존 지표는 성공한 실행의 중앙값을 쓴다. 3회 중 2회 이상 성공하지 못하면 경로 의존 지표는 비교에 쓰지 않는다.</w:t>
+        <w:t xml:space="preserve">LLM의 무작위성(온도)을 0으로 두어도 에이전트 경로는 결정적이지 않다. 렌더링 지연, 비동기 응답 순서, 모델 서버의 샘플링 특성 때문에 같은 화면에서도 다른 행동을 고를 수 있다. 그래서 기본값으로 같은 과업을 3회 독립 실행하고, 경로 의존 지표는 성공한 실행의 중앙값을 쓴다. 3회 중 2회 이상 성공하지 못하면 경로 의존 지표는 비교에 쓰지 않는다.</w:t>
       </w:r>
     </w:p>
     <w:p>
@@ -7310,7 +7310,7 @@
         <w:rPr>
           <w:rFonts w:ascii="Malgun Gothic" w:cs="Malgun Gothic" w:eastAsia="Malgun Gothic" w:hAnsi="Malgun Gothic"/>
         </w:rPr>
-        <w:t xml:space="preserve">Shannon 형식을 쓴다. 타겟 폭 W는 이동 방향을 따라 잰 폭이다. 직사각형 중심을 지나는 방향 u의 선분 길이로 계산한다.</w:t>
+        <w:t xml:space="preserve">멀리 있고 작은 버튼일수록 누르기 어렵다는 Fitts 법칙으로 난이도를 계산한다(Shannon 형식). 타겟 폭 W는 커서가 들어오는 방향으로 잰 버튼 폭이다.</w:t>
       </w:r>
     </w:p>
     <w:p>
@@ -8800,7 +8800,7 @@
         <w:rPr>
           <w:rFonts w:ascii="Malgun Gothic" w:cs="Malgun Gothic" w:eastAsia="Malgun Gothic" w:hAnsi="Malgun Gothic"/>
         </w:rPr>
-        <w:t xml:space="preserve">에이전트가 과업에 쓴 시간은 LLM 응답 속도일 뿐 사람의 사용 시간과 관계가 없다. 대신 에이전트가 밟은 경로를 키 입력 수준 모델(KLM)의 동작 단위로 바꿔 사람이 걸릴 시간을 계산한다.</w:t>
+        <w:t xml:space="preserve">에이전트가 과업에 쓴 시간은 LLM 응답 속도일 뿐 사람의 사용 시간과 관계가 없다. 대신 에이전트가 밟은 경로를 키 입력 수준 모델(KLM)로 바꿔 사람이 걸릴 시간을 계산한다. KLM은 사람의 조작을 클릭·타자·생각 같은 동작으로 나누고 동작별 표준 시간을 더하는 모델이다.</w:t>
       </w:r>
     </w:p>
     <w:p>
@@ -11748,7 +11748,7 @@
         <w:rPr>
           <w:rFonts w:ascii="Malgun Gothic" w:cs="Malgun Gothic" w:eastAsia="Malgun Gothic" w:hAnsi="Malgun Gothic"/>
         </w:rPr>
-        <w:t xml:space="preserve">가중치는 벤치마크 학습 세트(9.3과 같은 28페이지 분할)에서 격자 탐색으로 정하고, 테스트 세트와 실사이트에서 따로 확인한다. 가중치도 벤치마크에 맞춰지면 과적합될 수 있으므로 분할을 지킨다.</w:t>
+        <w:t xml:space="preserve">가중치는 벤치마크 학습 세트(9.3과 같은 28페이지 분할)에서 여러 조합을 모두 시험해 보는 방식(격자 탐색)으로 정하고, 테스트 세트와 실사이트에서 따로 확인한다. 가중치가 벤치마크에만 너무 맞춰지면(과적합) 실사이트에서 성능이 떨어지므로 분할을 지킨다.</w:t>
       </w:r>
     </w:p>
     <w:p>
@@ -11764,7 +11764,7 @@
         <w:rPr>
           <w:rFonts w:ascii="Malgun Gothic" w:cs="Malgun Gothic" w:eastAsia="Malgun Gothic" w:hAnsi="Malgun Gothic"/>
         </w:rPr>
-        <w:t xml:space="preserve">임계값 이상은 기본 목록, 미만은 "참고" 목록에 넣는다. 임계값은 학습 세트에서 정밀도 0.85를 유지하는 값 중 재현율이 가장 높은 값이다.</w:t>
+        <w:t xml:space="preserve">임계값 이상은 기본 목록, 미만은 "참고" 목록에 넣는다. 임계값은 학습 세트에서 정밀도(찾은 문제 중 진짜 문제의 비율) 0.85를 지키면서 재현율(진짜 문제 중 찾아낸 비율)이 가장 높은 값으로 정한다.</w:t>
       </w:r>
     </w:p>
     <w:p>
@@ -15730,7 +15730,7 @@
         <w:rPr>
           <w:rFonts w:ascii="Malgun Gothic" w:cs="Malgun Gothic" w:eastAsia="Malgun Gothic" w:hAnsi="Malgun Gothic"/>
         </w:rPr>
-        <w:t xml:space="preserve">15~30명 표본은 입력 장치, 화면 크기, 숙련도에 따라 편차가 크다. 그래서 실측 데이터로 모델을 새로 만드는 대신, 문헌 KLM 상수(5.10)를 기본값으로 고정하고 실측 데이터는 연산자별 보정 계수를 구하는 데만 쓴다.</w:t>
+        <w:t xml:space="preserve">20~30명(최소 15명) 규모의 표본은 입력 장치, 화면 크기, 숙련도에 따라 편차가 크다. 그래서 실측 데이터로 모델을 새로 만드는 대신, 문헌 KLM 상수(5.10)를 기본값으로 고정하고 실측 데이터는 연산자별 보정 계수를 구하는 데만 쓴다.</w:t>
       </w:r>
     </w:p>
     <w:p>
@@ -16078,7 +16078,7 @@
         <w:rPr>
           <w:rFonts w:ascii="Malgun Gothic" w:cs="Malgun Gothic" w:eastAsia="Malgun Gothic" w:hAnsi="Malgun Gothic"/>
         </w:rPr>
-        <w:t xml:space="preserve">사전값을 문헌값에 둔 베이즈 갱신을 단순화한 형태다. 참가자 수가 부족하거나 편차가 커도 결과가 문헌값에서 크게 벗어나지 않는다.</w:t>
+        <w:t xml:space="preserve">쉽게 말해 문헌값과 실측값을 표본 수에 따라 섞는 방식이다. 표본이 20개면 반반이고, 적을수록 문헌값에 가깝다. 참가자가 적거나 편차가 커도 결과가 문헌값에서 크게 벗어나지 않는다.</w:t>
       </w:r>
     </w:p>
     <w:p>
@@ -16121,7 +16121,7 @@
         <w:rPr>
           <w:rFonts w:ascii="Malgun Gothic" w:cs="Malgun Gothic" w:eastAsia="Malgun Gothic" w:hAnsi="Malgun Gothic"/>
         </w:rPr>
-        <w:t xml:space="preserve">입력 장치는 참가자를 나눠 따로 적합하지 않고 공변량으로 넣는다. 장치별로 나누면 집단이 너무 작아진다.</w:t>
+        <w:t xml:space="preserve">입력 장치(마우스/트랙패드)는 따로 모델을 만들지 않고 입력 변수 하나로 넣는다. 장치별로 나누면 집단이 너무 작아진다.</w:t>
       </w:r>
     </w:p>
     <w:p>
@@ -16180,7 +16180,7 @@
         <w:rPr>
           <w:rFonts w:ascii="Malgun Gothic" w:cs="Malgun Gothic" w:eastAsia="Malgun Gothic" w:hAnsi="Malgun Gothic"/>
         </w:rPr>
-        <w:t xml:space="preserve">지표는 과업 단위 MAPE와 페이지 간 소요 시간 순위 상관(스피어만). 순위 상관은 전후 비교 용도에 맞는 지표다.</w:t>
+        <w:t xml:space="preserve">지표는 과업 단위 평균 오차율(MAPE)과, 페이지별 소요 시간 순위가 실제 순위와 얼마나 맞는지(스피어만 순위 상관)다. 주 용도가 전후 비교라서 순위가 맞는지가 중요하다.</w:t>
       </w:r>
     </w:p>
     <w:p>
@@ -16784,7 +16784,7 @@
         <w:rPr>
           <w:rFonts w:ascii="Malgun Gothic" w:cs="Malgun Gothic" w:eastAsia="Malgun Gothic" w:hAnsi="Malgun Gothic"/>
         </w:rPr>
-        <w:t xml:space="preserve"> 벤치마크는 페이지 단위 5겹 교차 검증(GroupKFold), 실사이트는 학습에 쓰지 않은 별도 평가 세트로 따로 보고한다.</w:t>
+        <w:t xml:space="preserve"> 벤치마크는 같은 페이지가 학습과 평가에 함께 들어가지 않도록 페이지 단위 5겹 교차 검증(GroupKFold), 실사이트는 학습에 쓰지 않은 별도 평가 세트로 따로 보고한다.</w:t>
       </w:r>
     </w:p>
     <w:p>
@@ -16835,7 +16835,7 @@
         <w:rPr>
           <w:rFonts w:ascii="Malgun Gothic" w:cs="Malgun Gothic" w:eastAsia="Malgun Gothic" w:hAnsi="Malgun Gothic"/>
         </w:rPr>
-        <w:t xml:space="preserve">후보 요소 영역을 스크린샷에서 여백 16px을 두고 잘라, CLIP 계열 이미지 인코더(가중치 고정)로 임베딩한다. PCA로 32차원으로 줄여 기존 특징에 붙인다.</w:t>
+        <w:t xml:space="preserve">후보 요소 부분을 스크린샷에서 잘라(여백 16px) 이미지 모델(CLIP 계열, 추가 학습 없음)로 숫자 벡터로 바꾼다. 이를 32차원으로 줄여(PCA) 기존 특징에 붙인다.</w:t>
       </w:r>
     </w:p>
     <w:p>
@@ -17079,7 +17079,7 @@
         <w:rPr>
           <w:rFonts w:ascii="Malgun Gothic" w:cs="Malgun Gothic" w:eastAsia="Malgun Gothic" w:hAnsi="Malgun Gothic"/>
         </w:rPr>
-        <w:t xml:space="preserve"> 요소마다 "이번 단계에 눌릴 가능성" 점수를 매기는 순위 모델. LightGBM LambdaRank를 쓰고, 한 단계의 요소 목록을 하나의 그룹으로 학습한다.</w:t>
+        <w:t xml:space="preserve"> 요소마다 "이번 단계에 눌릴 가능성" 점수를 매기는 순위 모델. 순위 학습 방식(LightGBM LambdaRank)을 쓰고, 한 단계의 요소 목록 안에서 순서를 맞히도록 학습한다.</w:t>
       </w:r>
     </w:p>
     <w:p>
@@ -17521,7 +17521,7 @@
         <w:rPr>
           <w:rFonts w:ascii="Malgun Gothic" w:cs="Malgun Gothic" w:eastAsia="Malgun Gothic" w:hAnsi="Malgun Gothic"/>
         </w:rPr>
-        <w:t xml:space="preserve">다국어 소형 문장 임베딩 모델(multilingual-e5-small 급)을 대조 학습으로 파인튜닝한다. (과업 설명 + 직전 thought, 실제 누른 요소 텍스트)를 양성 쌍으로, 같은 단계의 다른 요소를 음성으로 쓴다.</w:t>
+        <w:t xml:space="preserve">다국어 소형 문장 임베딩 모델(multilingual-e5-small 급)을 추가 학습(파인튜닝)한다. 과업과 실제로 누른 요소는 가깝게, 누르지 않은 요소는 멀게 배우는 대조 학습 방식이다. (과업 설명 + 직전 thought, 실제 누른 요소 텍스트)를 양성 쌍으로, 같은 단계의 다른 요소를 음성으로 쓴다.</w:t>
       </w:r>
     </w:p>
     <w:p>
@@ -17580,7 +17580,7 @@
         <w:rPr>
           <w:rFonts w:ascii="Malgun Gothic" w:cs="Malgun Gothic" w:eastAsia="Malgun Gothic" w:hAnsi="Malgun Gothic"/>
         </w:rPr>
-        <w:t xml:space="preserve">소형 VLM 증류는 GPU 확보와 모델 서빙 부담이 커서 학기 이후 확장 과제로 둔다.</w:t>
+        <w:t xml:space="preserve">작은 이미지·언어 모델(VLM)을 직접 학습하는 것은 GPU 확보와 모델 서빙 부담이 커서 학기 이후 확장 과제로 둔다.</w:t>
       </w:r>
     </w:p>
     <w:p>
@@ -21520,7 +21520,7 @@
                 <w:sz w:val="18"/>
                 <w:szCs w:val="18"/>
               </w:rPr>
-              <w:t xml:space="preserve">주간 진행 보고, tests/e2e, 데모 영상</w:t>
+              <w:t xml:space="preserve">주간 진행 보고, E2E 테스트, 데모 영상</w:t>
             </w:r>
           </w:p>
         </w:tc>

</xml_diff>

<commit_message>
Adopt axe-core, Playwright waits and rapidfuzz; narrow AI track to two models
- Dev plan: replace self-built contrast/name/label checks with axe-core, observation
  timing with Playwright load wait + fixed wait, name matching with rapidfuzz
- Keep only the timing model and issue score as trained models; prompt work becomes
  manual improvement; drop element ranking model, DSPy, MLflow and optional experiments
- Keep occluded elements in raw collection (R04 judged on raw), pull first end-to-end
  flow into S1
- Service plan: sync overview, success criteria, schedule and team AI tracks
- Folders: remove ml/prompt_opt and ml/element_rank, add worker/a11y and ml/results
</commit_message>
<xml_diff>
--- a/docs/StepMeter_개발계획서.docx
+++ b/docs/StepMeter_개발계획서.docx
@@ -889,7 +889,7 @@
         <w:rPr>
           <w:rFonts w:ascii="Malgun Gothic" w:cs="Malgun Gothic" w:eastAsia="Malgun Gothic" w:hAnsi="Malgun Gothic"/>
         </w:rPr>
-        <w:t xml:space="preserve"> 사람 데이터와 라벨로 학습한 모델은 소요 시간 예측, 이슈 점수, LLM에 넘길 요소 선택에만 쓴다. 원래 측정값은 항상 그대로 보여준다.</w:t>
+        <w:t xml:space="preserve"> 사람 데이터와 라벨로 학습한 모델은 소요 시간 예측, 이슈 점수에만 쓴다. 원래 측정값은 항상 그대로 보여준다.</w:t>
       </w:r>
     </w:p>
     <w:p>
@@ -1640,7 +1640,7 @@
                 <w:sz w:val="18"/>
                 <w:szCs w:val="18"/>
               </w:rPr>
-              <w:t xml:space="preserve">DOM에서 수집한 값으로 지표 계산 (순수 함수)</w:t>
+              <w:t xml:space="preserve">DOM에서 수집한 값으로 지표 계산 (순수 함수). 대비비·접근 가능한 이름·레이블은 axe-core 결과에 과업 경로 정보만 붙임</w:t>
             </w:r>
           </w:p>
         </w:tc>
@@ -1737,7 +1737,7 @@
                 <w:sz w:val="18"/>
                 <w:szCs w:val="18"/>
               </w:rPr>
-              <w:t xml:space="preserve">지표로 문제 후보를 찾고 심각도 부여, LLM에 설명 요청</w:t>
+              <w:t xml:space="preserve">지표와 axe-core 검사 결과로 문제 후보를 찾고 심각도 부여, LLM에 설명 요청</w:t>
             </w:r>
           </w:p>
         </w:tc>
@@ -3210,7 +3210,7 @@
                 <w:sz w:val="18"/>
                 <w:szCs w:val="18"/>
               </w:rPr>
-              <w:t xml:space="preserve">에이전트</w:t>
+              <w:t xml:space="preserve">접근성 검사</w:t>
             </w:r>
           </w:p>
         </w:tc>
@@ -3240,7 +3240,7 @@
                 <w:sz w:val="18"/>
                 <w:szCs w:val="18"/>
               </w:rPr>
-              <w:t xml:space="preserve">S1에 browser-use와 자체 루프 비교 후 결정 (3.1 참고)</w:t>
+              <w:t xml:space="preserve">axe-core (axe-playwright-python 또는 axe.min.js 주입)</w:t>
             </w:r>
           </w:p>
         </w:tc>
@@ -3270,7 +3270,7 @@
                 <w:sz w:val="18"/>
                 <w:szCs w:val="18"/>
               </w:rPr>
-              <w:t xml:space="preserve">측정 훅 삽입 가능 여부가 기준</w:t>
+              <w:t xml:space="preserve">대비비·접근 가능한 이름·레이블·타겟 크기를 검증된 규칙으로 검사 (직접 구현하지 않음)</w:t>
             </w:r>
           </w:p>
         </w:tc>
@@ -3307,7 +3307,7 @@
                 <w:sz w:val="18"/>
                 <w:szCs w:val="18"/>
               </w:rPr>
-              <w:t xml:space="preserve">LLM</w:t>
+              <w:t xml:space="preserve">요소 매칭</w:t>
             </w:r>
           </w:p>
         </w:tc>
@@ -3337,7 +3337,7 @@
                 <w:sz w:val="18"/>
                 <w:szCs w:val="18"/>
               </w:rPr>
-              <w:t xml:space="preserve">Claude API, Gemini API (교체 가능한 어댑터)</w:t>
+              <w:t xml:space="preserve">rapidfuzz (선택: sentence-transformers)</w:t>
             </w:r>
           </w:p>
         </w:tc>
@@ -3367,7 +3367,7 @@
                 <w:sz w:val="18"/>
                 <w:szCs w:val="18"/>
               </w:rPr>
-              <w:t xml:space="preserve">모델별 비용·성능 비교, 벤더 종속 회피</w:t>
+              <w:t xml:space="preserve">7.2 매칭 2단계 이름 텍스트 유사도. 4단계 의미 유사도는 선택(후순위)</w:t>
             </w:r>
           </w:p>
         </w:tc>
@@ -3404,7 +3404,7 @@
                 <w:sz w:val="18"/>
                 <w:szCs w:val="18"/>
               </w:rPr>
-              <w:t xml:space="preserve">DB</w:t>
+              <w:t xml:space="preserve">에이전트</w:t>
             </w:r>
           </w:p>
         </w:tc>
@@ -3434,7 +3434,7 @@
                 <w:sz w:val="18"/>
                 <w:szCs w:val="18"/>
               </w:rPr>
-              <w:t xml:space="preserve">PostgreSQL 16</w:t>
+              <w:t xml:space="preserve">S1에 browser-use와 자체 루프 비교 후 결정 (3.1 참고)</w:t>
             </w:r>
           </w:p>
         </w:tc>
@@ -3464,7 +3464,7 @@
                 <w:sz w:val="18"/>
                 <w:szCs w:val="18"/>
               </w:rPr>
-              <w:t xml:space="preserve">JSONB로 요소 스냅샷 저장</w:t>
+              <w:t xml:space="preserve">측정 훅 삽입 가능 여부가 기준</w:t>
             </w:r>
           </w:p>
         </w:tc>
@@ -3501,7 +3501,7 @@
                 <w:sz w:val="18"/>
                 <w:szCs w:val="18"/>
               </w:rPr>
-              <w:t xml:space="preserve">파일 저장</w:t>
+              <w:t xml:space="preserve">LLM</w:t>
             </w:r>
           </w:p>
         </w:tc>
@@ -3531,7 +3531,7 @@
                 <w:sz w:val="18"/>
                 <w:szCs w:val="18"/>
               </w:rPr>
-              <w:t xml:space="preserve">Cloudflare R2 (로컬 개발은 디스크)</w:t>
+              <w:t xml:space="preserve">Claude API, Gemini API (교체 가능한 어댑터)</w:t>
             </w:r>
           </w:p>
         </w:tc>
@@ -3561,7 +3561,7 @@
                 <w:sz w:val="18"/>
                 <w:szCs w:val="18"/>
               </w:rPr>
-              <w:t xml:space="preserve">S3 호환, 무료 구간 넉넉함</w:t>
+              <w:t xml:space="preserve">모델별 비용·성능 비교, 벤더 종속 회피</w:t>
             </w:r>
           </w:p>
         </w:tc>
@@ -3598,7 +3598,7 @@
                 <w:sz w:val="18"/>
                 <w:szCs w:val="18"/>
               </w:rPr>
-              <w:t xml:space="preserve">배포</w:t>
+              <w:t xml:space="preserve">DB</w:t>
             </w:r>
           </w:p>
         </w:tc>
@@ -3628,7 +3628,7 @@
                 <w:sz w:val="18"/>
                 <w:szCs w:val="18"/>
               </w:rPr>
-              <w:t xml:space="preserve">Railway (API · 워커 · Redis · DB), Vercel (프론트)</w:t>
+              <w:t xml:space="preserve">PostgreSQL 16</w:t>
             </w:r>
           </w:p>
         </w:tc>
@@ -3658,7 +3658,7 @@
                 <w:sz w:val="18"/>
                 <w:szCs w:val="18"/>
               </w:rPr>
-              <w:t xml:space="preserve">Docker 기반, 학생 예산에 맞음</w:t>
+              <w:t xml:space="preserve">JSONB로 요소 스냅샷 저장</w:t>
             </w:r>
           </w:p>
         </w:tc>
@@ -3695,7 +3695,7 @@
                 <w:sz w:val="18"/>
                 <w:szCs w:val="18"/>
               </w:rPr>
-              <w:t xml:space="preserve">모델 학습</w:t>
+              <w:t xml:space="preserve">파일 저장</w:t>
             </w:r>
           </w:p>
         </w:tc>
@@ -3725,7 +3725,7 @@
                 <w:sz w:val="18"/>
                 <w:szCs w:val="18"/>
               </w:rPr>
-              <w:t xml:space="preserve">scikit-learn, LightGBM, statsmodels</w:t>
+              <w:t xml:space="preserve">Cloudflare R2 (로컬 개발은 디스크)</w:t>
             </w:r>
           </w:p>
         </w:tc>
@@ -3755,7 +3755,7 @@
                 <w:sz w:val="18"/>
                 <w:szCs w:val="18"/>
               </w:rPr>
-              <w:t xml:space="preserve">적은 데이터에 맞는 회귀·분류 모델, 교차 검증</w:t>
+              <w:t xml:space="preserve">S3 호환, 무료 구간 넉넉함</w:t>
             </w:r>
           </w:p>
         </w:tc>
@@ -3792,7 +3792,7 @@
                 <w:sz w:val="18"/>
                 <w:szCs w:val="18"/>
               </w:rPr>
-              <w:t xml:space="preserve">프롬프트 최적화</w:t>
+              <w:t xml:space="preserve">배포</w:t>
             </w:r>
           </w:p>
         </w:tc>
@@ -3822,7 +3822,7 @@
                 <w:sz w:val="18"/>
                 <w:szCs w:val="18"/>
               </w:rPr>
-              <w:t xml:space="preserve">DSPy (안 맞으면 자체 탐색 스크립트)</w:t>
+              <w:t xml:space="preserve">Railway (API · 워커 · Redis · DB), Vercel (프론트)</w:t>
             </w:r>
           </w:p>
         </w:tc>
@@ -3852,7 +3852,7 @@
                 <w:sz w:val="18"/>
                 <w:szCs w:val="18"/>
               </w:rPr>
-              <w:t xml:space="preserve">벤치마크 점수를 목표로 프롬프트 자동 탐색</w:t>
+              <w:t xml:space="preserve">Docker 기반, 학생 예산에 맞음</w:t>
             </w:r>
           </w:p>
         </w:tc>
@@ -3889,7 +3889,7 @@
                 <w:sz w:val="18"/>
                 <w:szCs w:val="18"/>
               </w:rPr>
-              <w:t xml:space="preserve">실험 관리</w:t>
+              <w:t xml:space="preserve">모델 학습</w:t>
             </w:r>
           </w:p>
         </w:tc>
@@ -3919,7 +3919,7 @@
                 <w:sz w:val="18"/>
                 <w:szCs w:val="18"/>
               </w:rPr>
-              <w:t xml:space="preserve">MLflow</w:t>
+              <w:t xml:space="preserve">scikit-learn, statsmodels</w:t>
             </w:r>
           </w:p>
         </w:tc>
@@ -3949,201 +3949,7 @@
                 <w:sz w:val="18"/>
                 <w:szCs w:val="18"/>
               </w:rPr>
-              <w:t xml:space="preserve">학습 파라미터, 데이터 버전, 성능 기록</w:t>
-            </w:r>
-          </w:p>
-        </w:tc>
-      </w:tr>
-      <w:tr>
-        <w:trPr>
-          <w:tblHeader w:val="false"/>
-        </w:trPr>
-        <w:tc>
-          <w:tcPr>
-            <w:tcW w:type="dxa" w:w="1860"/>
-            <w:tcBorders>
-              <w:top w:val="none" w:color="FFFFFF" w:sz="0"/>
-              <w:left w:val="none" w:color="FFFFFF" w:sz="0"/>
-              <w:bottom w:val="single" w:color="D9D9D9" w:sz="2"/>
-              <w:right w:val="none" w:color="FFFFFF" w:sz="0"/>
-            </w:tcBorders>
-            <w:tcMar>
-              <w:top w:type="dxa" w:w="70"/>
-              <w:left w:type="dxa" w:w="110"/>
-              <w:bottom w:type="dxa" w:w="70"/>
-              <w:right w:type="dxa" w:w="110"/>
-            </w:tcMar>
-          </w:tcPr>
-          <w:p>
-            <w:pPr>
-              <w:spacing w:after="30" w:line="270"/>
-            </w:pPr>
-            <w:r>
-              <w:rPr>
-                <w:rFonts w:ascii="Malgun Gothic" w:cs="Malgun Gothic" w:eastAsia="Malgun Gothic" w:hAnsi="Malgun Gothic"/>
-                <w:b/>
-                <w:bCs/>
-                <w:sz w:val="18"/>
-                <w:szCs w:val="18"/>
-              </w:rPr>
-              <w:t xml:space="preserve">신경망 비교 실험 (선택)</w:t>
-            </w:r>
-          </w:p>
-        </w:tc>
-        <w:tc>
-          <w:tcPr>
-            <w:tcW w:type="dxa" w:w="3720"/>
-            <w:tcBorders>
-              <w:top w:val="none" w:color="FFFFFF" w:sz="0"/>
-              <w:left w:val="none" w:color="FFFFFF" w:sz="0"/>
-              <w:bottom w:val="single" w:color="D9D9D9" w:sz="2"/>
-              <w:right w:val="none" w:color="FFFFFF" w:sz="0"/>
-            </w:tcBorders>
-            <w:tcMar>
-              <w:top w:type="dxa" w:w="70"/>
-              <w:left w:type="dxa" w:w="110"/>
-              <w:bottom w:type="dxa" w:w="70"/>
-              <w:right w:type="dxa" w:w="110"/>
-            </w:tcMar>
-          </w:tcPr>
-          <w:p>
-            <w:pPr>
-              <w:spacing w:after="30" w:line="270"/>
-            </w:pPr>
-            <w:r>
-              <w:rPr>
-                <w:rFonts w:ascii="Malgun Gothic" w:cs="Malgun Gothic" w:eastAsia="Malgun Gothic" w:hAnsi="Malgun Gothic"/>
-                <w:sz w:val="18"/>
-                <w:szCs w:val="18"/>
-              </w:rPr>
-              <w:t xml:space="preserve">PyTorch, sentence-transformers, open_clip</w:t>
-            </w:r>
-          </w:p>
-        </w:tc>
-        <w:tc>
-          <w:tcPr>
-            <w:tcW w:type="dxa" w:w="4058"/>
-            <w:tcBorders>
-              <w:top w:val="none" w:color="FFFFFF" w:sz="0"/>
-              <w:left w:val="none" w:color="FFFFFF" w:sz="0"/>
-              <w:bottom w:val="single" w:color="D9D9D9" w:sz="2"/>
-              <w:right w:val="none" w:color="FFFFFF" w:sz="0"/>
-            </w:tcBorders>
-            <w:tcMar>
-              <w:top w:type="dxa" w:w="70"/>
-              <w:left w:type="dxa" w:w="110"/>
-              <w:bottom w:type="dxa" w:w="70"/>
-              <w:right w:type="dxa" w:w="110"/>
-            </w:tcMar>
-          </w:tcPr>
-          <w:p>
-            <w:pPr>
-              <w:spacing w:after="30" w:line="270"/>
-            </w:pPr>
-            <w:r>
-              <w:rPr>
-                <w:rFonts w:ascii="Malgun Gothic" w:cs="Malgun Gothic" w:eastAsia="Malgun Gothic" w:hAnsi="Malgun Gothic"/>
-                <w:sz w:val="18"/>
-                <w:szCs w:val="18"/>
-              </w:rPr>
-              <w:t xml:space="preserve">9.2·9.4 선택 실험</w:t>
-            </w:r>
-          </w:p>
-        </w:tc>
-      </w:tr>
-      <w:tr>
-        <w:trPr>
-          <w:tblHeader w:val="false"/>
-        </w:trPr>
-        <w:tc>
-          <w:tcPr>
-            <w:tcW w:type="dxa" w:w="1860"/>
-            <w:tcBorders>
-              <w:top w:val="none" w:color="FFFFFF" w:sz="0"/>
-              <w:left w:val="none" w:color="FFFFFF" w:sz="0"/>
-              <w:bottom w:val="single" w:color="D9D9D9" w:sz="2"/>
-              <w:right w:val="none" w:color="FFFFFF" w:sz="0"/>
-            </w:tcBorders>
-            <w:tcMar>
-              <w:top w:type="dxa" w:w="70"/>
-              <w:left w:type="dxa" w:w="110"/>
-              <w:bottom w:type="dxa" w:w="70"/>
-              <w:right w:type="dxa" w:w="110"/>
-            </w:tcMar>
-          </w:tcPr>
-          <w:p>
-            <w:pPr>
-              <w:spacing w:after="30" w:line="270"/>
-            </w:pPr>
-            <w:r>
-              <w:rPr>
-                <w:rFonts w:ascii="Malgun Gothic" w:cs="Malgun Gothic" w:eastAsia="Malgun Gothic" w:hAnsi="Malgun Gothic"/>
-                <w:b/>
-                <w:bCs/>
-                <w:sz w:val="18"/>
-                <w:szCs w:val="18"/>
-              </w:rPr>
-              <w:t xml:space="preserve">텍스트 임베딩</w:t>
-            </w:r>
-          </w:p>
-        </w:tc>
-        <w:tc>
-          <w:tcPr>
-            <w:tcW w:type="dxa" w:w="3720"/>
-            <w:tcBorders>
-              <w:top w:val="none" w:color="FFFFFF" w:sz="0"/>
-              <w:left w:val="none" w:color="FFFFFF" w:sz="0"/>
-              <w:bottom w:val="single" w:color="D9D9D9" w:sz="2"/>
-              <w:right w:val="none" w:color="FFFFFF" w:sz="0"/>
-            </w:tcBorders>
-            <w:tcMar>
-              <w:top w:type="dxa" w:w="70"/>
-              <w:left w:type="dxa" w:w="110"/>
-              <w:bottom w:type="dxa" w:w="70"/>
-              <w:right w:type="dxa" w:w="110"/>
-            </w:tcMar>
-          </w:tcPr>
-          <w:p>
-            <w:pPr>
-              <w:spacing w:after="30" w:line="270"/>
-            </w:pPr>
-            <w:r>
-              <w:rPr>
-                <w:rFonts w:ascii="Malgun Gothic" w:cs="Malgun Gothic" w:eastAsia="Malgun Gothic" w:hAnsi="Malgun Gothic"/>
-                <w:sz w:val="18"/>
-                <w:szCs w:val="18"/>
-              </w:rPr>
-              <w:t xml:space="preserve">다국어 소형 문장 임베딩 (sentence-transformers)</w:t>
-            </w:r>
-          </w:p>
-        </w:tc>
-        <w:tc>
-          <w:tcPr>
-            <w:tcW w:type="dxa" w:w="4058"/>
-            <w:tcBorders>
-              <w:top w:val="none" w:color="FFFFFF" w:sz="0"/>
-              <w:left w:val="none" w:color="FFFFFF" w:sz="0"/>
-              <w:bottom w:val="single" w:color="D9D9D9" w:sz="2"/>
-              <w:right w:val="none" w:color="FFFFFF" w:sz="0"/>
-            </w:tcBorders>
-            <w:tcMar>
-              <w:top w:type="dxa" w:w="70"/>
-              <w:left w:type="dxa" w:w="110"/>
-              <w:bottom w:type="dxa" w:w="70"/>
-              <w:right w:type="dxa" w:w="110"/>
-            </w:tcMar>
-          </w:tcPr>
-          <w:p>
-            <w:pPr>
-              <w:spacing w:after="30" w:line="270"/>
-            </w:pPr>
-            <w:r>
-              <w:rPr>
-                <w:rFonts w:ascii="Malgun Gothic" w:cs="Malgun Gothic" w:eastAsia="Malgun Gothic" w:hAnsi="Malgun Gothic"/>
-                <w:sz w:val="18"/>
-                <w:szCs w:val="18"/>
-              </w:rPr>
-              <w:t xml:space="preserve">요소 순위 모델의 과업–요소 텍스트 유사도, CPU로 충분</w:t>
+              <w:t xml:space="preserve">적은 데이터에 맞는 회귀·분류 모델, 교차 검증</w:t>
             </w:r>
           </w:p>
         </w:tc>
@@ -5225,7 +5031,7 @@
         <w:rPr>
           <w:rFonts w:ascii="Malgun Gothic" w:cs="Malgun Gothic" w:eastAsia="Malgun Gothic" w:hAnsi="Malgun Gothic"/>
         </w:rPr>
-        <w:t xml:space="preserve"> 크기 0, display:none, visibility:hidden, opacity 0, 뷰포트 밖 요소는 제외한다. 요소 중심점을 찍었을 때(elementFromPoint) 다른 요소가 잡히면 투명 막이나 고정 헤더에 가려진 것으로 보고 제외한다. 남은 요소는 모두 LLM에 넘긴다. 요소 후보 순위 모델(9.4)의 온라인 적용이 결정되면, 30개가 넘을 때 상위 30개만 넘긴다.</w:t>
+        <w:t xml:space="preserve"> 크기 0, display:none, visibility:hidden, opacity 0, 뷰포트 밖 요소는 제외한다. 요소 중심점을 찍었을 때(elementFromPoint) 다른 요소가 잡히면 투명 막이나 고정 헤더에 가려진 것으로 표시한다. 가려진 요소는 수집 단계에서 버리지 않고 수집 원본에 모두 남기며, LLM에 보내는 목록에서만 뺀다. R04(가림)는 수집 원본 기준으로 판정한다. 남은 요소는 모두 LLM에 넘긴다. 요소가 30개를 넘으면 단순 규칙(뷰포트 안 요소 우선)으로 30개까지만 넘기고, 비용은 소형 모델로 줄인다.</w:t>
       </w:r>
     </w:p>
     <w:p>
@@ -5297,55 +5103,7 @@
         <w:rPr>
           <w:rFonts w:ascii="Malgun Gothic" w:cs="Malgun Gothic" w:eastAsia="Malgun Gothic" w:hAnsi="Malgun Gothic"/>
         </w:rPr>
-        <w:t xml:space="preserve"> 요즘 웹은 네트워크 통신 없이도 JS 애니메이션이나 내부 연산만으로 화면이 바뀐다. 그래서 행동 뒤 아래 세 조건을 모두 만족하거나 5초가 지나면 관찰한다.</w:t>
-      </w:r>
-    </w:p>
-    <w:p>
-      <w:pPr>
-        <w:pStyle w:val="ListParagraph"/>
-        <w:numPr>
-          <w:ilvl w:val="1"/>
-          <w:numId w:val="4"/>
-        </w:numPr>
-        <w:spacing w:after="60" w:line="290"/>
-      </w:pPr>
-      <w:r>
-        <w:rPr>
-          <w:rFonts w:ascii="Malgun Gothic" w:cs="Malgun Gothic" w:eastAsia="Malgun Gothic" w:hAnsi="Malgun Gothic"/>
-        </w:rPr>
-        <w:t xml:space="preserve">네트워크 요청이 500ms 동안 없음</w:t>
-      </w:r>
-    </w:p>
-    <w:p>
-      <w:pPr>
-        <w:pStyle w:val="ListParagraph"/>
-        <w:numPr>
-          <w:ilvl w:val="1"/>
-          <w:numId w:val="4"/>
-        </w:numPr>
-        <w:spacing w:after="60" w:line="290"/>
-      </w:pPr>
-      <w:r>
-        <w:rPr>
-          <w:rFonts w:ascii="Malgun Gothic" w:cs="Malgun Gothic" w:eastAsia="Malgun Gothic" w:hAnsi="Malgun Gothic"/>
-        </w:rPr>
-        <w:t xml:space="preserve">MutationObserver 기준 DOM 변경이 300ms 동안 없음</w:t>
-      </w:r>
-    </w:p>
-    <w:p>
-      <w:pPr>
-        <w:pStyle w:val="ListParagraph"/>
-        <w:numPr>
-          <w:ilvl w:val="1"/>
-          <w:numId w:val="4"/>
-        </w:numPr>
-        <w:spacing w:after="60" w:line="290"/>
-      </w:pPr>
-      <w:r>
-        <w:rPr>
-          <w:rFonts w:ascii="Malgun Gothic" w:cs="Malgun Gothic" w:eastAsia="Malgun Gothic" w:hAnsi="Malgun Gothic"/>
-        </w:rPr>
-        <w:t xml:space="preserve">진행 중인 CSS 애니메이션·트랜지션 없음 (document.getAnimations()). 반복 횟수가 무한인 애니메이션(로딩 스피너, 자동 넘김 캐러셀)은 영원히 끝나지 않으므로 이 조건에서 제외한다</w:t>
+        <w:t xml:space="preserve"> 행동 뒤 Playwright의 load 상태 대기(wait_for_load_state)가 끝나면 짧게 고정 대기(약 500ms)한 뒤 관찰한다. 전체 대기는 최대 5초로 제한한다. 무반응 클릭 감지(5.1)는 이와 별도로 그대로 동작한다.</w:t>
       </w:r>
     </w:p>
     <w:p>
@@ -7160,7 +6918,7 @@
         <w:rPr>
           <w:rFonts w:ascii="Malgun Gothic" w:cs="Malgun Gothic" w:eastAsia="Malgun Gothic" w:hAnsi="Malgun Gothic"/>
         </w:rPr>
-        <w:t xml:space="preserve">행동 직후에는 최대 3초 동안 URL 변화, DOM 변경 수(MutationObserver), 네트워크 요청 발생을 확인한다. 셋 다 없으면 무반응 클릭으로 기록한다. 첫 화면 목록과 스냅샷은 4.2의 관찰 시점 규칙(네트워크가 잠잠해진 뒤)을 따른다.</w:t>
+        <w:t xml:space="preserve">행동 직후에는 최대 3초 동안 URL 변화, DOM 변경 수(MutationObserver), 네트워크 요청 발생을 확인한다. 셋 다 없으면 무반응 클릭으로 기록한다. 첫 화면 목록과 스냅샷은 4.2의 관찰 시점 규칙(load 상태 대기 + 짧은 고정 대기)을 따른다.</w:t>
       </w:r>
     </w:p>
     <w:p>
@@ -7492,7 +7250,7 @@
         <w:rPr>
           <w:rFonts w:ascii="Malgun Gothic" w:cs="Malgun Gothic" w:eastAsia="Malgun Gothic" w:hAnsi="Malgun Gothic"/>
         </w:rPr>
-        <w:t xml:space="preserve">WCAG 2.2 기준을 따른다.</w:t>
+        <w:t xml:space="preserve">WCAG 2.2 기준을 따른다. axe-core의 target-size 규칙 결과를 먼저 쓰고, 우리 코드는 결과에 과업 경로 위 요소인지, 몇 번째 단계인지만 붙인다. 규칙이 없거나 아래 기준(간격 예외, 44px 안내, 모바일 등급)을 다 다루지 못하면 아래 계산을 유지한다.</w:t>
       </w:r>
     </w:p>
     <w:p>
@@ -7578,25 +7336,7 @@
         <w:rPr>
           <w:rFonts w:ascii="Malgun Gothic" w:cs="Malgun Gothic" w:eastAsia="Malgun Gothic" w:hAnsi="Malgun Gothic"/>
         </w:rPr>
-        <w:t xml:space="preserve">WCAG 상대 휘도 공식으로 계산한다.</w:t>
-      </w:r>
-    </w:p>
-    <w:p>
-      <w:pPr>
-        <w:keepNext/>
-        <w:keepLines/>
-        <w:shd w:fill="F5F5F5" w:color="auto" w:val="clear"/>
-        <w:spacing w:after="0" w:before="60" w:line="260"/>
-        <w:ind w:left="200" w:right="200"/>
-      </w:pPr>
-      <w:r>
-        <w:rPr>
-          <w:rFonts w:ascii="Consolas" w:eastAsia="Malgun Gothic" w:hAnsi="Consolas"/>
-          <w:color w:val="1A1A1A"/>
-          <w:sz w:val="18"/>
-          <w:szCs w:val="18"/>
-        </w:rPr>
-        <w:t xml:space="preserve">c = channel / 255</w:t>
+        <w:t xml:space="preserve">직접 계산하지 않고 axe-core의 color-contrast 규칙 결과를 쓴다(axe-playwright-python 또는 axe.min.js 주입). 우리 코드는 axe가 찾은 요소에 과업 경로 위 요소인지, 몇 번째 단계인지만 붙인다. 판정 기준은 WCAG AA와 같다.</w:t>
       </w:r>
     </w:p>
     <w:p>
@@ -7614,7 +7354,7 @@
           <w:sz w:val="18"/>
           <w:szCs w:val="18"/>
         </w:rPr>
-        <w:t xml:space="preserve">c_lin = c / 12.92                      if c &lt;= 0.04045</w:t>
+        <w:t xml:space="preserve"> </w:t>
       </w:r>
     </w:p>
     <w:p>
@@ -7632,78 +7372,6 @@
           <w:sz w:val="18"/>
           <w:szCs w:val="18"/>
         </w:rPr>
-        <w:t xml:space="preserve">      = ((c + 0.055) / 1.055) ^ 2.4    otherwise</w:t>
-      </w:r>
-    </w:p>
-    <w:p>
-      <w:pPr>
-        <w:keepNext/>
-        <w:keepLines/>
-        <w:shd w:fill="F5F5F5" w:color="auto" w:val="clear"/>
-        <w:spacing w:after="0" w:before="0" w:line="260"/>
-        <w:ind w:left="200" w:right="200"/>
-      </w:pPr>
-      <w:r>
-        <w:rPr>
-          <w:rFonts w:ascii="Consolas" w:eastAsia="Malgun Gothic" w:hAnsi="Consolas"/>
-          <w:color w:val="1A1A1A"/>
-          <w:sz w:val="18"/>
-          <w:szCs w:val="18"/>
-        </w:rPr>
-        <w:t xml:space="preserve">L = 0.2126·R_lin + 0.7152·G_lin + 0.0722·B_lin</w:t>
-      </w:r>
-    </w:p>
-    <w:p>
-      <w:pPr>
-        <w:keepNext/>
-        <w:keepLines/>
-        <w:shd w:fill="F5F5F5" w:color="auto" w:val="clear"/>
-        <w:spacing w:after="0" w:before="0" w:line="260"/>
-        <w:ind w:left="200" w:right="200"/>
-      </w:pPr>
-      <w:r>
-        <w:rPr>
-          <w:rFonts w:ascii="Consolas" w:eastAsia="Malgun Gothic" w:hAnsi="Consolas"/>
-          <w:color w:val="1A1A1A"/>
-          <w:sz w:val="18"/>
-          <w:szCs w:val="18"/>
-        </w:rPr>
-        <w:t xml:space="preserve"> </w:t>
-      </w:r>
-    </w:p>
-    <w:p>
-      <w:pPr>
-        <w:keepNext/>
-        <w:keepLines/>
-        <w:shd w:fill="F5F5F5" w:color="auto" w:val="clear"/>
-        <w:spacing w:after="0" w:before="0" w:line="260"/>
-        <w:ind w:left="200" w:right="200"/>
-      </w:pPr>
-      <w:r>
-        <w:rPr>
-          <w:rFonts w:ascii="Consolas" w:eastAsia="Malgun Gothic" w:hAnsi="Consolas"/>
-          <w:color w:val="1A1A1A"/>
-          <w:sz w:val="18"/>
-          <w:szCs w:val="18"/>
-        </w:rPr>
-        <w:t xml:space="preserve">ratio = (L_light + 0.05) / (L_dark + 0.05)</w:t>
-      </w:r>
-    </w:p>
-    <w:p>
-      <w:pPr>
-        <w:keepNext/>
-        <w:keepLines/>
-        <w:shd w:fill="F5F5F5" w:color="auto" w:val="clear"/>
-        <w:spacing w:after="0" w:before="0" w:line="260"/>
-        <w:ind w:left="200" w:right="200"/>
-      </w:pPr>
-      <w:r>
-        <w:rPr>
-          <w:rFonts w:ascii="Consolas" w:eastAsia="Malgun Gothic" w:hAnsi="Consolas"/>
-          <w:color w:val="1A1A1A"/>
-          <w:sz w:val="18"/>
-          <w:szCs w:val="18"/>
-        </w:rPr>
         <w:t xml:space="preserve"> </w:t>
       </w:r>
     </w:p>
@@ -7738,7 +7406,7 @@
         <w:rPr>
           <w:rFonts w:ascii="Malgun Gothic" w:cs="Malgun Gothic" w:eastAsia="Malgun Gothic" w:hAnsi="Malgun Gothic"/>
         </w:rPr>
-        <w:t xml:space="preserve">배경색 결정</w:t>
+        <w:t xml:space="preserve">axe가 판정하지 못한 경우</w:t>
       </w:r>
     </w:p>
     <w:p>
@@ -7754,39 +7422,7 @@
         <w:rPr>
           <w:rFonts w:ascii="Malgun Gothic" w:cs="Malgun Gothic" w:eastAsia="Malgun Gothic" w:hAnsi="Malgun Gothic"/>
         </w:rPr>
-        <w:t xml:space="preserve">대상 요소부터 부모로 올라가며 background-color의 알파가 0보다 큰 첫 요소를 찾는다.</w:t>
-      </w:r>
-    </w:p>
-    <w:p>
-      <w:pPr>
-        <w:pStyle w:val="ListParagraph"/>
-        <w:numPr>
-          <w:ilvl w:val="0"/>
-          <w:numId w:val="5"/>
-        </w:numPr>
-        <w:spacing w:after="60" w:line="290"/>
-      </w:pPr>
-      <w:r>
-        <w:rPr>
-          <w:rFonts w:ascii="Malgun Gothic" w:cs="Malgun Gothic" w:eastAsia="Malgun Gothic" w:hAnsi="Malgun Gothic"/>
-        </w:rPr>
-        <w:t xml:space="preserve">중간에 반투명 레이어가 있으면 알파 합성으로 실제 배경색을 계산한다. 글자색의 알파와 요소 opacity도 합성한다.</w:t>
-      </w:r>
-    </w:p>
-    <w:p>
-      <w:pPr>
-        <w:pStyle w:val="ListParagraph"/>
-        <w:numPr>
-          <w:ilvl w:val="0"/>
-          <w:numId w:val="5"/>
-        </w:numPr>
-        <w:spacing w:after="60" w:line="290"/>
-      </w:pPr>
-      <w:r>
-        <w:rPr>
-          <w:rFonts w:ascii="Malgun Gothic" w:cs="Malgun Gothic" w:eastAsia="Malgun Gothic" w:hAnsi="Malgun Gothic"/>
-        </w:rPr>
-        <w:t xml:space="preserve">도중에 background-image나 그라디언트를 만나면 DOM 값으로 판정하지 않는다. 스크린샷에서 텍스트 영역 픽셀을 샘플링해 두 개의 대표색(k-means, k=2)으로 대비를 계산하고 "추정"으로 표시한다.</w:t>
+        <w:t xml:space="preserve">배경 이미지나 그라디언트 위 텍스트처럼 axe가 판정 보류(incomplete)로 돌려준 요소는 스크린샷에서 텍스트 영역 픽셀을 샘플링해 두 개의 대표색(k-means, k=2)으로 대비를 계산하고 "추정"으로 표시한다.</w:t>
       </w:r>
     </w:p>
     <w:p>
@@ -10346,7 +9982,7 @@
                 <w:sz w:val="18"/>
                 <w:szCs w:val="18"/>
               </w:rPr>
-              <w:t xml:space="preserve">5.5 기준 미달 (과업 경로)</w:t>
+              <w:t xml:space="preserve">axe-core color-contrast 위반 중 과업 경로 위 요소 (5.5)</w:t>
             </w:r>
           </w:p>
         </w:tc>
@@ -11362,7 +10998,7 @@
                 <w:sz w:val="18"/>
                 <w:szCs w:val="18"/>
               </w:rPr>
-              <w:t xml:space="preserve">과업 경로의 버튼·링크에 접근 가능한 이름이 없음 (아이콘만 있는 버튼 등)</w:t>
+              <w:t xml:space="preserve">axe-core 이름·레이블 규칙(button-name, link-name, label 등) 위반 중 과업 경로 위 요소 (아이콘만 있는 버튼 등)</w:t>
             </w:r>
           </w:p>
         </w:tc>
@@ -12361,7 +11997,7 @@
                 <w:sz w:val="18"/>
                 <w:szCs w:val="18"/>
               </w:rPr>
-              <w:t xml:space="preserve">이름 텍스트 유사도 0.8 이상 (공백·대소문자 정규화)</w:t>
+              <w:t xml:space="preserve">이름 텍스트 유사도 0.8 이상 (공백·대소문자 정규화, rapidfuzz로 계산)</w:t>
             </w:r>
           </w:p>
         </w:tc>
@@ -12553,7 +12189,7 @@
                 <w:sz w:val="18"/>
                 <w:szCs w:val="18"/>
               </w:rPr>
-              <w:t xml:space="preserve">의미 유사도 0.9 이상 (9.4의 다국어 텍스트 임베딩)</w:t>
+              <w:t xml:space="preserve">선택(후순위): 의미 유사도 0.9 이상 (sentence-transformers 다국어 텍스트 임베딩)</w:t>
             </w:r>
           </w:p>
         </w:tc>
@@ -14546,7 +14182,7 @@
         <w:rPr>
           <w:rFonts w:ascii="Malgun Gothic" w:cs="Malgun Gothic" w:eastAsia="Malgun Gothic" w:hAnsi="Malgun Gothic"/>
         </w:rPr>
-        <w:t xml:space="preserve">같은 과업 경로의 스크린샷을 상용 LLM에 주고 "UX 문제를 찾아라"라고 요청한 결과를 같은 정답으로 채점한다. 담당은 LLM·프롬프트. S1에 먼저 한 번 돌려서 이겨야 할 수준을 확인하고, S4와 S6에 다시 비교한다.</w:t>
+        <w:t xml:space="preserve">같은 과업 경로의 스크린샷을 상용 LLM에 주고 "UX 문제를 찾아라"라고 요청한 결과와, 같은 경로에서 axe-core만 실행한 결과를 같은 정답으로 채점한다. 담당은 LLM·프롬프트. S1에 먼저 한 번 돌려서 이겨야 할 수준을 확인하고, S4와 S6에 다시 비교한다.</w:t>
       </w:r>
     </w:p>
     <w:p>
@@ -14568,7 +14204,7 @@
         <w:rPr>
           <w:rFonts w:ascii="Malgun Gothic" w:cs="Malgun Gothic" w:eastAsia="Malgun Gothic" w:hAnsi="Malgun Gothic"/>
         </w:rPr>
-        <w:t xml:space="preserve">에이전트의 판단은 상용 LLM을 그대로 쓴다. 상용 모델을 학기 안에 이기는 것은 목표가 아니다. 대신 측정 결과를 더 믿을 수 있게 만드는 모델을 팀이 직접 학습·튜닝한다.</w:t>
+        <w:t xml:space="preserve">에이전트의 판단은 상용 LLM을 그대로 쓴다. 상용 모델을 학기 안에 이기는 것은 목표가 아니다. 대신 측정 결과를 더 믿을 수 있게 만드는 모델 2개(소요 시간, 이슈 점수)만 팀이 직접 학습·튜닝하고, 프롬프트는 실패 사례를 보고 사람이 고친다.</w:t>
       </w:r>
     </w:p>
     <w:tbl>
@@ -15290,7 +14926,7 @@
                 <w:sz w:val="18"/>
                 <w:szCs w:val="18"/>
               </w:rPr>
-              <w:t xml:space="preserve">9.3 프롬프트 최적화</w:t>
+              <w:t xml:space="preserve">9.3 프롬프트 개선</w:t>
             </w:r>
           </w:p>
         </w:tc>
@@ -15350,7 +14986,7 @@
                 <w:sz w:val="18"/>
                 <w:szCs w:val="18"/>
               </w:rPr>
-              <w:t xml:space="preserve">벤치마크 학습 세트</w:t>
+              <w:t xml:space="preserve">벤치마크 학습 세트의 실패 사례</w:t>
             </w:r>
           </w:p>
         </w:tc>
@@ -15380,7 +15016,7 @@
                 <w:sz w:val="18"/>
                 <w:szCs w:val="18"/>
               </w:rPr>
-              <w:t xml:space="preserve">DSPy 또는 자체 탐색</w:t>
+              <w:t xml:space="preserve">상용 LLM 그대로, 실패 사례를 보고 수동 수정</w:t>
             </w:r>
           </w:p>
         </w:tc>
@@ -15410,7 +15046,7 @@
                 <w:sz w:val="18"/>
                 <w:szCs w:val="18"/>
               </w:rPr>
-              <w:t xml:space="preserve">테스트 세트 완주율 향상</w:t>
+              <w:t xml:space="preserve">프롬프트 버전별 테스트 세트 완주율 비교</w:t>
             </w:r>
           </w:p>
         </w:tc>
@@ -15472,224 +15108,6 @@
                 <w:szCs w:val="18"/>
               </w:rPr>
               <w:t xml:space="preserve">P0</w:t>
-            </w:r>
-          </w:p>
-        </w:tc>
-      </w:tr>
-      <w:tr>
-        <w:trPr>
-          <w:tblHeader w:val="false"/>
-        </w:trPr>
-        <w:tc>
-          <w:tcPr>
-            <w:tcW w:type="dxa" w:w="1483"/>
-            <w:tcBorders>
-              <w:top w:val="none" w:color="FFFFFF" w:sz="0"/>
-              <w:left w:val="none" w:color="FFFFFF" w:sz="0"/>
-              <w:bottom w:val="single" w:color="000000" w:sz="10"/>
-              <w:right w:val="none" w:color="FFFFFF" w:sz="0"/>
-            </w:tcBorders>
-            <w:tcMar>
-              <w:top w:type="dxa" w:w="70"/>
-              <w:left w:type="dxa" w:w="110"/>
-              <w:bottom w:type="dxa" w:w="70"/>
-              <w:right w:type="dxa" w:w="110"/>
-            </w:tcMar>
-          </w:tcPr>
-          <w:p>
-            <w:pPr>
-              <w:spacing w:after="30" w:line="270"/>
-            </w:pPr>
-            <w:r>
-              <w:rPr>
-                <w:rFonts w:ascii="Malgun Gothic" w:cs="Malgun Gothic" w:eastAsia="Malgun Gothic" w:hAnsi="Malgun Gothic"/>
-                <w:b/>
-                <w:bCs/>
-                <w:sz w:val="18"/>
-                <w:szCs w:val="18"/>
-              </w:rPr>
-              <w:t xml:space="preserve">9.4 요소 후보 순위 모델</w:t>
-            </w:r>
-          </w:p>
-        </w:tc>
-        <w:tc>
-          <w:tcPr>
-            <w:tcW w:type="dxa" w:w="1415"/>
-            <w:tcBorders>
-              <w:top w:val="none" w:color="FFFFFF" w:sz="0"/>
-              <w:left w:val="none" w:color="FFFFFF" w:sz="0"/>
-              <w:bottom w:val="single" w:color="000000" w:sz="10"/>
-              <w:right w:val="none" w:color="FFFFFF" w:sz="0"/>
-            </w:tcBorders>
-            <w:tcMar>
-              <w:top w:type="dxa" w:w="70"/>
-              <w:left w:type="dxa" w:w="110"/>
-              <w:bottom w:type="dxa" w:w="70"/>
-              <w:right w:type="dxa" w:w="110"/>
-            </w:tcMar>
-          </w:tcPr>
-          <w:p>
-            <w:pPr>
-              <w:spacing w:after="30" w:line="270"/>
-            </w:pPr>
-            <w:r>
-              <w:rPr>
-                <w:rFonts w:ascii="Malgun Gothic" w:cs="Malgun Gothic" w:eastAsia="Malgun Gothic" w:hAnsi="Malgun Gothic"/>
-                <w:sz w:val="18"/>
-                <w:szCs w:val="18"/>
-              </w:rPr>
-              <w:t xml:space="preserve">LLM 입력 토큰 절감</w:t>
-            </w:r>
-          </w:p>
-        </w:tc>
-        <w:tc>
-          <w:tcPr>
-            <w:tcW w:type="dxa" w:w="1685"/>
-            <w:tcBorders>
-              <w:top w:val="none" w:color="FFFFFF" w:sz="0"/>
-              <w:left w:val="none" w:color="FFFFFF" w:sz="0"/>
-              <w:bottom w:val="single" w:color="000000" w:sz="10"/>
-              <w:right w:val="none" w:color="FFFFFF" w:sz="0"/>
-            </w:tcBorders>
-            <w:tcMar>
-              <w:top w:type="dxa" w:w="70"/>
-              <w:left w:type="dxa" w:w="110"/>
-              <w:bottom w:type="dxa" w:w="70"/>
-              <w:right w:type="dxa" w:w="110"/>
-            </w:tcMar>
-          </w:tcPr>
-          <w:p>
-            <w:pPr>
-              <w:spacing w:after="30" w:line="270"/>
-            </w:pPr>
-            <w:r>
-              <w:rPr>
-                <w:rFonts w:ascii="Malgun Gothic" w:cs="Malgun Gothic" w:eastAsia="Malgun Gothic" w:hAnsi="Malgun Gothic"/>
-                <w:sz w:val="18"/>
-                <w:szCs w:val="18"/>
-              </w:rPr>
-              <w:t xml:space="preserve">에이전트 실행 로그 (단계별 요소 목록 + 실제 클릭)</w:t>
-            </w:r>
-          </w:p>
-        </w:tc>
-        <w:tc>
-          <w:tcPr>
-            <w:tcW w:type="dxa" w:w="1348"/>
-            <w:tcBorders>
-              <w:top w:val="none" w:color="FFFFFF" w:sz="0"/>
-              <w:left w:val="none" w:color="FFFFFF" w:sz="0"/>
-              <w:bottom w:val="single" w:color="000000" w:sz="10"/>
-              <w:right w:val="none" w:color="FFFFFF" w:sz="0"/>
-            </w:tcBorders>
-            <w:tcMar>
-              <w:top w:type="dxa" w:w="70"/>
-              <w:left w:type="dxa" w:w="110"/>
-              <w:bottom w:type="dxa" w:w="70"/>
-              <w:right w:type="dxa" w:w="110"/>
-            </w:tcMar>
-          </w:tcPr>
-          <w:p>
-            <w:pPr>
-              <w:spacing w:after="30" w:line="270"/>
-            </w:pPr>
-            <w:r>
-              <w:rPr>
-                <w:rFonts w:ascii="Malgun Gothic" w:cs="Malgun Gothic" w:eastAsia="Malgun Gothic" w:hAnsi="Malgun Gothic"/>
-                <w:sz w:val="18"/>
-                <w:szCs w:val="18"/>
-              </w:rPr>
-              <w:t xml:space="preserve">LightGBM 순위 학습</w:t>
-            </w:r>
-          </w:p>
-        </w:tc>
-        <w:tc>
-          <w:tcPr>
-            <w:tcW w:type="dxa" w:w="1415"/>
-            <w:tcBorders>
-              <w:top w:val="none" w:color="FFFFFF" w:sz="0"/>
-              <w:left w:val="none" w:color="FFFFFF" w:sz="0"/>
-              <w:bottom w:val="single" w:color="000000" w:sz="10"/>
-              <w:right w:val="none" w:color="FFFFFF" w:sz="0"/>
-            </w:tcBorders>
-            <w:tcMar>
-              <w:top w:type="dxa" w:w="70"/>
-              <w:left w:type="dxa" w:w="110"/>
-              <w:bottom w:type="dxa" w:w="70"/>
-              <w:right w:type="dxa" w:w="110"/>
-            </w:tcMar>
-          </w:tcPr>
-          <w:p>
-            <w:pPr>
-              <w:spacing w:after="30" w:line="270"/>
-            </w:pPr>
-            <w:r>
-              <w:rPr>
-                <w:rFonts w:ascii="Malgun Gothic" w:cs="Malgun Gothic" w:eastAsia="Malgun Gothic" w:hAnsi="Malgun Gothic"/>
-                <w:sz w:val="18"/>
-                <w:szCs w:val="18"/>
-              </w:rPr>
-              <w:t xml:space="preserve">Recall@30 ≥ 95%, 완주율 −2%p 이내</w:t>
-            </w:r>
-          </w:p>
-        </w:tc>
-        <w:tc>
-          <w:tcPr>
-            <w:tcW w:type="dxa" w:w="1281"/>
-            <w:tcBorders>
-              <w:top w:val="none" w:color="FFFFFF" w:sz="0"/>
-              <w:left w:val="none" w:color="FFFFFF" w:sz="0"/>
-              <w:bottom w:val="single" w:color="000000" w:sz="10"/>
-              <w:right w:val="none" w:color="FFFFFF" w:sz="0"/>
-            </w:tcBorders>
-            <w:tcMar>
-              <w:top w:type="dxa" w:w="70"/>
-              <w:left w:type="dxa" w:w="110"/>
-              <w:bottom w:type="dxa" w:w="70"/>
-              <w:right w:type="dxa" w:w="110"/>
-            </w:tcMar>
-          </w:tcPr>
-          <w:p>
-            <w:pPr>
-              <w:spacing w:after="30" w:line="270"/>
-            </w:pPr>
-            <w:r>
-              <w:rPr>
-                <w:rFonts w:ascii="Malgun Gothic" w:cs="Malgun Gothic" w:eastAsia="Malgun Gothic" w:hAnsi="Malgun Gothic"/>
-                <w:sz w:val="18"/>
-                <w:szCs w:val="18"/>
-              </w:rPr>
-              <w:t xml:space="preserve">플랫폼 백엔드</w:t>
-            </w:r>
-          </w:p>
-        </w:tc>
-        <w:tc>
-          <w:tcPr>
-            <w:tcW w:type="dxa" w:w="1011"/>
-            <w:tcBorders>
-              <w:top w:val="none" w:color="FFFFFF" w:sz="0"/>
-              <w:left w:val="none" w:color="FFFFFF" w:sz="0"/>
-              <w:bottom w:val="single" w:color="000000" w:sz="10"/>
-              <w:right w:val="none" w:color="FFFFFF" w:sz="0"/>
-            </w:tcBorders>
-            <w:tcMar>
-              <w:top w:type="dxa" w:w="70"/>
-              <w:left w:type="dxa" w:w="110"/>
-              <w:bottom w:type="dxa" w:w="70"/>
-              <w:right w:type="dxa" w:w="110"/>
-            </w:tcMar>
-          </w:tcPr>
-          <w:p>
-            <w:pPr>
-              <w:spacing w:after="30" w:line="270"/>
-              <w:jc w:val="center"/>
-            </w:pPr>
-            <w:r>
-              <w:rPr>
-                <w:rFonts w:ascii="Malgun Gothic" w:cs="Malgun Gothic" w:eastAsia="Malgun Gothic" w:hAnsi="Malgun Gothic"/>
-                <w:sz w:val="18"/>
-                <w:szCs w:val="18"/>
-              </w:rPr>
-              <w:t xml:space="preserve">P0 오프라인 · 적용 조건부</w:t>
             </w:r>
           </w:p>
         </w:tc>
@@ -15708,7 +15126,7 @@
         <w:rPr>
           <w:rFonts w:ascii="Malgun Gothic" w:cs="Malgun Gothic" w:eastAsia="Malgun Gothic" w:hAnsi="Malgun Gothic"/>
         </w:rPr>
-        <w:t xml:space="preserve">9.2와 9.4에는 신경망 모델과 비교하는 선택 실험을 붙였다. P0 일정에 여유가 있을 때만 진행하고, 결과가 좋지 않아도 실험 리포트로 남긴다.</w:t>
+        <w:t xml:space="preserve">직접 학습하는 모델은 9.1과 9.2 두 개다. 신경망·시각 특징 비교 같은 선택 실험은 하지 않는다.</w:t>
       </w:r>
     </w:p>
     <w:p>
@@ -16760,7 +16178,7 @@
         <w:rPr>
           <w:rFonts w:ascii="Malgun Gothic" w:cs="Malgun Gothic" w:eastAsia="Malgun Gothic" w:hAnsi="Malgun Gothic"/>
         </w:rPr>
-        <w:t xml:space="preserve"> ① 규칙만 ② 휴리스틱 점수 ③ 로지스틱 회귀(L2 정규화) ④ 로지스틱 + 시각 특징(선택 실험). LightGBM은 라벨이 충분할 때 참고로만 돌린다.</w:t>
+        <w:t xml:space="preserve"> ① 규칙만 ② 휴리스틱 점수 ③ 로지스틱 회귀(L2 정규화). 비교는 휴리스틱 점수와 로지스틱 회귀까지만 한다.</w:t>
       </w:r>
     </w:p>
     <w:p>
@@ -16813,13 +16231,13 @@
     </w:p>
     <w:p>
       <w:pPr>
-        <w:pStyle w:val="Heading3"/>
-      </w:pPr>
-      <w:r>
-        <w:rPr>
-          <w:rFonts w:ascii="Malgun Gothic" w:cs="Malgun Gothic" w:eastAsia="Malgun Gothic" w:hAnsi="Malgun Gothic"/>
-        </w:rPr>
-        <w:t xml:space="preserve">선택 실험: 시각 특징 추가</w:t>
+        <w:pStyle w:val="Heading2"/>
+      </w:pPr>
+      <w:r>
+        <w:rPr>
+          <w:rFonts w:ascii="Malgun Gothic" w:cs="Malgun Gothic" w:eastAsia="Malgun Gothic" w:hAnsi="Malgun Gothic"/>
+        </w:rPr>
+        <w:t xml:space="preserve">9.3 프롬프트 개선</w:t>
       </w:r>
     </w:p>
     <w:p>
@@ -16834,8 +16252,16 @@
       <w:r>
         <w:rPr>
           <w:rFonts w:ascii="Malgun Gothic" w:cs="Malgun Gothic" w:eastAsia="Malgun Gothic" w:hAnsi="Malgun Gothic"/>
-        </w:rPr>
-        <w:t xml:space="preserve">후보 요소 부분을 스크린샷에서 잘라(여백 16px) 이미지 모델(CLIP 계열, 추가 학습 없음)로 숫자 벡터로 바꾼다. 이를 32차원으로 줄여(PCA) 기존 특징에 붙인다.</w:t>
+          <w:b/>
+          <w:bCs/>
+        </w:rPr>
+        <w:t xml:space="preserve">대상:</w:t>
+      </w:r>
+      <w:r>
+        <w:rPr>
+          <w:rFonts w:ascii="Malgun Gothic" w:cs="Malgun Gothic" w:eastAsia="Malgun Gothic" w:hAnsi="Malgun Gothic"/>
+        </w:rPr>
+        <w:t xml:space="preserve"> 에이전트 행동 프롬프트(4.4), 설명 생성 프롬프트(6.1).</w:t>
       </w:r>
     </w:p>
     <w:p>
@@ -16850,8 +16276,16 @@
       <w:r>
         <w:rPr>
           <w:rFonts w:ascii="Malgun Gothic" w:cs="Malgun Gothic" w:eastAsia="Malgun Gothic" w:hAnsi="Malgun Gothic"/>
-        </w:rPr>
-        <w:t xml:space="preserve">비교: 기존 특징만 쓴 모델 vs 이미지 임베딩을 더한 모델. 같은 교차 검증 분할에서 정밀도, 재현율, PR-AUC를 비교한다.</w:t>
+          <w:b/>
+          <w:bCs/>
+        </w:rPr>
+        <w:t xml:space="preserve">데이터 분할:</w:t>
+      </w:r>
+      <w:r>
+        <w:rPr>
+          <w:rFonts w:ascii="Malgun Gothic" w:cs="Malgun Gothic" w:eastAsia="Malgun Gothic" w:hAnsi="Malgun Gothic"/>
+        </w:rPr>
+        <w:t xml:space="preserve"> 벤치마크 40페이지를 결함 유형 비율을 맞춰 학습 28 / 테스트 12로 나눈다. 테스트 세트는 최종 평가 때 한 번만 쓴다.</w:t>
       </w:r>
     </w:p>
     <w:p>
@@ -16866,19 +16300,16 @@
       <w:r>
         <w:rPr>
           <w:rFonts w:ascii="Malgun Gothic" w:cs="Malgun Gothic" w:eastAsia="Malgun Gothic" w:hAnsi="Malgun Gothic"/>
-        </w:rPr>
-        <w:t xml:space="preserve">개선이 확인될 때만 본 기능에 반영한다. 임베딩 추출은 CPU로 가능하고, 느리면 Colab GPU를 쓴다.</w:t>
-      </w:r>
-    </w:p>
-    <w:p>
-      <w:pPr>
-        <w:pStyle w:val="Heading2"/>
-      </w:pPr>
-      <w:r>
-        <w:rPr>
-          <w:rFonts w:ascii="Malgun Gothic" w:cs="Malgun Gothic" w:eastAsia="Malgun Gothic" w:hAnsi="Malgun Gothic"/>
-        </w:rPr>
-        <w:t xml:space="preserve">9.3 프롬프트 최적화</w:t>
+          <w:b/>
+          <w:bCs/>
+        </w:rPr>
+        <w:t xml:space="preserve">행동 프롬프트 목표:</w:t>
+      </w:r>
+      <w:r>
+        <w:rPr>
+          <w:rFonts w:ascii="Malgun Gothic" w:cs="Malgun Gothic" w:eastAsia="Malgun Gothic" w:hAnsi="Malgun Gothic"/>
+        </w:rPr>
+        <w:t xml:space="preserve"> 과업 완주율을 높이고, 사람 데이터가 있는 페이지에서는 에이전트 단계 수가 사람 중앙값에 가까워지게 한다.</w:t>
       </w:r>
     </w:p>
     <w:p>
@@ -16896,13 +16327,13 @@
           <w:b/>
           <w:bCs/>
         </w:rPr>
-        <w:t xml:space="preserve">대상:</w:t>
-      </w:r>
-      <w:r>
-        <w:rPr>
-          <w:rFonts w:ascii="Malgun Gothic" w:cs="Malgun Gothic" w:eastAsia="Malgun Gothic" w:hAnsi="Malgun Gothic"/>
-        </w:rPr>
-        <w:t xml:space="preserve"> 에이전트 행동 프롬프트(4.4), 설명 생성 프롬프트(6.1).</w:t>
+        <w:t xml:space="preserve">설명 프롬프트 목표:</w:t>
+      </w:r>
+      <w:r>
+        <w:rPr>
+          <w:rFonts w:ascii="Malgun Gothic" w:cs="Malgun Gothic" w:eastAsia="Malgun Gothic" w:hAnsi="Malgun Gothic"/>
+        </w:rPr>
+        <w:t xml:space="preserve"> 입력에 없는 숫자 생성 0건, 평가 기준표에 따른 LLM 채점 점수, 사람 표본 검토 30건.</w:t>
       </w:r>
     </w:p>
     <w:p>
@@ -16920,13 +16351,13 @@
           <w:b/>
           <w:bCs/>
         </w:rPr>
-        <w:t xml:space="preserve">데이터 분할:</w:t>
-      </w:r>
-      <w:r>
-        <w:rPr>
-          <w:rFonts w:ascii="Malgun Gothic" w:cs="Malgun Gothic" w:eastAsia="Malgun Gothic" w:hAnsi="Malgun Gothic"/>
-        </w:rPr>
-        <w:t xml:space="preserve"> 벤치마크 40페이지를 결함 유형 비율을 맞춰 학습 28 / 테스트 12로 나눈다. 테스트 세트는 최종 평가 때 한 번만 쓴다.</w:t>
+        <w:t xml:space="preserve">방법:</w:t>
+      </w:r>
+      <w:r>
+        <w:rPr>
+          <w:rFonts w:ascii="Malgun Gothic" w:cs="Malgun Gothic" w:eastAsia="Malgun Gothic" w:hAnsi="Malgun Gothic"/>
+        </w:rPr>
+        <w:t xml:space="preserve"> 상용 LLM을 그대로 쓴다. 학습 세트에서 실패한 실행(과업 미완주, 입력에 없는 숫자 생성 등)을 모아 원인을 보고 사람이 프롬프트를 고친다. 고칠 때마다 버전을 올리고 버전별 과업 완주율을 비교한다.</w:t>
       </w:r>
     </w:p>
     <w:p>
@@ -16944,13 +16375,40 @@
           <w:b/>
           <w:bCs/>
         </w:rPr>
-        <w:t xml:space="preserve">행동 프롬프트 목표:</w:t>
-      </w:r>
-      <w:r>
-        <w:rPr>
-          <w:rFonts w:ascii="Malgun Gothic" w:cs="Malgun Gothic" w:eastAsia="Malgun Gothic" w:hAnsi="Malgun Gothic"/>
-        </w:rPr>
-        <w:t xml:space="preserve"> 과업 완주율을 높이고, 사람 데이터가 있는 페이지에서는 에이전트 단계 수가 사람 중앙값에 가까워지게 한다.</w:t>
+        <w:t xml:space="preserve">비용:</w:t>
+      </w:r>
+      <w:r>
+        <w:rPr>
+          <w:rFonts w:ascii="Malgun Gothic" w:cs="Malgun Gothic" w:eastAsia="Malgun Gothic" w:hAnsi="Malgun Gothic"/>
+        </w:rPr>
+        <w:t xml:space="preserve"> 버전 비교 실행은 소형 모델로 한다. 버전 1개당 학습 세트 28페이지를 실행한다.</w:t>
+      </w:r>
+    </w:p>
+    <w:p>
+      <w:pPr>
+        <w:spacing w:after="120" w:line="300"/>
+      </w:pPr>
+      <w:r>
+        <w:rPr>
+          <w:rFonts w:ascii="Malgun Gothic" w:cs="Malgun Gothic" w:eastAsia="Malgun Gothic" w:hAnsi="Malgun Gothic"/>
+        </w:rPr>
+        <w:t xml:space="preserve">버전별 완주율과 점수는 prompts/ 버전과 ml/results/ CSV에 기록해 어떤 변경이 효과가 있었는지 추적한다.</w:t>
+      </w:r>
+    </w:p>
+    <w:p>
+      <w:pPr>
+        <w:spacing w:after="140"/>
+      </w:pPr>
+    </w:p>
+    <w:p>
+      <w:pPr>
+        <w:pStyle w:val="Heading2"/>
+      </w:pPr>
+      <w:r>
+        <w:rPr>
+          <w:rFonts w:ascii="Malgun Gothic" w:cs="Malgun Gothic" w:eastAsia="Malgun Gothic" w:hAnsi="Malgun Gothic"/>
+        </w:rPr>
+        <w:t xml:space="preserve">9.4 실험 관리</w:t>
       </w:r>
     </w:p>
     <w:p>
@@ -16965,16 +16423,8 @@
       <w:r>
         <w:rPr>
           <w:rFonts w:ascii="Malgun Gothic" w:cs="Malgun Gothic" w:eastAsia="Malgun Gothic" w:hAnsi="Malgun Gothic"/>
-          <w:b/>
-          <w:bCs/>
-        </w:rPr>
-        <w:t xml:space="preserve">설명 프롬프트 목표:</w:t>
-      </w:r>
-      <w:r>
-        <w:rPr>
-          <w:rFonts w:ascii="Malgun Gothic" w:cs="Malgun Gothic" w:eastAsia="Malgun Gothic" w:hAnsi="Malgun Gothic"/>
-        </w:rPr>
-        <w:t xml:space="preserve"> 입력에 없는 숫자 생성 0건, 평가 기준표에 따른 LLM 채점 점수, 사람 표본 검토 30건.</w:t>
+        </w:rPr>
+        <w:t xml:space="preserve">학습 코드는 ml/ 아래 스크립트로 두고 같은 명령으로 다시 돌릴 수 있게 한다.</w:t>
       </w:r>
     </w:p>
     <w:p>
@@ -16989,16 +16439,8 @@
       <w:r>
         <w:rPr>
           <w:rFonts w:ascii="Malgun Gothic" w:cs="Malgun Gothic" w:eastAsia="Malgun Gothic" w:hAnsi="Malgun Gothic"/>
-          <w:b/>
-          <w:bCs/>
-        </w:rPr>
-        <w:t xml:space="preserve">방법:</w:t>
-      </w:r>
-      <w:r>
-        <w:rPr>
-          <w:rFonts w:ascii="Malgun Gothic" w:cs="Malgun Gothic" w:eastAsia="Malgun Gothic" w:hAnsi="Malgun Gothic"/>
-        </w:rPr>
-        <w:t xml:space="preserve"> 지시문 후보와 예시(few-shot) 조합을 DSPy로 탐색한다. 도구 호출 구조와 맞지 않으면 후보 N개를 학습 세트에서 평가하고 상위 변형을 다시 만드는 자체 스크립트로 대신한다.</w:t>
+        </w:rPr>
+        <w:t xml:space="preserve">데이터셋은 날짜별 스냅샷을 R2에 저장하고 해시를 기록한다.</w:t>
       </w:r>
     </w:p>
     <w:p>
@@ -17013,633 +16455,8 @@
       <w:r>
         <w:rPr>
           <w:rFonts w:ascii="Malgun Gothic" w:cs="Malgun Gothic" w:eastAsia="Malgun Gothic" w:hAnsi="Malgun Gothic"/>
-          <w:b/>
-          <w:bCs/>
-        </w:rPr>
-        <w:t xml:space="preserve">비용:</w:t>
-      </w:r>
-      <w:r>
-        <w:rPr>
-          <w:rFonts w:ascii="Malgun Gothic" w:cs="Malgun Gothic" w:eastAsia="Malgun Gothic" w:hAnsi="Malgun Gothic"/>
-        </w:rPr>
-        <w:t xml:space="preserve"> 탐색은 소형 모델로 한다. 후보 20개 × 28페이지면 약 560회 실행이다.</w:t>
-      </w:r>
-    </w:p>
-    <w:p>
-      <w:pPr>
-        <w:spacing w:after="120" w:line="300"/>
-      </w:pPr>
-      <w:r>
-        <w:rPr>
-          <w:rFonts w:ascii="Malgun Gothic" w:cs="Malgun Gothic" w:eastAsia="Malgun Gothic" w:hAnsi="Malgun Gothic"/>
-        </w:rPr>
-        <w:t xml:space="preserve">모든 후보와 점수는 prompts/ 버전과 MLflow에 기록해 어떤 변경이 효과가 있었는지 추적한다.</w:t>
-      </w:r>
-    </w:p>
-    <w:p>
-      <w:pPr>
-        <w:pStyle w:val="Heading2"/>
-      </w:pPr>
-      <w:r>
-        <w:rPr>
-          <w:rFonts w:ascii="Malgun Gothic" w:cs="Malgun Gothic" w:eastAsia="Malgun Gothic" w:hAnsi="Malgun Gothic"/>
-        </w:rPr>
-        <w:t xml:space="preserve">9.4 요소 후보 순위 모델</w:t>
-      </w:r>
-    </w:p>
-    <w:p>
-      <w:pPr>
-        <w:spacing w:after="120" w:line="300"/>
-      </w:pPr>
-      <w:r>
-        <w:rPr>
-          <w:rFonts w:ascii="Malgun Gothic" w:cs="Malgun Gothic" w:eastAsia="Malgun Gothic" w:hAnsi="Malgun Gothic"/>
-        </w:rPr>
-        <w:t xml:space="preserve">매 단계 LLM에 넘기는 요소 목록은 입력 토큰의 약 40%를 차지한다(16장). 페이지에 버튼과 링크가 100개면 100개를 모두 넘긴다. 이번 단계에 눌릴 가능성이 높은 요소만 골라 넘기면 비용과 응답 시간이 함께 줄어든다.</w:t>
-      </w:r>
-    </w:p>
-    <w:p>
-      <w:pPr>
-        <w:pStyle w:val="ListParagraph"/>
-        <w:numPr>
-          <w:ilvl w:val="0"/>
-          <w:numId w:val="4"/>
-        </w:numPr>
-        <w:spacing w:after="60" w:line="290"/>
-      </w:pPr>
-      <w:r>
-        <w:rPr>
-          <w:rFonts w:ascii="Malgun Gothic" w:cs="Malgun Gothic" w:eastAsia="Malgun Gothic" w:hAnsi="Malgun Gothic"/>
-          <w:b/>
-          <w:bCs/>
-        </w:rPr>
-        <w:t xml:space="preserve">모델:</w:t>
-      </w:r>
-      <w:r>
-        <w:rPr>
-          <w:rFonts w:ascii="Malgun Gothic" w:cs="Malgun Gothic" w:eastAsia="Malgun Gothic" w:hAnsi="Malgun Gothic"/>
-        </w:rPr>
-        <w:t xml:space="preserve"> 요소마다 "이번 단계에 눌릴 가능성" 점수를 매기는 순위 모델. 순위 학습 방식(LightGBM LambdaRank)을 쓰고, 한 단계의 요소 목록 안에서 순서를 맞히도록 학습한다.</w:t>
-      </w:r>
-    </w:p>
-    <w:p>
-      <w:pPr>
-        <w:pStyle w:val="ListParagraph"/>
-        <w:numPr>
-          <w:ilvl w:val="0"/>
-          <w:numId w:val="4"/>
-        </w:numPr>
-        <w:spacing w:after="60" w:line="290"/>
-      </w:pPr>
-      <w:r>
-        <w:rPr>
-          <w:rFonts w:ascii="Malgun Gothic" w:cs="Malgun Gothic" w:eastAsia="Malgun Gothic" w:hAnsi="Malgun Gothic"/>
-          <w:b/>
-          <w:bCs/>
-        </w:rPr>
-        <w:t xml:space="preserve">특징:</w:t>
-      </w:r>
-      <w:r>
-        <w:rPr>
-          <w:rFonts w:ascii="Malgun Gothic" w:cs="Malgun Gothic" w:eastAsia="Malgun Gothic" w:hAnsi="Malgun Gothic"/>
-        </w:rPr>
-        <w:t xml:space="preserve"> 과업 설명·직전 thought와 요소 텍스트의 임베딩 유사도, 역할, 크기, 뷰포트 안 위치, 첫 화면 여부, 이미 누른 요소인지, 입력 필드가 비었는지, 글자 크기·굵기.</w:t>
-      </w:r>
-    </w:p>
-    <w:p>
-      <w:pPr>
-        <w:pStyle w:val="ListParagraph"/>
-        <w:numPr>
-          <w:ilvl w:val="0"/>
-          <w:numId w:val="4"/>
-        </w:numPr>
-        <w:spacing w:after="60" w:line="290"/>
-      </w:pPr>
-      <w:r>
-        <w:rPr>
-          <w:rFonts w:ascii="Malgun Gothic" w:cs="Malgun Gothic" w:eastAsia="Malgun Gothic" w:hAnsi="Malgun Gothic"/>
-          <w:b/>
-          <w:bCs/>
-        </w:rPr>
-        <w:t xml:space="preserve">데이터:</w:t>
-      </w:r>
-      <w:r>
-        <w:rPr>
-          <w:rFonts w:ascii="Malgun Gothic" w:cs="Malgun Gothic" w:eastAsia="Malgun Gothic" w:hAnsi="Malgun Gothic"/>
-        </w:rPr>
-        <w:t xml:space="preserve"> S3~S4 벤치마크 실행 로그. 단계마다 전체 요소 목록과 특징을 element_candidate 테이블에 저장하고, 성공한 실행에서 실제로 누른 요소를 정답으로 쓴다. 40페이지 × 3회 × 약 20단계로 2천 스텝 이상을 예상한다.</w:t>
-      </w:r>
-    </w:p>
-    <w:p>
-      <w:pPr>
-        <w:pStyle w:val="ListParagraph"/>
-        <w:numPr>
-          <w:ilvl w:val="0"/>
-          <w:numId w:val="4"/>
-        </w:numPr>
-        <w:spacing w:after="60" w:line="290"/>
-      </w:pPr>
-      <w:r>
-        <w:rPr>
-          <w:rFonts w:ascii="Malgun Gothic" w:cs="Malgun Gothic" w:eastAsia="Malgun Gothic" w:hAnsi="Malgun Gothic"/>
-          <w:b/>
-          <w:bCs/>
-        </w:rPr>
-        <w:t xml:space="preserve">적용 (조건부, 아래 참고):</w:t>
-      </w:r>
-      <w:r>
-        <w:rPr>
-          <w:rFonts w:ascii="Malgun Gothic" w:cs="Malgun Gothic" w:eastAsia="Malgun Gothic" w:hAnsi="Malgun Gothic"/>
-        </w:rPr>
-        <w:t xml:space="preserve"> 점수 상위 30개만 요소 목록에 넣는다. 스크린샷과 번호 라벨은 그대로 둔다. 에이전트가 confusion을 적거나 fail을 반환하면 그 단계는 전체 목록으로 다시 묻는다.</w:t>
-      </w:r>
-    </w:p>
-    <w:p>
-      <w:pPr>
-        <w:pStyle w:val="ListParagraph"/>
-        <w:numPr>
-          <w:ilvl w:val="0"/>
-          <w:numId w:val="4"/>
-        </w:numPr>
-        <w:spacing w:after="60" w:line="290"/>
-      </w:pPr>
-      <w:r>
-        <w:rPr>
-          <w:rFonts w:ascii="Malgun Gothic" w:cs="Malgun Gothic" w:eastAsia="Malgun Gothic" w:hAnsi="Malgun Gothic"/>
-          <w:b/>
-          <w:bCs/>
-        </w:rPr>
-        <w:t xml:space="preserve">검증:</w:t>
-      </w:r>
-      <w:r>
-        <w:rPr>
-          <w:rFonts w:ascii="Malgun Gothic" w:cs="Malgun Gothic" w:eastAsia="Malgun Gothic" w:hAnsi="Malgun Gothic"/>
-        </w:rPr>
-        <w:t xml:space="preserve"> 페이지 단위로 학습·평가를 나눈다. 상위 30개 안에 정답이 들어가는 비율(Recall@30) 95% 이상. 적용 전후 벤치마크 비교에서 요소 목록 토큰 50% 이상 감소, 과업 완주율 하락 2%p 이내.</w:t>
-      </w:r>
-    </w:p>
-    <w:p>
-      <w:pPr>
-        <w:pStyle w:val="ListParagraph"/>
-        <w:numPr>
-          <w:ilvl w:val="0"/>
-          <w:numId w:val="4"/>
-        </w:numPr>
-        <w:spacing w:after="60" w:line="290"/>
-      </w:pPr>
-      <w:r>
-        <w:rPr>
-          <w:rFonts w:ascii="Malgun Gothic" w:cs="Malgun Gothic" w:eastAsia="Malgun Gothic" w:hAnsi="Malgun Gothic"/>
-          <w:b/>
-          <w:bCs/>
-        </w:rPr>
-        <w:t xml:space="preserve">측정값 영향:</w:t>
-      </w:r>
-      <w:r>
-        <w:rPr>
-          <w:rFonts w:ascii="Malgun Gothic" w:cs="Malgun Gothic" w:eastAsia="Malgun Gothic" w:hAnsi="Malgun Gothic"/>
-        </w:rPr>
-        <w:t xml:space="preserve"> 측정 훅은 전체 요소를 기준으로 동작하므로 지표 계산은 바뀌지 않는다. 다만 에이전트 경로가 달라질 수 있어 적용 전후 경로 의존 지표 차이를 함께 보고한다.</w:t>
-      </w:r>
-    </w:p>
-    <w:p>
-      <w:pPr>
-        <w:pStyle w:val="Heading3"/>
-      </w:pPr>
-      <w:r>
-        <w:rPr>
-          <w:rFonts w:ascii="Malgun Gothic" w:cs="Malgun Gothic" w:eastAsia="Malgun Gothic" w:hAnsi="Malgun Gothic"/>
-        </w:rPr>
-        <w:t xml:space="preserve">단계적 적용 (11월 9일 S4 착수 시 판단)</w:t>
-      </w:r>
-    </w:p>
-    <w:p>
-      <w:pPr>
-        <w:spacing w:after="120" w:line="300"/>
-      </w:pPr>
-      <w:r>
-        <w:rPr>
-          <w:rFonts w:ascii="Malgun Gothic" w:cs="Malgun Gothic" w:eastAsia="Malgun Gothic" w:hAnsi="Malgun Gothic"/>
-        </w:rPr>
-        <w:t xml:space="preserve">이 서비스의 핵심 가치는 토큰 절감이 아니라 완주와 회귀 감지다. 위험한 부분은 모델 학습이 아니라 에이전트 루프에 붙이는 온라인 적용(상위 30개만 넘기고, 헤매면 전체 목록으로 다시 묻는 로직)이다. 그래서 적용 여부를 S4 시작 시점에 판단한다.</w:t>
-      </w:r>
-    </w:p>
-    <w:tbl>
-      <w:tblPr>
-        <w:tblW w:type="dxa" w:w="9638"/>
-        <w:tblBorders>
-          <w:top w:val="none" w:color="FFFFFF" w:sz="0"/>
-          <w:left w:val="none" w:color="FFFFFF" w:sz="0"/>
-          <w:bottom w:val="none" w:color="FFFFFF" w:sz="0"/>
-          <w:right w:val="none" w:color="FFFFFF" w:sz="0"/>
-          <w:insideH w:val="none" w:color="FFFFFF" w:sz="0"/>
-          <w:insideV w:val="none" w:color="FFFFFF" w:sz="0"/>
-        </w:tblBorders>
-      </w:tblPr>
-      <w:tblGrid>
-        <w:gridCol w:w="4475"/>
-        <w:gridCol w:w="5163"/>
-      </w:tblGrid>
-      <w:tr>
-        <w:trPr>
-          <w:tblHeader/>
-        </w:trPr>
-        <w:tc>
-          <w:tcPr>
-            <w:tcW w:type="dxa" w:w="4475"/>
-            <w:tcBorders>
-              <w:top w:val="single" w:color="000000" w:sz="10"/>
-              <w:left w:val="none" w:color="FFFFFF" w:sz="0"/>
-              <w:bottom w:val="single" w:color="000000" w:sz="6"/>
-              <w:right w:val="none" w:color="FFFFFF" w:sz="0"/>
-            </w:tcBorders>
-            <w:tcMar>
-              <w:top w:type="dxa" w:w="70"/>
-              <w:left w:type="dxa" w:w="110"/>
-              <w:bottom w:type="dxa" w:w="70"/>
-              <w:right w:type="dxa" w:w="110"/>
-            </w:tcMar>
-          </w:tcPr>
-          <w:p>
-            <w:pPr>
-              <w:spacing w:after="30" w:line="270"/>
-            </w:pPr>
-            <w:r>
-              <w:rPr>
-                <w:rFonts w:ascii="Malgun Gothic" w:cs="Malgun Gothic" w:eastAsia="Malgun Gothic" w:hAnsi="Malgun Gothic"/>
-                <w:b/>
-                <w:bCs/>
-                <w:sz w:val="18"/>
-                <w:szCs w:val="18"/>
-              </w:rPr>
-              <w:t xml:space="preserve">조건</w:t>
-            </w:r>
-          </w:p>
-        </w:tc>
-        <w:tc>
-          <w:tcPr>
-            <w:tcW w:type="dxa" w:w="5163"/>
-            <w:tcBorders>
-              <w:top w:val="single" w:color="000000" w:sz="10"/>
-              <w:left w:val="none" w:color="FFFFFF" w:sz="0"/>
-              <w:bottom w:val="single" w:color="000000" w:sz="6"/>
-              <w:right w:val="none" w:color="FFFFFF" w:sz="0"/>
-            </w:tcBorders>
-            <w:tcMar>
-              <w:top w:type="dxa" w:w="70"/>
-              <w:left w:type="dxa" w:w="110"/>
-              <w:bottom w:type="dxa" w:w="70"/>
-              <w:right w:type="dxa" w:w="110"/>
-            </w:tcMar>
-          </w:tcPr>
-          <w:p>
-            <w:pPr>
-              <w:spacing w:after="30" w:line="270"/>
-            </w:pPr>
-            <w:r>
-              <w:rPr>
-                <w:rFonts w:ascii="Malgun Gothic" w:cs="Malgun Gothic" w:eastAsia="Malgun Gothic" w:hAnsi="Malgun Gothic"/>
-                <w:b/>
-                <w:bCs/>
-                <w:sz w:val="18"/>
-                <w:szCs w:val="18"/>
-              </w:rPr>
-              <w:t xml:space="preserve">판단</w:t>
-            </w:r>
-          </w:p>
-        </w:tc>
-      </w:tr>
-      <w:tr>
-        <w:trPr>
-          <w:tblHeader w:val="false"/>
-        </w:trPr>
-        <w:tc>
-          <w:tcPr>
-            <w:tcW w:type="dxa" w:w="4475"/>
-            <w:tcBorders>
-              <w:top w:val="none" w:color="FFFFFF" w:sz="0"/>
-              <w:left w:val="none" w:color="FFFFFF" w:sz="0"/>
-              <w:bottom w:val="single" w:color="D9D9D9" w:sz="2"/>
-              <w:right w:val="none" w:color="FFFFFF" w:sz="0"/>
-            </w:tcBorders>
-            <w:tcMar>
-              <w:top w:type="dxa" w:w="70"/>
-              <w:left w:type="dxa" w:w="110"/>
-              <w:bottom w:type="dxa" w:w="70"/>
-              <w:right w:type="dxa" w:w="110"/>
-            </w:tcMar>
-          </w:tcPr>
-          <w:p>
-            <w:pPr>
-              <w:spacing w:after="30" w:line="270"/>
-            </w:pPr>
-            <w:r>
-              <w:rPr>
-                <w:rFonts w:ascii="Malgun Gothic" w:cs="Malgun Gothic" w:eastAsia="Malgun Gothic" w:hAnsi="Malgun Gothic"/>
-                <w:b/>
-                <w:bCs/>
-                <w:sz w:val="18"/>
-                <w:szCs w:val="18"/>
-              </w:rPr>
-              <w:t xml:space="preserve">정상 벤치마크 완주율 80% 이상, 재생 모듈 테스트(15.3) 통과</w:t>
-            </w:r>
-          </w:p>
-        </w:tc>
-        <w:tc>
-          <w:tcPr>
-            <w:tcW w:type="dxa" w:w="5163"/>
-            <w:tcBorders>
-              <w:top w:val="none" w:color="FFFFFF" w:sz="0"/>
-              <w:left w:val="none" w:color="FFFFFF" w:sz="0"/>
-              <w:bottom w:val="single" w:color="D9D9D9" w:sz="2"/>
-              <w:right w:val="none" w:color="FFFFFF" w:sz="0"/>
-            </w:tcBorders>
-            <w:tcMar>
-              <w:top w:type="dxa" w:w="70"/>
-              <w:left w:type="dxa" w:w="110"/>
-              <w:bottom w:type="dxa" w:w="70"/>
-              <w:right w:type="dxa" w:w="110"/>
-            </w:tcMar>
-          </w:tcPr>
-          <w:p>
-            <w:pPr>
-              <w:spacing w:after="30" w:line="270"/>
-            </w:pPr>
-            <w:r>
-              <w:rPr>
-                <w:rFonts w:ascii="Malgun Gothic" w:cs="Malgun Gothic" w:eastAsia="Malgun Gothic" w:hAnsi="Malgun Gothic"/>
-                <w:sz w:val="18"/>
-                <w:szCs w:val="18"/>
-              </w:rPr>
-              <w:t xml:space="preserve">온라인 적용 진행 (S4~S5)</w:t>
-            </w:r>
-          </w:p>
-        </w:tc>
-      </w:tr>
-      <w:tr>
-        <w:trPr>
-          <w:tblHeader w:val="false"/>
-        </w:trPr>
-        <w:tc>
-          <w:tcPr>
-            <w:tcW w:type="dxa" w:w="4475"/>
-            <w:tcBorders>
-              <w:top w:val="none" w:color="FFFFFF" w:sz="0"/>
-              <w:left w:val="none" w:color="FFFFFF" w:sz="0"/>
-              <w:bottom w:val="single" w:color="000000" w:sz="10"/>
-              <w:right w:val="none" w:color="FFFFFF" w:sz="0"/>
-            </w:tcBorders>
-            <w:tcMar>
-              <w:top w:type="dxa" w:w="70"/>
-              <w:left w:type="dxa" w:w="110"/>
-              <w:bottom w:type="dxa" w:w="70"/>
-              <w:right w:type="dxa" w:w="110"/>
-            </w:tcMar>
-          </w:tcPr>
-          <w:p>
-            <w:pPr>
-              <w:spacing w:after="30" w:line="270"/>
-            </w:pPr>
-            <w:r>
-              <w:rPr>
-                <w:rFonts w:ascii="Malgun Gothic" w:cs="Malgun Gothic" w:eastAsia="Malgun Gothic" w:hAnsi="Malgun Gothic"/>
-                <w:b/>
-                <w:bCs/>
-                <w:sz w:val="18"/>
-                <w:szCs w:val="18"/>
-              </w:rPr>
-              <w:t xml:space="preserve">둘 중 하나라도 미달</w:t>
-            </w:r>
-          </w:p>
-        </w:tc>
-        <w:tc>
-          <w:tcPr>
-            <w:tcW w:type="dxa" w:w="5163"/>
-            <w:tcBorders>
-              <w:top w:val="none" w:color="FFFFFF" w:sz="0"/>
-              <w:left w:val="none" w:color="FFFFFF" w:sz="0"/>
-              <w:bottom w:val="single" w:color="000000" w:sz="10"/>
-              <w:right w:val="none" w:color="FFFFFF" w:sz="0"/>
-            </w:tcBorders>
-            <w:tcMar>
-              <w:top w:type="dxa" w:w="70"/>
-              <w:left w:type="dxa" w:w="110"/>
-              <w:bottom w:type="dxa" w:w="70"/>
-              <w:right w:type="dxa" w:w="110"/>
-            </w:tcMar>
-          </w:tcPr>
-          <w:p>
-            <w:pPr>
-              <w:spacing w:after="30" w:line="270"/>
-            </w:pPr>
-            <w:r>
-              <w:rPr>
-                <w:rFonts w:ascii="Malgun Gothic" w:cs="Malgun Gothic" w:eastAsia="Malgun Gothic" w:hAnsi="Malgun Gothic"/>
-                <w:sz w:val="18"/>
-                <w:szCs w:val="18"/>
-              </w:rPr>
-              <w:t xml:space="preserve">온라인 적용은 P1로 미루고 전체 요소를 LLM에 전달하는 방식으로 고정 (토큰 비용 감수). 오프라인 실험은 계속한다</w:t>
-            </w:r>
-          </w:p>
-        </w:tc>
-      </w:tr>
-    </w:tbl>
-    <w:p>
-      <w:pPr>
-        <w:spacing w:after="140"/>
-      </w:pPr>
-    </w:p>
-    <w:p>
-      <w:pPr>
-        <w:pStyle w:val="ListParagraph"/>
-        <w:numPr>
-          <w:ilvl w:val="0"/>
-          <w:numId w:val="4"/>
-        </w:numPr>
-        <w:spacing w:after="60" w:line="290"/>
-      </w:pPr>
-      <w:r>
-        <w:rPr>
-          <w:rFonts w:ascii="Malgun Gothic" w:cs="Malgun Gothic" w:eastAsia="Malgun Gothic" w:hAnsi="Malgun Gothic"/>
-          <w:b/>
-          <w:bCs/>
-        </w:rPr>
-        <w:t xml:space="preserve">오프라인 실험:</w:t>
-      </w:r>
-      <w:r>
-        <w:rPr>
-          <w:rFonts w:ascii="Malgun Gothic" w:cs="Malgun Gothic" w:eastAsia="Malgun Gothic" w:hAnsi="Malgun Gothic"/>
-        </w:rPr>
-        <w:t xml:space="preserve"> 저장된 로그로 모델을 학습하고 Recall@30과 예상 토큰 절감률을 계산한다. 제품에는 영향이 없고 결과는 실험 리포트로 남는다.</w:t>
-      </w:r>
-    </w:p>
-    <w:p>
-      <w:pPr>
-        <w:pStyle w:val="ListParagraph"/>
-        <w:numPr>
-          <w:ilvl w:val="0"/>
-          <w:numId w:val="4"/>
-        </w:numPr>
-        <w:spacing w:after="60" w:line="290"/>
-      </w:pPr>
-      <w:r>
-        <w:rPr>
-          <w:rFonts w:ascii="Malgun Gothic" w:cs="Malgun Gothic" w:eastAsia="Malgun Gothic" w:hAnsi="Malgun Gothic"/>
-          <w:b/>
-          <w:bCs/>
-        </w:rPr>
-        <w:t xml:space="preserve">로그 저장:</w:t>
-      </w:r>
-      <w:r>
-        <w:rPr>
-          <w:rFonts w:ascii="Malgun Gothic" w:cs="Malgun Gothic" w:eastAsia="Malgun Gothic" w:hAnsi="Malgun Gothic"/>
-        </w:rPr>
-        <w:t xml:space="preserve"> element_candidate 저장은 비용이 거의 들지 않으므로 판단 결과와 관계없이 S3부터 계속한다.</w:t>
-      </w:r>
-    </w:p>
-    <w:p>
-      <w:pPr>
-        <w:pStyle w:val="Heading3"/>
-      </w:pPr>
-      <w:r>
-        <w:rPr>
-          <w:rFonts w:ascii="Malgun Gothic" w:cs="Malgun Gothic" w:eastAsia="Malgun Gothic" w:hAnsi="Malgun Gothic"/>
-        </w:rPr>
-        <w:t xml:space="preserve">선택 실험: 임베딩 모델 파인튜닝</w:t>
-      </w:r>
-    </w:p>
-    <w:p>
-      <w:pPr>
-        <w:pStyle w:val="ListParagraph"/>
-        <w:numPr>
-          <w:ilvl w:val="0"/>
-          <w:numId w:val="4"/>
-        </w:numPr>
-        <w:spacing w:after="60" w:line="290"/>
-      </w:pPr>
-      <w:r>
-        <w:rPr>
-          <w:rFonts w:ascii="Malgun Gothic" w:cs="Malgun Gothic" w:eastAsia="Malgun Gothic" w:hAnsi="Malgun Gothic"/>
-        </w:rPr>
-        <w:t xml:space="preserve">다국어 소형 문장 임베딩 모델(multilingual-e5-small 급)을 추가 학습(파인튜닝)한다. 과업과 실제로 누른 요소는 가깝게, 누르지 않은 요소는 멀게 배우는 대조 학습 방식이다. (과업 설명 + 직전 thought, 실제 누른 요소 텍스트)를 양성 쌍으로, 같은 단계의 다른 요소를 음성으로 쓴다.</w:t>
-      </w:r>
-    </w:p>
-    <w:p>
-      <w:pPr>
-        <w:pStyle w:val="ListParagraph"/>
-        <w:numPr>
-          <w:ilvl w:val="0"/>
-          <w:numId w:val="4"/>
-        </w:numPr>
-        <w:spacing w:after="60" w:line="290"/>
-      </w:pPr>
-      <w:r>
-        <w:rPr>
-          <w:rFonts w:ascii="Malgun Gothic" w:cs="Malgun Gothic" w:eastAsia="Malgun Gothic" w:hAnsi="Malgun Gothic"/>
-        </w:rPr>
-        <w:t xml:space="preserve">비교 세 가지: 기본 임베딩 유사도 + LightGBM / 파인튜닝한 임베딩 유사도 + LightGBM / 파인튜닝한 임베딩 단독 순위.</w:t>
-      </w:r>
-    </w:p>
-    <w:p>
-      <w:pPr>
-        <w:pStyle w:val="ListParagraph"/>
-        <w:numPr>
-          <w:ilvl w:val="0"/>
-          <w:numId w:val="4"/>
-        </w:numPr>
-        <w:spacing w:after="60" w:line="290"/>
-      </w:pPr>
-      <w:r>
-        <w:rPr>
-          <w:rFonts w:ascii="Malgun Gothic" w:cs="Malgun Gothic" w:eastAsia="Malgun Gothic" w:hAnsi="Malgun Gothic"/>
-        </w:rPr>
-        <w:t xml:space="preserve">지표는 Recall@30, 요소 목록 토큰 절감률, CPU 추론 시간. 학습은 Colab 무료 GPU로 충분하다.</w:t>
-      </w:r>
-    </w:p>
-    <w:p>
-      <w:pPr>
-        <w:pStyle w:val="ListParagraph"/>
-        <w:numPr>
-          <w:ilvl w:val="0"/>
-          <w:numId w:val="4"/>
-        </w:numPr>
-        <w:spacing w:after="60" w:line="290"/>
-      </w:pPr>
-      <w:r>
-        <w:rPr>
-          <w:rFonts w:ascii="Malgun Gothic" w:cs="Malgun Gothic" w:eastAsia="Malgun Gothic" w:hAnsi="Malgun Gothic"/>
-        </w:rPr>
-        <w:t xml:space="preserve">개선이 확인될 때만 본 기능에 반영한다.</w:t>
-      </w:r>
-    </w:p>
-    <w:p>
-      <w:pPr>
-        <w:spacing w:after="120" w:line="300"/>
-      </w:pPr>
-      <w:r>
-        <w:rPr>
-          <w:rFonts w:ascii="Malgun Gothic" w:cs="Malgun Gothic" w:eastAsia="Malgun Gothic" w:hAnsi="Malgun Gothic"/>
-        </w:rPr>
-        <w:t xml:space="preserve">작은 이미지·언어 모델(VLM)을 직접 학습하는 것은 GPU 확보와 모델 서빙 부담이 커서 학기 이후 확장 과제로 둔다.</w:t>
-      </w:r>
-    </w:p>
-    <w:p>
-      <w:pPr>
-        <w:pStyle w:val="Heading2"/>
-      </w:pPr>
-      <w:r>
-        <w:rPr>
-          <w:rFonts w:ascii="Malgun Gothic" w:cs="Malgun Gothic" w:eastAsia="Malgun Gothic" w:hAnsi="Malgun Gothic"/>
-        </w:rPr>
-        <w:t xml:space="preserve">9.5 실험 관리</w:t>
-      </w:r>
-    </w:p>
-    <w:p>
-      <w:pPr>
-        <w:pStyle w:val="ListParagraph"/>
-        <w:numPr>
-          <w:ilvl w:val="0"/>
-          <w:numId w:val="4"/>
-        </w:numPr>
-        <w:spacing w:after="60" w:line="290"/>
-      </w:pPr>
-      <w:r>
-        <w:rPr>
-          <w:rFonts w:ascii="Malgun Gothic" w:cs="Malgun Gothic" w:eastAsia="Malgun Gothic" w:hAnsi="Malgun Gothic"/>
-        </w:rPr>
-        <w:t xml:space="preserve">학습 코드는 ml/ 아래 스크립트로 두고 같은 명령으로 다시 돌릴 수 있게 한다.</w:t>
-      </w:r>
-    </w:p>
-    <w:p>
-      <w:pPr>
-        <w:pStyle w:val="ListParagraph"/>
-        <w:numPr>
-          <w:ilvl w:val="0"/>
-          <w:numId w:val="4"/>
-        </w:numPr>
-        <w:spacing w:after="60" w:line="290"/>
-      </w:pPr>
-      <w:r>
-        <w:rPr>
-          <w:rFonts w:ascii="Malgun Gothic" w:cs="Malgun Gothic" w:eastAsia="Malgun Gothic" w:hAnsi="Malgun Gothic"/>
-        </w:rPr>
-        <w:t xml:space="preserve">데이터셋은 날짜별 스냅샷을 R2에 저장하고 해시를 기록한다.</w:t>
-      </w:r>
-    </w:p>
-    <w:p>
-      <w:pPr>
-        <w:pStyle w:val="ListParagraph"/>
-        <w:numPr>
-          <w:ilvl w:val="0"/>
-          <w:numId w:val="4"/>
-        </w:numPr>
-        <w:spacing w:after="60" w:line="290"/>
-      </w:pPr>
-      <w:r>
-        <w:rPr>
-          <w:rFonts w:ascii="Malgun Gothic" w:cs="Malgun Gothic" w:eastAsia="Malgun Gothic" w:hAnsi="Malgun Gothic"/>
-        </w:rPr>
-        <w:t xml:space="preserve">학습 실행마다 파라미터, 데이터 버전, 성능을 MLflow에 남긴다.</w:t>
+        </w:rPr>
+        <w:t xml:space="preserve">학습 실행마다 파라미터, 데이터 버전, 성능을 ml/results/에 CSV로 남긴다.</w:t>
       </w:r>
     </w:p>
     <w:p>
@@ -19139,7 +17956,7 @@
             <w:tcBorders>
               <w:top w:val="none" w:color="FFFFFF" w:sz="0"/>
               <w:left w:val="none" w:color="FFFFFF" w:sz="0"/>
-              <w:bottom w:val="single" w:color="D9D9D9" w:sz="2"/>
+              <w:bottom w:val="single" w:color="000000" w:sz="10"/>
               <w:right w:val="none" w:color="FFFFFF" w:sz="0"/>
             </w:tcBorders>
             <w:tcMar>
@@ -19161,7 +17978,7 @@
                 <w:sz w:val="18"/>
                 <w:szCs w:val="18"/>
               </w:rPr>
-              <w:t xml:space="preserve">element_candidate</w:t>
+              <w:t xml:space="preserve">model_version</w:t>
             </w:r>
           </w:p>
         </w:tc>
@@ -19171,27 +17988,27 @@
             <w:tcBorders>
               <w:top w:val="none" w:color="FFFFFF" w:sz="0"/>
               <w:left w:val="none" w:color="FFFFFF" w:sz="0"/>
-              <w:bottom w:val="single" w:color="D9D9D9" w:sz="2"/>
-              <w:right w:val="none" w:color="FFFFFF" w:sz="0"/>
-            </w:tcBorders>
-            <w:tcMar>
-              <w:top w:type="dxa" w:w="70"/>
-              <w:left w:type="dxa" w:w="110"/>
-              <w:bottom w:type="dxa" w:w="70"/>
-              <w:right w:type="dxa" w:w="110"/>
-            </w:tcMar>
-          </w:tcPr>
-          <w:p>
-            <w:pPr>
-              <w:spacing w:after="30" w:line="270"/>
-            </w:pPr>
-            <w:r>
-              <w:rPr>
-                <w:rFonts w:ascii="Malgun Gothic" w:cs="Malgun Gothic" w:eastAsia="Malgun Gothic" w:hAnsi="Malgun Gothic"/>
-                <w:sz w:val="18"/>
-                <w:szCs w:val="18"/>
-              </w:rPr>
-              <w:t xml:space="preserve">id, step_id, el_index, features(JSONB), rank_score, sent_to_llm(bool), clicked(bool)</w:t>
+              <w:bottom w:val="single" w:color="000000" w:sz="10"/>
+              <w:right w:val="none" w:color="FFFFFF" w:sz="0"/>
+            </w:tcBorders>
+            <w:tcMar>
+              <w:top w:type="dxa" w:w="70"/>
+              <w:left w:type="dxa" w:w="110"/>
+              <w:bottom w:type="dxa" w:w="70"/>
+              <w:right w:type="dxa" w:w="110"/>
+            </w:tcMar>
+          </w:tcPr>
+          <w:p>
+            <w:pPr>
+              <w:spacing w:after="30" w:line="270"/>
+            </w:pPr>
+            <w:r>
+              <w:rPr>
+                <w:rFonts w:ascii="Malgun Gothic" w:cs="Malgun Gothic" w:eastAsia="Malgun Gothic" w:hAnsi="Malgun Gothic"/>
+                <w:sz w:val="18"/>
+                <w:szCs w:val="18"/>
+              </w:rPr>
+              <w:t xml:space="preserve">id, name, version, params(JSONB), metrics(JSONB), artifact_key, approved</w:t>
             </w:r>
           </w:p>
         </w:tc>
@@ -19201,41 +18018,6 @@
             <w:tcBorders>
               <w:top w:val="none" w:color="FFFFFF" w:sz="0"/>
               <w:left w:val="none" w:color="FFFFFF" w:sz="0"/>
-              <w:bottom w:val="single" w:color="D9D9D9" w:sz="2"/>
-              <w:right w:val="none" w:color="FFFFFF" w:sz="0"/>
-            </w:tcBorders>
-            <w:tcMar>
-              <w:top w:type="dxa" w:w="70"/>
-              <w:left w:type="dxa" w:w="110"/>
-              <w:bottom w:type="dxa" w:w="70"/>
-              <w:right w:type="dxa" w:w="110"/>
-            </w:tcMar>
-          </w:tcPr>
-          <w:p>
-            <w:pPr>
-              <w:spacing w:after="30" w:line="270"/>
-            </w:pPr>
-            <w:r>
-              <w:rPr>
-                <w:rFonts w:ascii="Malgun Gothic" w:cs="Malgun Gothic" w:eastAsia="Malgun Gothic" w:hAnsi="Malgun Gothic"/>
-                <w:sz w:val="18"/>
-                <w:szCs w:val="18"/>
-              </w:rPr>
-              <w:t xml:space="preserve">요소 순위 모델 학습 데이터 (9.4)</w:t>
-            </w:r>
-          </w:p>
-        </w:tc>
-      </w:tr>
-      <w:tr>
-        <w:trPr>
-          <w:tblHeader w:val="false"/>
-        </w:trPr>
-        <w:tc>
-          <w:tcPr>
-            <w:tcW w:type="dxa" w:w="1710"/>
-            <w:tcBorders>
-              <w:top w:val="none" w:color="FFFFFF" w:sz="0"/>
-              <w:left w:val="none" w:color="FFFFFF" w:sz="0"/>
               <w:bottom w:val="single" w:color="000000" w:sz="10"/>
               <w:right w:val="none" w:color="FFFFFF" w:sz="0"/>
             </w:tcBorders>
@@ -19253,72 +18035,10 @@
             <w:r>
               <w:rPr>
                 <w:rFonts w:ascii="Malgun Gothic" w:cs="Malgun Gothic" w:eastAsia="Malgun Gothic" w:hAnsi="Malgun Gothic"/>
-                <w:b/>
-                <w:bCs/>
-                <w:sz w:val="18"/>
-                <w:szCs w:val="18"/>
-              </w:rPr>
-              <w:t xml:space="preserve">model_version</w:t>
-            </w:r>
-          </w:p>
-        </w:tc>
-        <w:tc>
-          <w:tcPr>
-            <w:tcW w:type="dxa" w:w="5596"/>
-            <w:tcBorders>
-              <w:top w:val="none" w:color="FFFFFF" w:sz="0"/>
-              <w:left w:val="none" w:color="FFFFFF" w:sz="0"/>
-              <w:bottom w:val="single" w:color="000000" w:sz="10"/>
-              <w:right w:val="none" w:color="FFFFFF" w:sz="0"/>
-            </w:tcBorders>
-            <w:tcMar>
-              <w:top w:type="dxa" w:w="70"/>
-              <w:left w:type="dxa" w:w="110"/>
-              <w:bottom w:type="dxa" w:w="70"/>
-              <w:right w:type="dxa" w:w="110"/>
-            </w:tcMar>
-          </w:tcPr>
-          <w:p>
-            <w:pPr>
-              <w:spacing w:after="30" w:line="270"/>
-            </w:pPr>
-            <w:r>
-              <w:rPr>
-                <w:rFonts w:ascii="Malgun Gothic" w:cs="Malgun Gothic" w:eastAsia="Malgun Gothic" w:hAnsi="Malgun Gothic"/>
-                <w:sz w:val="18"/>
-                <w:szCs w:val="18"/>
-              </w:rPr>
-              <w:t xml:space="preserve">id, name, version, params(JSONB), metrics(JSONB), artifact_key, approved</w:t>
-            </w:r>
-          </w:p>
-        </w:tc>
-        <w:tc>
-          <w:tcPr>
-            <w:tcW w:type="dxa" w:w="2332"/>
-            <w:tcBorders>
-              <w:top w:val="none" w:color="FFFFFF" w:sz="0"/>
-              <w:left w:val="none" w:color="FFFFFF" w:sz="0"/>
-              <w:bottom w:val="single" w:color="000000" w:sz="10"/>
-              <w:right w:val="none" w:color="FFFFFF" w:sz="0"/>
-            </w:tcBorders>
-            <w:tcMar>
-              <w:top w:type="dxa" w:w="70"/>
-              <w:left w:type="dxa" w:w="110"/>
-              <w:bottom w:type="dxa" w:w="70"/>
-              <w:right w:type="dxa" w:w="110"/>
-            </w:tcMar>
-          </w:tcPr>
-          <w:p>
-            <w:pPr>
-              <w:spacing w:after="30" w:line="270"/>
-            </w:pPr>
-            <w:r>
-              <w:rPr>
-                <w:rFonts w:ascii="Malgun Gothic" w:cs="Malgun Gothic" w:eastAsia="Malgun Gothic" w:hAnsi="Malgun Gothic"/>
-                <w:sz w:val="18"/>
-                <w:szCs w:val="18"/>
-              </w:rPr>
-              <w:t xml:space="preserve">학습한 모델 버전</w:t>
+                <w:sz w:val="18"/>
+                <w:szCs w:val="18"/>
+              </w:rPr>
+              <w:t xml:space="preserve">학습한 모델 버전 (소요 시간·이슈 점수 2개)</w:t>
             </w:r>
           </w:p>
         </w:tc>
@@ -20966,7 +19686,7 @@
           <w:sz w:val="18"/>
           <w:szCs w:val="18"/>
         </w:rPr>
-        <w:t xml:space="preserve">│  └─ llm/            # 모델 어댑터, 호출 기록</w:t>
+        <w:t xml:space="preserve">│  ├─ a11y/           # axe-core 실행과 결과 변환</w:t>
       </w:r>
     </w:p>
     <w:p>
@@ -20984,7 +19704,7 @@
           <w:sz w:val="18"/>
           <w:szCs w:val="18"/>
         </w:rPr>
-        <w:t xml:space="preserve">├─ ml/</w:t>
+        <w:t xml:space="preserve">│  └─ llm/            # 모델 어댑터, 호출 기록</w:t>
       </w:r>
     </w:p>
     <w:p>
@@ -21002,7 +19722,7 @@
           <w:sz w:val="18"/>
           <w:szCs w:val="18"/>
         </w:rPr>
-        <w:t xml:space="preserve">│  ├─ timing/         # Fitts·KLM 보정 (9.1)</w:t>
+        <w:t xml:space="preserve">├─ ml/</w:t>
       </w:r>
     </w:p>
     <w:p>
@@ -21020,7 +19740,7 @@
           <w:sz w:val="18"/>
           <w:szCs w:val="18"/>
         </w:rPr>
-        <w:t xml:space="preserve">│  ├─ issue_clf/      # 이슈 점수 튜닝·분류기 비교 (9.2)</w:t>
+        <w:t xml:space="preserve">│  ├─ timing/         # Fitts·KLM 보정 (9.1)</w:t>
       </w:r>
     </w:p>
     <w:p>
@@ -21038,7 +19758,7 @@
           <w:sz w:val="18"/>
           <w:szCs w:val="18"/>
         </w:rPr>
-        <w:t xml:space="preserve">│  ├─ prompt_opt/     # 프롬프트 최적화 (9.3)</w:t>
+        <w:t xml:space="preserve">│  ├─ issue_clf/      # 이슈 점수 튜닝·분류기 비교 (9.2)</w:t>
       </w:r>
     </w:p>
     <w:p>
@@ -21056,7 +19776,7 @@
           <w:sz w:val="18"/>
           <w:szCs w:val="18"/>
         </w:rPr>
-        <w:t xml:space="preserve">│  └─ element_rank/   # 요소 후보 순위 모델 (9.4)</w:t>
+        <w:t xml:space="preserve">│  └─ results/        # 학습 결과 기록 (CSV)</w:t>
       </w:r>
     </w:p>
     <w:p>
@@ -21806,7 +20526,7 @@
                 <w:sz w:val="18"/>
                 <w:szCs w:val="18"/>
               </w:rPr>
-              <w:t xml:space="preserve">프롬프트 최적화</w:t>
+              <w:t xml:space="preserve">프롬프트 개선(수동)</w:t>
             </w:r>
           </w:p>
         </w:tc>
@@ -21836,7 +20556,7 @@
                 <w:sz w:val="18"/>
                 <w:szCs w:val="18"/>
               </w:rPr>
-              <w:t xml:space="preserve">prompts, worker/llm, ml/prompt_opt</w:t>
+              <w:t xml:space="preserve">prompts, worker/llm</w:t>
             </w:r>
           </w:p>
         </w:tc>
@@ -21934,7 +20654,7 @@
                 <w:sz w:val="18"/>
                 <w:szCs w:val="18"/>
               </w:rPr>
-              <w:t xml:space="preserve">지표 계산, 규칙 엔진, 벤치마크 정답 작성</w:t>
+              <w:t xml:space="preserve">지표 계산, axe-core 연동, 규칙 엔진, 벤치마크 정답 작성</w:t>
             </w:r>
           </w:p>
         </w:tc>
@@ -21994,7 +20714,7 @@
                 <w:sz w:val="18"/>
                 <w:szCs w:val="18"/>
               </w:rPr>
-              <w:t xml:space="preserve">worker/metrics, rules, ml/timing</w:t>
+              <w:t xml:space="preserve">worker/metrics, rules, a11y, ml/timing</w:t>
             </w:r>
           </w:p>
         </w:tc>
@@ -22280,7 +21000,7 @@
                 <w:sz w:val="18"/>
                 <w:szCs w:val="18"/>
               </w:rPr>
-              <w:t xml:space="preserve">학습 데이터 파이프라인·MLflow, 요소 후보 순위 모델</w:t>
+              <w:t xml:space="preserve">학습 데이터 정리</w:t>
             </w:r>
           </w:p>
         </w:tc>
@@ -22310,7 +21030,7 @@
                 <w:sz w:val="18"/>
                 <w:szCs w:val="18"/>
               </w:rPr>
-              <w:t xml:space="preserve">apps/api, ml/element_rank</w:t>
+              <w:t xml:space="preserve">apps/api</w:t>
             </w:r>
           </w:p>
         </w:tc>
@@ -22867,7 +21587,7 @@
         <w:rPr>
           <w:rFonts w:ascii="Malgun Gothic" w:cs="Malgun Gothic" w:eastAsia="Malgun Gothic" w:hAnsi="Malgun Gothic"/>
         </w:rPr>
-        <w:t xml:space="preserve">수집·매칭·측정 지표 ↔ 플랫폼 백엔드(ML 파이프라인): 이슈 점수·분류기 특징 목록과 입력 형식, 모델 파일 로드 방식 (model_version 테이블)</w:t>
+        <w:t xml:space="preserve">수집·매칭·측정 지표 ↔ 플랫폼 백엔드(학습 데이터 정리): 이슈 점수·분류기 특징 목록과 입력 형식, 모델 파일 로드 방식 (model_version 테이블)</w:t>
       </w:r>
     </w:p>
     <w:p>
@@ -22900,22 +21620,6 @@
           <w:rFonts w:ascii="Malgun Gothic" w:cs="Malgun Gothic" w:eastAsia="Malgun Gothic" w:hAnsi="Malgun Gothic"/>
         </w:rPr>
         <w:t xml:space="preserve">에이전트 코어 ↔ LLM·프롬프트: 행동 스키마(4.3)의 주인은 에이전트 코어, 프롬프트를 바꿀 때 LLM·프롬프트가 함께 검토. LLM 호출 기록(llm_call)은 LLM·프롬프트, 예산 상한·알림은 플랫폼 백엔드.</w:t>
-      </w:r>
-    </w:p>
-    <w:p>
-      <w:pPr>
-        <w:pStyle w:val="ListParagraph"/>
-        <w:numPr>
-          <w:ilvl w:val="0"/>
-          <w:numId w:val="4"/>
-        </w:numPr>
-        <w:spacing w:after="60" w:line="290"/>
-      </w:pPr>
-      <w:r>
-        <w:rPr>
-          <w:rFonts w:ascii="Malgun Gothic" w:cs="Malgun Gothic" w:eastAsia="Malgun Gothic" w:hAnsi="Malgun Gothic"/>
-        </w:rPr>
-        <w:t xml:space="preserve">플랫폼 백엔드 → 에이전트 코어: 요소 순위 모델 추론 함수와 model_version 로드 방식 (9.4 온라인 적용 시에만 루프에 연결).</w:t>
       </w:r>
     </w:p>
     <w:p>
@@ -23254,6 +21958,19 @@
                 <w:sz w:val="18"/>
                 <w:szCs w:val="18"/>
               </w:rPr>
+              <w:t xml:space="preserve">벤치마크 페이지 1개에서 측정 요청 → 실행 → 지표 1개 → 리포트까지 연결 (이후 기능은 이 흐름에 붙임)</w:t>
+            </w:r>
+          </w:p>
+          <w:p>
+            <w:pPr>
+              <w:spacing w:after="30" w:line="270"/>
+            </w:pPr>
+            <w:r>
+              <w:rPr>
+                <w:rFonts w:ascii="Malgun Gothic" w:cs="Malgun Gothic" w:eastAsia="Malgun Gothic" w:hAnsi="Malgun Gothic"/>
+                <w:sz w:val="18"/>
+                <w:szCs w:val="18"/>
+              </w:rPr>
               <w:t xml:space="preserve">참고 리포트 분석(15.4), 와이어프레임, 베이스라인 1차</w:t>
             </w:r>
           </w:p>
@@ -23421,20 +22138,20 @@
                 <w:sz w:val="18"/>
                 <w:szCs w:val="18"/>
               </w:rPr>
-              <w:t xml:space="preserve">Shadow DOM·iframe·가림 필터, 화면 안정 조건</w:t>
-            </w:r>
-          </w:p>
-          <w:p>
-            <w:pPr>
-              <w:spacing w:after="30" w:line="270"/>
-            </w:pPr>
-            <w:r>
-              <w:rPr>
-                <w:rFonts w:ascii="Malgun Gothic" w:cs="Malgun Gothic" w:eastAsia="Malgun Gothic" w:hAnsi="Malgun Gothic"/>
-                <w:sz w:val="18"/>
-                <w:szCs w:val="18"/>
-              </w:rPr>
-              <w:t xml:space="preserve">대비비·타겟 크기 계산 + 테스트</w:t>
+              <w:t xml:space="preserve">Shadow DOM·iframe·가림 필터, Playwright 기본 대기</w:t>
+            </w:r>
+          </w:p>
+          <w:p>
+            <w:pPr>
+              <w:spacing w:after="30" w:line="270"/>
+            </w:pPr>
+            <w:r>
+              <w:rPr>
+                <w:rFonts w:ascii="Malgun Gothic" w:cs="Malgun Gothic" w:eastAsia="Malgun Gothic" w:hAnsi="Malgun Gothic"/>
+                <w:sz w:val="18"/>
+                <w:szCs w:val="18"/>
+              </w:rPr>
+              <w:t xml:space="preserve">axe-core 연동(대비비·이름·타겟 크기) + 테스트</w:t>
             </w:r>
           </w:p>
           <w:p>
@@ -23666,7 +22383,7 @@
                 <w:sz w:val="18"/>
                 <w:szCs w:val="18"/>
               </w:rPr>
-              <w:t xml:space="preserve">이슈 점수 특징 추출, 프롬프트 최적화 파이프라인</w:t>
+              <w:t xml:space="preserve">이슈 점수 특징 추출, 실패 사례 수집</w:t>
             </w:r>
           </w:p>
           <w:p>
@@ -23680,19 +22397,6 @@
                 <w:szCs w:val="18"/>
               </w:rPr>
               <w:t xml:space="preserve">요소 매칭 모듈 v1, 경로 고정 재생 v1</w:t>
-            </w:r>
-          </w:p>
-          <w:p>
-            <w:pPr>
-              <w:spacing w:after="30" w:line="270"/>
-            </w:pPr>
-            <w:r>
-              <w:rPr>
-                <w:rFonts w:ascii="Malgun Gothic" w:cs="Malgun Gothic" w:eastAsia="Malgun Gothic" w:hAnsi="Malgun Gothic"/>
-                <w:sz w:val="18"/>
-                <w:szCs w:val="18"/>
-              </w:rPr>
-              <w:t xml:space="preserve">요소 후보 로그 저장 시작</w:t>
             </w:r>
           </w:p>
         </w:tc>
@@ -23820,19 +22524,6 @@
                 <w:sz w:val="18"/>
                 <w:szCs w:val="18"/>
               </w:rPr>
-              <w:t xml:space="preserve">11/9 요소 순위 모델 온라인 적용 여부 판단 (9.4)</w:t>
-            </w:r>
-          </w:p>
-          <w:p>
-            <w:pPr>
-              <w:spacing w:after="30" w:line="270"/>
-            </w:pPr>
-            <w:r>
-              <w:rPr>
-                <w:rFonts w:ascii="Malgun Gothic" w:cs="Malgun Gothic" w:eastAsia="Malgun Gothic" w:hAnsi="Malgun Gothic"/>
-                <w:sz w:val="18"/>
-                <w:szCs w:val="18"/>
-              </w:rPr>
               <w:t xml:space="preserve">병렬 반복 실행 3회 + 중앙값</w:t>
             </w:r>
           </w:p>
@@ -23937,20 +22628,7 @@
                 <w:sz w:val="18"/>
                 <w:szCs w:val="18"/>
               </w:rPr>
-              <w:t xml:space="preserve">프롬프트 최적화 1차, 에이전트–사람 경로 비교</w:t>
-            </w:r>
-          </w:p>
-          <w:p>
-            <w:pPr>
-              <w:spacing w:after="30" w:line="270"/>
-            </w:pPr>
-            <w:r>
-              <w:rPr>
-                <w:rFonts w:ascii="Malgun Gothic" w:cs="Malgun Gothic" w:eastAsia="Malgun Gothic" w:hAnsi="Malgun Gothic"/>
-                <w:sz w:val="18"/>
-                <w:szCs w:val="18"/>
-              </w:rPr>
-              <w:t xml:space="preserve">요소 순위 모델 v1 학습 (온라인 적용은 조건부)</w:t>
+              <w:t xml:space="preserve">프롬프트 개선, 에이전트–사람 경로 비교</w:t>
             </w:r>
           </w:p>
         </w:tc>
@@ -24131,32 +22809,6 @@
                 <w:szCs w:val="18"/>
               </w:rPr>
               <w:t xml:space="preserve">회귀 쌍 검증</w:t>
-            </w:r>
-          </w:p>
-          <w:p>
-            <w:pPr>
-              <w:spacing w:after="30" w:line="270"/>
-            </w:pPr>
-            <w:r>
-              <w:rPr>
-                <w:rFonts w:ascii="Malgun Gothic" w:cs="Malgun Gothic" w:eastAsia="Malgun Gothic" w:hAnsi="Malgun Gothic"/>
-                <w:sz w:val="18"/>
-                <w:szCs w:val="18"/>
-              </w:rPr>
-              <w:t xml:space="preserve">요소 순위 모델 재학습, 토큰 절감 측정 (적용 시) 또는 오프라인 평가</w:t>
-            </w:r>
-          </w:p>
-          <w:p>
-            <w:pPr>
-              <w:spacing w:after="30" w:line="270"/>
-            </w:pPr>
-            <w:r>
-              <w:rPr>
-                <w:rFonts w:ascii="Malgun Gothic" w:cs="Malgun Gothic" w:eastAsia="Malgun Gothic" w:hAnsi="Malgun Gothic"/>
-                <w:sz w:val="18"/>
-                <w:szCs w:val="18"/>
-              </w:rPr>
-              <w:t xml:space="preserve">(선택) 신경망 비교 실험</w:t>
             </w:r>
           </w:p>
           <w:p>
@@ -24514,7 +23166,7 @@
         <w:rPr>
           <w:rFonts w:ascii="Malgun Gothic" w:cs="Malgun Gothic" w:eastAsia="Malgun Gothic" w:hAnsi="Malgun Gothic"/>
         </w:rPr>
-        <w:t xml:space="preserve">모델 학습은 노트북이 아니라 ml/ 아래 스크립트로 재현 가능하게 남기고, 실행마다 MLflow에 기록한다.</w:t>
+        <w:t xml:space="preserve">모델 학습은 노트북이 아니라 ml/ 아래 스크립트로 재현 가능하게 남기고, 실행마다 ml/results/에 기록한다.</w:t>
       </w:r>
     </w:p>
     <w:p>
@@ -25891,7 +24543,7 @@
         <w:rPr>
           <w:rFonts w:ascii="Malgun Gothic" w:cs="Malgun Gothic" w:eastAsia="Malgun Gothic" w:hAnsi="Malgun Gothic"/>
         </w:rPr>
-        <w:t xml:space="preserve">중형 모델을 입력 100만 토큰당 3달러로 가정하면 1회 약 0.3달러(약 450원), 3회 반복하면 약 1달러다. 소형 모델은 그 10분의 1 수준이다. 실제 단가는 사용 시점에 각 사 요금표로 확인한다. 프롬프트 최적화처럼 반복 실행이 많은 작업은 소형 모델로 돌린다. 요소 후보 순위 모델(9.4)로 요소 목록 토큰을 절반으로 줄이면 전체 입력 토큰은 약 20% 줄어든다. 재측정은 경로 고정 재생(7.2)을 먼저 쓰므로, 재생이 끝까지 되면 LLM 비용이 거의 들지 않는다.</w:t>
+        <w:t xml:space="preserve">중형 모델을 입력 100만 토큰당 3달러로 가정하면 1회 약 0.3달러(약 450원), 3회 반복하면 약 1달러다. 소형 모델은 그 10분의 1 수준이다. 실제 단가는 사용 시점에 각 사 요금표로 확인한다. 프롬프트 버전 비교처럼 반복 실행이 많은 작업은 소형 모델로 돌린다. 요소가 많은 화면은 뷰포트 안 요소 우선 규칙으로 목록을 자른다(4.2). 재측정은 경로 고정 재생(7.2)을 먼저 쓰므로, 재생이 끝까지 되면 LLM 비용이 거의 들지 않는다.</w:t>
       </w:r>
     </w:p>
     <w:p>
@@ -26697,7 +25349,7 @@
                 <w:sz w:val="18"/>
                 <w:szCs w:val="18"/>
               </w:rPr>
-              <w:t xml:space="preserve">DOM 변경·애니메이션 종료 대기 (4.2), 무한 애니메이션 제외</w:t>
+              <w:t xml:space="preserve">Playwright load 대기 뒤 고정 대기(약 500ms), 흔들림이 크면 고정 대기 시간 조정 (4.2)</w:t>
             </w:r>
           </w:p>
         </w:tc>
@@ -26794,7 +25446,7 @@
                 <w:sz w:val="18"/>
                 <w:szCs w:val="18"/>
               </w:rPr>
-              <w:t xml:space="preserve">요소 매칭은 수집·매칭, 순위 모델 학습·병렬 반복 실행은 플랫폼 백엔드로 분리, 재생 v1을 S3로 당김, 온라인 적용 조건부</w:t>
+              <w:t xml:space="preserve">요소 매칭은 수집·매칭, 병렬 반복 실행은 플랫폼 백엔드로 분리, 재생 v1을 S3로 당김</w:t>
             </w:r>
           </w:p>
         </w:tc>
@@ -27377,200 +26029,6 @@
                 <w:szCs w:val="18"/>
               </w:rPr>
               <w:t xml:space="preserve">학습·테스트 분할 유지, 가중치 격자를 거칠게</w:t>
-            </w:r>
-          </w:p>
-        </w:tc>
-      </w:tr>
-      <w:tr>
-        <w:trPr>
-          <w:tblHeader w:val="false"/>
-        </w:trPr>
-        <w:tc>
-          <w:tcPr>
-            <w:tcW w:type="dxa" w:w="2705"/>
-            <w:tcBorders>
-              <w:top w:val="none" w:color="FFFFFF" w:sz="0"/>
-              <w:left w:val="none" w:color="FFFFFF" w:sz="0"/>
-              <w:bottom w:val="single" w:color="D9D9D9" w:sz="2"/>
-              <w:right w:val="none" w:color="FFFFFF" w:sz="0"/>
-            </w:tcBorders>
-            <w:tcMar>
-              <w:top w:type="dxa" w:w="70"/>
-              <w:left w:type="dxa" w:w="110"/>
-              <w:bottom w:type="dxa" w:w="70"/>
-              <w:right w:type="dxa" w:w="110"/>
-            </w:tcMar>
-          </w:tcPr>
-          <w:p>
-            <w:pPr>
-              <w:spacing w:after="30" w:line="270"/>
-            </w:pPr>
-            <w:r>
-              <w:rPr>
-                <w:rFonts w:ascii="Malgun Gothic" w:cs="Malgun Gothic" w:eastAsia="Malgun Gothic" w:hAnsi="Malgun Gothic"/>
-                <w:b/>
-                <w:bCs/>
-                <w:sz w:val="18"/>
-                <w:szCs w:val="18"/>
-              </w:rPr>
-              <w:t xml:space="preserve">순위 모델이 필요한 요소를 빠뜨림</w:t>
-            </w:r>
-          </w:p>
-        </w:tc>
-        <w:tc>
-          <w:tcPr>
-            <w:tcW w:type="dxa" w:w="2705"/>
-            <w:tcBorders>
-              <w:top w:val="none" w:color="FFFFFF" w:sz="0"/>
-              <w:left w:val="none" w:color="FFFFFF" w:sz="0"/>
-              <w:bottom w:val="single" w:color="D9D9D9" w:sz="2"/>
-              <w:right w:val="none" w:color="FFFFFF" w:sz="0"/>
-            </w:tcBorders>
-            <w:tcMar>
-              <w:top w:type="dxa" w:w="70"/>
-              <w:left w:type="dxa" w:w="110"/>
-              <w:bottom w:type="dxa" w:w="70"/>
-              <w:right w:type="dxa" w:w="110"/>
-            </w:tcMar>
-          </w:tcPr>
-          <w:p>
-            <w:pPr>
-              <w:spacing w:after="30" w:line="270"/>
-            </w:pPr>
-            <w:r>
-              <w:rPr>
-                <w:rFonts w:ascii="Malgun Gothic" w:cs="Malgun Gothic" w:eastAsia="Malgun Gothic" w:hAnsi="Malgun Gothic"/>
-                <w:sz w:val="18"/>
-                <w:szCs w:val="18"/>
-              </w:rPr>
-              <w:t xml:space="preserve">완주율 하락, 같은 화면 재질문 증가</w:t>
-            </w:r>
-          </w:p>
-        </w:tc>
-        <w:tc>
-          <w:tcPr>
-            <w:tcW w:type="dxa" w:w="4228"/>
-            <w:tcBorders>
-              <w:top w:val="none" w:color="FFFFFF" w:sz="0"/>
-              <w:left w:val="none" w:color="FFFFFF" w:sz="0"/>
-              <w:bottom w:val="single" w:color="D9D9D9" w:sz="2"/>
-              <w:right w:val="none" w:color="FFFFFF" w:sz="0"/>
-            </w:tcBorders>
-            <w:tcMar>
-              <w:top w:type="dxa" w:w="70"/>
-              <w:left w:type="dxa" w:w="110"/>
-              <w:bottom w:type="dxa" w:w="70"/>
-              <w:right w:type="dxa" w:w="110"/>
-            </w:tcMar>
-          </w:tcPr>
-          <w:p>
-            <w:pPr>
-              <w:spacing w:after="30" w:line="270"/>
-            </w:pPr>
-            <w:r>
-              <w:rPr>
-                <w:rFonts w:ascii="Malgun Gothic" w:cs="Malgun Gothic" w:eastAsia="Malgun Gothic" w:hAnsi="Malgun Gothic"/>
-                <w:sz w:val="18"/>
-                <w:szCs w:val="18"/>
-              </w:rPr>
-              <w:t xml:space="preserve">confusion·fail 시 전체 목록 재질문, Recall@30 매주 확인, K를 30→50으로 조정</w:t>
-            </w:r>
-          </w:p>
-        </w:tc>
-      </w:tr>
-      <w:tr>
-        <w:trPr>
-          <w:tblHeader w:val="false"/>
-        </w:trPr>
-        <w:tc>
-          <w:tcPr>
-            <w:tcW w:type="dxa" w:w="2705"/>
-            <w:tcBorders>
-              <w:top w:val="none" w:color="FFFFFF" w:sz="0"/>
-              <w:left w:val="none" w:color="FFFFFF" w:sz="0"/>
-              <w:bottom w:val="single" w:color="000000" w:sz="10"/>
-              <w:right w:val="none" w:color="FFFFFF" w:sz="0"/>
-            </w:tcBorders>
-            <w:tcMar>
-              <w:top w:type="dxa" w:w="70"/>
-              <w:left w:type="dxa" w:w="110"/>
-              <w:bottom w:type="dxa" w:w="70"/>
-              <w:right w:type="dxa" w:w="110"/>
-            </w:tcMar>
-          </w:tcPr>
-          <w:p>
-            <w:pPr>
-              <w:spacing w:after="30" w:line="270"/>
-            </w:pPr>
-            <w:r>
-              <w:rPr>
-                <w:rFonts w:ascii="Malgun Gothic" w:cs="Malgun Gothic" w:eastAsia="Malgun Gothic" w:hAnsi="Malgun Gothic"/>
-                <w:b/>
-                <w:bCs/>
-                <w:sz w:val="18"/>
-                <w:szCs w:val="18"/>
-              </w:rPr>
-              <w:t xml:space="preserve">프롬프트 최적화 과적합</w:t>
-            </w:r>
-          </w:p>
-        </w:tc>
-        <w:tc>
-          <w:tcPr>
-            <w:tcW w:type="dxa" w:w="2705"/>
-            <w:tcBorders>
-              <w:top w:val="none" w:color="FFFFFF" w:sz="0"/>
-              <w:left w:val="none" w:color="FFFFFF" w:sz="0"/>
-              <w:bottom w:val="single" w:color="000000" w:sz="10"/>
-              <w:right w:val="none" w:color="FFFFFF" w:sz="0"/>
-            </w:tcBorders>
-            <w:tcMar>
-              <w:top w:type="dxa" w:w="70"/>
-              <w:left w:type="dxa" w:w="110"/>
-              <w:bottom w:type="dxa" w:w="70"/>
-              <w:right w:type="dxa" w:w="110"/>
-            </w:tcMar>
-          </w:tcPr>
-          <w:p>
-            <w:pPr>
-              <w:spacing w:after="30" w:line="270"/>
-            </w:pPr>
-            <w:r>
-              <w:rPr>
-                <w:rFonts w:ascii="Malgun Gothic" w:cs="Malgun Gothic" w:eastAsia="Malgun Gothic" w:hAnsi="Malgun Gothic"/>
-                <w:sz w:val="18"/>
-                <w:szCs w:val="18"/>
-              </w:rPr>
-              <w:t xml:space="preserve">학습 세트만 오르고 테스트 세트 정체</w:t>
-            </w:r>
-          </w:p>
-        </w:tc>
-        <w:tc>
-          <w:tcPr>
-            <w:tcW w:type="dxa" w:w="4228"/>
-            <w:tcBorders>
-              <w:top w:val="none" w:color="FFFFFF" w:sz="0"/>
-              <w:left w:val="none" w:color="FFFFFF" w:sz="0"/>
-              <w:bottom w:val="single" w:color="000000" w:sz="10"/>
-              <w:right w:val="none" w:color="FFFFFF" w:sz="0"/>
-            </w:tcBorders>
-            <w:tcMar>
-              <w:top w:type="dxa" w:w="70"/>
-              <w:left w:type="dxa" w:w="110"/>
-              <w:bottom w:type="dxa" w:w="70"/>
-              <w:right w:type="dxa" w:w="110"/>
-            </w:tcMar>
-          </w:tcPr>
-          <w:p>
-            <w:pPr>
-              <w:spacing w:after="30" w:line="270"/>
-            </w:pPr>
-            <w:r>
-              <w:rPr>
-                <w:rFonts w:ascii="Malgun Gothic" w:cs="Malgun Gothic" w:eastAsia="Malgun Gothic" w:hAnsi="Malgun Gothic"/>
-                <w:sz w:val="18"/>
-                <w:szCs w:val="18"/>
-              </w:rPr>
-              <w:t xml:space="preserve">테스트 세트는 마지막에 1회만 평가</w:t>
             </w:r>
           </w:p>
         </w:tc>

</xml_diff>

<commit_message>
Update 15.3 test examples for axe-core and ignore docx backups
</commit_message>
<xml_diff>
--- a/docs/StepMeter_개발계획서.docx
+++ b/docs/StepMeter_개발계획서.docx
@@ -23390,7 +23390,7 @@
                 <w:sz w:val="18"/>
                 <w:szCs w:val="18"/>
               </w:rPr>
-              <w:t xml:space="preserve">검정/흰색 대비 21:1, #777777/흰색 4.48:1(기준 미달), 대각선 이동의 유효 폭 계산</w:t>
+              <w:t xml:space="preserve">대각선 이동의 유효 폭 계산, 커서 이동 거리 합계</w:t>
             </w:r>
           </w:p>
         </w:tc>
@@ -23488,6 +23488,103 @@
                 <w:szCs w:val="18"/>
               </w:rPr>
               <w:t xml:space="preserve">tests/fixtures/ 의 고정 HTML에서 스냅샷 값 확인</w:t>
+            </w:r>
+          </w:p>
+        </w:tc>
+      </w:tr>
+      <w:tr>
+        <w:trPr>
+          <w:tblHeader w:val="false"/>
+        </w:trPr>
+        <w:tc>
+          <w:tcPr>
+            <w:tcW w:type="dxa" w:w="1353"/>
+            <w:tcBorders>
+              <w:top w:val="none" w:color="FFFFFF" w:sz="0"/>
+              <w:left w:val="none" w:color="FFFFFF" w:sz="0"/>
+              <w:bottom w:val="single" w:color="D9D9D9" w:sz="2"/>
+              <w:right w:val="none" w:color="FFFFFF" w:sz="0"/>
+            </w:tcBorders>
+            <w:tcMar>
+              <w:top w:type="dxa" w:w="70"/>
+              <w:left w:type="dxa" w:w="110"/>
+              <w:bottom w:type="dxa" w:w="70"/>
+              <w:right w:type="dxa" w:w="110"/>
+            </w:tcMar>
+          </w:tcPr>
+          <w:p>
+            <w:pPr>
+              <w:spacing w:after="30" w:line="270"/>
+            </w:pPr>
+            <w:r>
+              <w:rPr>
+                <w:rFonts w:ascii="Malgun Gothic" w:cs="Malgun Gothic" w:eastAsia="Malgun Gothic" w:hAnsi="Malgun Gothic"/>
+                <w:b/>
+                <w:bCs/>
+                <w:sz w:val="18"/>
+                <w:szCs w:val="18"/>
+              </w:rPr>
+              <w:t xml:space="preserve">통합</w:t>
+            </w:r>
+          </w:p>
+        </w:tc>
+        <w:tc>
+          <w:tcPr>
+            <w:tcW w:type="dxa" w:w="2198"/>
+            <w:tcBorders>
+              <w:top w:val="none" w:color="FFFFFF" w:sz="0"/>
+              <w:left w:val="none" w:color="FFFFFF" w:sz="0"/>
+              <w:bottom w:val="single" w:color="D9D9D9" w:sz="2"/>
+              <w:right w:val="none" w:color="FFFFFF" w:sz="0"/>
+            </w:tcBorders>
+            <w:tcMar>
+              <w:top w:type="dxa" w:w="70"/>
+              <w:left w:type="dxa" w:w="110"/>
+              <w:bottom w:type="dxa" w:w="70"/>
+              <w:right w:type="dxa" w:w="110"/>
+            </w:tcMar>
+          </w:tcPr>
+          <w:p>
+            <w:pPr>
+              <w:spacing w:after="30" w:line="270"/>
+            </w:pPr>
+            <w:r>
+              <w:rPr>
+                <w:rFonts w:ascii="Malgun Gothic" w:cs="Malgun Gothic" w:eastAsia="Malgun Gothic" w:hAnsi="Malgun Gothic"/>
+                <w:sz w:val="18"/>
+                <w:szCs w:val="18"/>
+              </w:rPr>
+              <w:t xml:space="preserve">worker/a11y + rules</w:t>
+            </w:r>
+          </w:p>
+        </w:tc>
+        <w:tc>
+          <w:tcPr>
+            <w:tcW w:type="dxa" w:w="6087"/>
+            <w:tcBorders>
+              <w:top w:val="none" w:color="FFFFFF" w:sz="0"/>
+              <w:left w:val="none" w:color="FFFFFF" w:sz="0"/>
+              <w:bottom w:val="single" w:color="D9D9D9" w:sz="2"/>
+              <w:right w:val="none" w:color="FFFFFF" w:sz="0"/>
+            </w:tcBorders>
+            <w:tcMar>
+              <w:top w:type="dxa" w:w="70"/>
+              <w:left w:type="dxa" w:w="110"/>
+              <w:bottom w:type="dxa" w:w="70"/>
+              <w:right w:type="dxa" w:w="110"/>
+            </w:tcMar>
+          </w:tcPr>
+          <w:p>
+            <w:pPr>
+              <w:spacing w:after="30" w:line="270"/>
+            </w:pPr>
+            <w:r>
+              <w:rPr>
+                <w:rFonts w:ascii="Malgun Gothic" w:cs="Malgun Gothic" w:eastAsia="Malgun Gothic" w:hAnsi="Malgun Gothic"/>
+                <w:sz w:val="18"/>
+                <w:szCs w:val="18"/>
+              </w:rPr>
+              <w:t xml:space="preserve">tests/fixtures/ 에 #777777 글자/흰 배경 버튼이 있는 고정 HTML을 두고 axe color-contrast 위반이 나오는지 확인 / 같은 페이지에서 과업 경로 밖 요소의 axe 위반은 기본 목록에서 빠지고 "참고"로 가는지 확인</w:t>
             </w:r>
           </w:p>
         </w:tc>

</xml_diff>